<commit_message>
Date: 2 Nov 2025
</commit_message>
<xml_diff>
--- a/Assignments.docx
+++ b/Assignments.docx
@@ -5,11 +5,15 @@
     <w:p>
       <w:pPr>
         <w:rPr>
-          <w:lang w:val="en-US"/>
-        </w:rPr>
-      </w:pPr>
-      <w:r>
-        <w:rPr>
+          <w:sz w:val="24"/>
+          <w:szCs w:val="24"/>
+          <w:lang w:val="en-US"/>
+        </w:rPr>
+      </w:pPr>
+      <w:r>
+        <w:rPr>
+          <w:sz w:val="24"/>
+          <w:szCs w:val="24"/>
           <w:lang w:val="en-US"/>
         </w:rPr>
         <w:t>Assignments for Java</w:t>
@@ -23,11 +27,15 @@
           <w:numId w:val="1"/>
         </w:numPr>
         <w:rPr>
-          <w:lang w:val="en-US"/>
-        </w:rPr>
-      </w:pPr>
-      <w:r>
-        <w:rPr>
+          <w:sz w:val="24"/>
+          <w:szCs w:val="24"/>
+          <w:lang w:val="en-US"/>
+        </w:rPr>
+      </w:pPr>
+      <w:r>
+        <w:rPr>
+          <w:sz w:val="24"/>
+          <w:szCs w:val="24"/>
           <w:lang w:val="en-US"/>
         </w:rPr>
         <w:t>Accept following details of Employee</w:t>
@@ -41,11 +49,15 @@
           <w:numId w:val="1"/>
         </w:numPr>
         <w:rPr>
-          <w:lang w:val="en-US"/>
-        </w:rPr>
-      </w:pPr>
-      <w:r>
-        <w:rPr>
+          <w:sz w:val="24"/>
+          <w:szCs w:val="24"/>
+          <w:lang w:val="en-US"/>
+        </w:rPr>
+      </w:pPr>
+      <w:r>
+        <w:rPr>
+          <w:sz w:val="24"/>
+          <w:szCs w:val="24"/>
           <w:lang w:val="en-US"/>
         </w:rPr>
         <w:t>Employee Id</w:t>
@@ -59,11 +71,15 @@
           <w:numId w:val="1"/>
         </w:numPr>
         <w:rPr>
-          <w:lang w:val="en-US"/>
-        </w:rPr>
-      </w:pPr>
-      <w:r>
-        <w:rPr>
+          <w:sz w:val="24"/>
+          <w:szCs w:val="24"/>
+          <w:lang w:val="en-US"/>
+        </w:rPr>
+      </w:pPr>
+      <w:r>
+        <w:rPr>
+          <w:sz w:val="24"/>
+          <w:szCs w:val="24"/>
           <w:lang w:val="en-US"/>
         </w:rPr>
         <w:t>Employee Name</w:t>
@@ -77,11 +93,15 @@
           <w:numId w:val="1"/>
         </w:numPr>
         <w:rPr>
-          <w:lang w:val="en-US"/>
-        </w:rPr>
-      </w:pPr>
-      <w:r>
-        <w:rPr>
+          <w:sz w:val="24"/>
+          <w:szCs w:val="24"/>
+          <w:lang w:val="en-US"/>
+        </w:rPr>
+      </w:pPr>
+      <w:r>
+        <w:rPr>
+          <w:sz w:val="24"/>
+          <w:szCs w:val="24"/>
           <w:lang w:val="en-US"/>
         </w:rPr>
         <w:t>Basic Salary</w:t>
@@ -95,17 +115,23 @@
           <w:numId w:val="1"/>
         </w:numPr>
         <w:rPr>
-          <w:lang w:val="en-US"/>
-        </w:rPr>
-      </w:pPr>
-      <w:r>
-        <w:rPr>
+          <w:sz w:val="24"/>
+          <w:szCs w:val="24"/>
+          <w:lang w:val="en-US"/>
+        </w:rPr>
+      </w:pPr>
+      <w:r>
+        <w:rPr>
+          <w:sz w:val="24"/>
+          <w:szCs w:val="24"/>
           <w:lang w:val="en-US"/>
         </w:rPr>
         <w:t>Designation</w:t>
       </w:r>
       <w:r>
         <w:rPr>
+          <w:sz w:val="24"/>
+          <w:szCs w:val="24"/>
           <w:lang w:val="en-US"/>
         </w:rPr>
         <w:br/>
@@ -120,11 +146,15 @@
           <w:numId w:val="3"/>
         </w:numPr>
         <w:rPr>
-          <w:lang w:val="en-US"/>
-        </w:rPr>
-      </w:pPr>
-      <w:r>
-        <w:rPr>
+          <w:sz w:val="24"/>
+          <w:szCs w:val="24"/>
+          <w:lang w:val="en-US"/>
+        </w:rPr>
+      </w:pPr>
+      <w:r>
+        <w:rPr>
+          <w:sz w:val="24"/>
+          <w:szCs w:val="24"/>
           <w:lang w:val="en-US"/>
         </w:rPr>
         <w:t>da = 50% of basic salary</w:t>
@@ -138,14 +168,28 @@
           <w:numId w:val="3"/>
         </w:numPr>
         <w:rPr>
-          <w:lang w:val="en-US"/>
-        </w:rPr>
-      </w:pPr>
-      <w:r>
-        <w:rPr>
-          <w:lang w:val="en-US"/>
-        </w:rPr>
-        <w:t>hra = 20% of basic salary</w:t>
+          <w:sz w:val="24"/>
+          <w:szCs w:val="24"/>
+          <w:lang w:val="en-US"/>
+        </w:rPr>
+      </w:pPr>
+      <w:proofErr w:type="spellStart"/>
+      <w:r>
+        <w:rPr>
+          <w:sz w:val="24"/>
+          <w:szCs w:val="24"/>
+          <w:lang w:val="en-US"/>
+        </w:rPr>
+        <w:t>hra</w:t>
+      </w:r>
+      <w:proofErr w:type="spellEnd"/>
+      <w:r>
+        <w:rPr>
+          <w:sz w:val="24"/>
+          <w:szCs w:val="24"/>
+          <w:lang w:val="en-US"/>
+        </w:rPr>
+        <w:t xml:space="preserve"> = 20% of basic salary</w:t>
       </w:r>
     </w:p>
     <w:p>
@@ -156,14 +200,28 @@
           <w:numId w:val="3"/>
         </w:numPr>
         <w:rPr>
-          <w:lang w:val="en-US"/>
-        </w:rPr>
-      </w:pPr>
-      <w:r>
-        <w:rPr>
-          <w:lang w:val="en-US"/>
-        </w:rPr>
-        <w:t>pf = 5 % of basic salary</w:t>
+          <w:sz w:val="24"/>
+          <w:szCs w:val="24"/>
+          <w:lang w:val="en-US"/>
+        </w:rPr>
+      </w:pPr>
+      <w:proofErr w:type="spellStart"/>
+      <w:r>
+        <w:rPr>
+          <w:sz w:val="24"/>
+          <w:szCs w:val="24"/>
+          <w:lang w:val="en-US"/>
+        </w:rPr>
+        <w:t>pf</w:t>
+      </w:r>
+      <w:proofErr w:type="spellEnd"/>
+      <w:r>
+        <w:rPr>
+          <w:sz w:val="24"/>
+          <w:szCs w:val="24"/>
+          <w:lang w:val="en-US"/>
+        </w:rPr>
+        <w:t xml:space="preserve"> = 5 % of basic salary</w:t>
       </w:r>
     </w:p>
     <w:p>
@@ -174,15 +232,29 @@
           <w:numId w:val="3"/>
         </w:numPr>
         <w:rPr>
-          <w:lang w:val="en-US"/>
-        </w:rPr>
-      </w:pPr>
-      <w:r>
-        <w:rPr>
-          <w:lang w:val="en-US"/>
-        </w:rPr>
-        <w:t>gross salary = basic salary + da + hra</w:t>
-      </w:r>
+          <w:sz w:val="24"/>
+          <w:szCs w:val="24"/>
+          <w:lang w:val="en-US"/>
+        </w:rPr>
+      </w:pPr>
+      <w:r>
+        <w:rPr>
+          <w:sz w:val="24"/>
+          <w:szCs w:val="24"/>
+          <w:lang w:val="en-US"/>
+        </w:rPr>
+        <w:t xml:space="preserve">gross salary = basic salary + da + </w:t>
+      </w:r>
+      <w:proofErr w:type="spellStart"/>
+      <w:r>
+        <w:rPr>
+          <w:sz w:val="24"/>
+          <w:szCs w:val="24"/>
+          <w:lang w:val="en-US"/>
+        </w:rPr>
+        <w:t>hra</w:t>
+      </w:r>
+      <w:proofErr w:type="spellEnd"/>
     </w:p>
     <w:p>
       <w:pPr>
@@ -192,15 +264,29 @@
           <w:numId w:val="3"/>
         </w:numPr>
         <w:rPr>
-          <w:lang w:val="en-US"/>
-        </w:rPr>
-      </w:pPr>
-      <w:r>
-        <w:rPr>
-          <w:lang w:val="en-US"/>
-        </w:rPr>
-        <w:t>net salary = gross salary – pf</w:t>
-      </w:r>
+          <w:sz w:val="24"/>
+          <w:szCs w:val="24"/>
+          <w:lang w:val="en-US"/>
+        </w:rPr>
+      </w:pPr>
+      <w:r>
+        <w:rPr>
+          <w:sz w:val="24"/>
+          <w:szCs w:val="24"/>
+          <w:lang w:val="en-US"/>
+        </w:rPr>
+        <w:t xml:space="preserve">net salary = gross salary – </w:t>
+      </w:r>
+      <w:proofErr w:type="spellStart"/>
+      <w:r>
+        <w:rPr>
+          <w:sz w:val="24"/>
+          <w:szCs w:val="24"/>
+          <w:lang w:val="en-US"/>
+        </w:rPr>
+        <w:t>pf</w:t>
+      </w:r>
+      <w:proofErr w:type="spellEnd"/>
     </w:p>
     <w:p>
       <w:pPr>
@@ -210,11 +296,15 @@
           <w:numId w:val="1"/>
         </w:numPr>
         <w:rPr>
-          <w:lang w:val="en-US"/>
-        </w:rPr>
-      </w:pPr>
-      <w:r>
-        <w:rPr>
+          <w:sz w:val="24"/>
+          <w:szCs w:val="24"/>
+          <w:lang w:val="en-US"/>
+        </w:rPr>
+      </w:pPr>
+      <w:r>
+        <w:rPr>
+          <w:sz w:val="24"/>
+          <w:szCs w:val="24"/>
           <w:lang w:val="en-US"/>
         </w:rPr>
         <w:t>Accept the bank balance from user and display the message as “Low Balance” if balance is less than 2000.</w:t>
@@ -228,14 +318,54 @@
           <w:numId w:val="1"/>
         </w:numPr>
         <w:rPr>
-          <w:lang w:val="en-US"/>
-        </w:rPr>
-      </w:pPr>
-      <w:r>
-        <w:rPr>
-          <w:lang w:val="en-US"/>
-        </w:rPr>
-        <w:t>Accept any number form user and check whether it is +ve or –ve.</w:t>
+          <w:sz w:val="24"/>
+          <w:szCs w:val="24"/>
+          <w:lang w:val="en-US"/>
+        </w:rPr>
+      </w:pPr>
+      <w:r>
+        <w:rPr>
+          <w:sz w:val="24"/>
+          <w:szCs w:val="24"/>
+          <w:lang w:val="en-US"/>
+        </w:rPr>
+        <w:t>Accept any number form user and check whether it is +</w:t>
+      </w:r>
+      <w:proofErr w:type="spellStart"/>
+      <w:r>
+        <w:rPr>
+          <w:sz w:val="24"/>
+          <w:szCs w:val="24"/>
+          <w:lang w:val="en-US"/>
+        </w:rPr>
+        <w:t>ve</w:t>
+      </w:r>
+      <w:proofErr w:type="spellEnd"/>
+      <w:r>
+        <w:rPr>
+          <w:sz w:val="24"/>
+          <w:szCs w:val="24"/>
+          <w:lang w:val="en-US"/>
+        </w:rPr>
+        <w:t xml:space="preserve"> or –</w:t>
+      </w:r>
+      <w:proofErr w:type="spellStart"/>
+      <w:r>
+        <w:rPr>
+          <w:sz w:val="24"/>
+          <w:szCs w:val="24"/>
+          <w:lang w:val="en-US"/>
+        </w:rPr>
+        <w:t>ve</w:t>
+      </w:r>
+      <w:proofErr w:type="spellEnd"/>
+      <w:r>
+        <w:rPr>
+          <w:sz w:val="24"/>
+          <w:szCs w:val="24"/>
+          <w:lang w:val="en-US"/>
+        </w:rPr>
+        <w:t>.</w:t>
       </w:r>
     </w:p>
     <w:p>
@@ -383,7 +513,25 @@
           <w:szCs w:val="24"/>
           <w:lang w:val="en-US"/>
         </w:rPr>
-        <w:t>Accept marks of 5 subjects and canculate total and average marks also display the grade as follows</w:t>
+        <w:t xml:space="preserve">Accept marks of 5 subjects and </w:t>
+      </w:r>
+      <w:proofErr w:type="spellStart"/>
+      <w:r>
+        <w:rPr>
+          <w:sz w:val="24"/>
+          <w:szCs w:val="24"/>
+          <w:lang w:val="en-US"/>
+        </w:rPr>
+        <w:t>canculate</w:t>
+      </w:r>
+      <w:proofErr w:type="spellEnd"/>
+      <w:r>
+        <w:rPr>
+          <w:sz w:val="24"/>
+          <w:szCs w:val="24"/>
+          <w:lang w:val="en-US"/>
+        </w:rPr>
+        <w:t xml:space="preserve"> total and average marks also display the grade as follows</w:t>
       </w:r>
       <w:r>
         <w:rPr>
@@ -467,8 +615,17 @@
           <w:lang w:val="en-US"/>
         </w:rPr>
         <w:tab/>
+      </w:r>
+      <w:proofErr w:type="spellStart"/>
+      <w:r>
+        <w:rPr>
+          <w:sz w:val="24"/>
+          <w:szCs w:val="24"/>
+          <w:lang w:val="en-US"/>
+        </w:rPr>
         <w:t>Dist</w:t>
       </w:r>
+      <w:proofErr w:type="spellEnd"/>
       <w:r>
         <w:rPr>
           <w:sz w:val="24"/>
@@ -767,11 +924,15 @@
           <w:numId w:val="5"/>
         </w:numPr>
         <w:rPr>
-          <w:lang w:val="en-US"/>
-        </w:rPr>
-      </w:pPr>
-      <w:r>
-        <w:rPr>
+          <w:sz w:val="24"/>
+          <w:szCs w:val="24"/>
+          <w:lang w:val="en-US"/>
+        </w:rPr>
+      </w:pPr>
+      <w:r>
+        <w:rPr>
+          <w:sz w:val="24"/>
+          <w:szCs w:val="24"/>
           <w:lang w:val="en-US"/>
         </w:rPr>
         <w:t>Display sum of 1 to 10 numbers.</w:t>
@@ -785,11 +946,15 @@
           <w:numId w:val="5"/>
         </w:numPr>
         <w:rPr>
-          <w:lang w:val="en-US"/>
-        </w:rPr>
-      </w:pPr>
-      <w:r>
-        <w:rPr>
+          <w:sz w:val="24"/>
+          <w:szCs w:val="24"/>
+          <w:lang w:val="en-US"/>
+        </w:rPr>
+      </w:pPr>
+      <w:r>
+        <w:rPr>
+          <w:sz w:val="24"/>
+          <w:szCs w:val="24"/>
           <w:lang w:val="en-US"/>
         </w:rPr>
         <w:lastRenderedPageBreak/>
@@ -799,18 +964,24 @@
     <w:p>
       <w:pPr>
         <w:rPr>
-          <w:lang w:val="en-US"/>
-        </w:rPr>
-      </w:pPr>
-    </w:p>
-    <w:p>
-      <w:pPr>
-        <w:rPr>
-          <w:lang w:val="en-US"/>
-        </w:rPr>
-      </w:pPr>
-      <w:r>
-        <w:rPr>
+          <w:sz w:val="24"/>
+          <w:szCs w:val="24"/>
+          <w:lang w:val="en-US"/>
+        </w:rPr>
+      </w:pPr>
+    </w:p>
+    <w:p>
+      <w:pPr>
+        <w:rPr>
+          <w:sz w:val="24"/>
+          <w:szCs w:val="24"/>
+          <w:lang w:val="en-US"/>
+        </w:rPr>
+      </w:pPr>
+      <w:r>
+        <w:rPr>
+          <w:sz w:val="24"/>
+          <w:szCs w:val="24"/>
           <w:lang w:val="en-US"/>
         </w:rPr>
         <w:t>Class &amp; Object</w:t>
@@ -824,14 +995,36 @@
           <w:numId w:val="6"/>
         </w:numPr>
         <w:rPr>
-          <w:lang w:val="en-US"/>
-        </w:rPr>
-      </w:pPr>
-      <w:r>
-        <w:rPr>
-          <w:lang w:val="en-US"/>
-        </w:rPr>
-        <w:t>Create a class with name BankAccount with following members</w:t>
+          <w:sz w:val="24"/>
+          <w:szCs w:val="24"/>
+          <w:lang w:val="en-US"/>
+        </w:rPr>
+      </w:pPr>
+      <w:r>
+        <w:rPr>
+          <w:sz w:val="24"/>
+          <w:szCs w:val="24"/>
+          <w:lang w:val="en-US"/>
+        </w:rPr>
+        <w:t xml:space="preserve">Create a class with name </w:t>
+      </w:r>
+      <w:proofErr w:type="spellStart"/>
+      <w:r>
+        <w:rPr>
+          <w:sz w:val="24"/>
+          <w:szCs w:val="24"/>
+          <w:lang w:val="en-US"/>
+        </w:rPr>
+        <w:t>BankAccount</w:t>
+      </w:r>
+      <w:proofErr w:type="spellEnd"/>
+      <w:r>
+        <w:rPr>
+          <w:sz w:val="24"/>
+          <w:szCs w:val="24"/>
+          <w:lang w:val="en-US"/>
+        </w:rPr>
+        <w:t xml:space="preserve"> with following members</w:t>
       </w:r>
     </w:p>
     <w:p>
@@ -842,11 +1035,15 @@
           <w:numId w:val="6"/>
         </w:numPr>
         <w:rPr>
-          <w:lang w:val="en-US"/>
-        </w:rPr>
-      </w:pPr>
-      <w:r>
-        <w:rPr>
+          <w:sz w:val="24"/>
+          <w:szCs w:val="24"/>
+          <w:lang w:val="en-US"/>
+        </w:rPr>
+      </w:pPr>
+      <w:r>
+        <w:rPr>
+          <w:sz w:val="24"/>
+          <w:szCs w:val="24"/>
           <w:lang w:val="en-US"/>
         </w:rPr>
         <w:t>Account Holder’s name</w:t>
@@ -860,11 +1057,15 @@
           <w:numId w:val="6"/>
         </w:numPr>
         <w:rPr>
-          <w:lang w:val="en-US"/>
-        </w:rPr>
-      </w:pPr>
-      <w:r>
-        <w:rPr>
+          <w:sz w:val="24"/>
+          <w:szCs w:val="24"/>
+          <w:lang w:val="en-US"/>
+        </w:rPr>
+      </w:pPr>
+      <w:r>
+        <w:rPr>
+          <w:sz w:val="24"/>
+          <w:szCs w:val="24"/>
           <w:lang w:val="en-US"/>
         </w:rPr>
         <w:t>Address</w:t>
@@ -878,14 +1079,28 @@
           <w:numId w:val="6"/>
         </w:numPr>
         <w:rPr>
-          <w:lang w:val="en-US"/>
-        </w:rPr>
-      </w:pPr>
-      <w:r>
-        <w:rPr>
-          <w:lang w:val="en-US"/>
-        </w:rPr>
-        <w:t>Adhar No</w:t>
+          <w:sz w:val="24"/>
+          <w:szCs w:val="24"/>
+          <w:lang w:val="en-US"/>
+        </w:rPr>
+      </w:pPr>
+      <w:proofErr w:type="spellStart"/>
+      <w:r>
+        <w:rPr>
+          <w:sz w:val="24"/>
+          <w:szCs w:val="24"/>
+          <w:lang w:val="en-US"/>
+        </w:rPr>
+        <w:t>Adhar</w:t>
+      </w:r>
+      <w:proofErr w:type="spellEnd"/>
+      <w:r>
+        <w:rPr>
+          <w:sz w:val="24"/>
+          <w:szCs w:val="24"/>
+          <w:lang w:val="en-US"/>
+        </w:rPr>
+        <w:t xml:space="preserve"> No</w:t>
       </w:r>
     </w:p>
     <w:p>
@@ -896,11 +1111,15 @@
           <w:numId w:val="6"/>
         </w:numPr>
         <w:rPr>
-          <w:lang w:val="en-US"/>
-        </w:rPr>
-      </w:pPr>
-      <w:r>
-        <w:rPr>
+          <w:sz w:val="24"/>
+          <w:szCs w:val="24"/>
+          <w:lang w:val="en-US"/>
+        </w:rPr>
+      </w:pPr>
+      <w:r>
+        <w:rPr>
+          <w:sz w:val="24"/>
+          <w:szCs w:val="24"/>
           <w:lang w:val="en-US"/>
         </w:rPr>
         <w:t>Balance</w:t>
@@ -914,11 +1133,15 @@
           <w:numId w:val="6"/>
         </w:numPr>
         <w:rPr>
-          <w:lang w:val="en-US"/>
-        </w:rPr>
-      </w:pPr>
-      <w:r>
-        <w:rPr>
+          <w:sz w:val="24"/>
+          <w:szCs w:val="24"/>
+          <w:lang w:val="en-US"/>
+        </w:rPr>
+      </w:pPr>
+      <w:r>
+        <w:rPr>
+          <w:sz w:val="24"/>
+          <w:szCs w:val="24"/>
           <w:lang w:val="en-US"/>
         </w:rPr>
         <w:t>Interest Rate</w:t>
@@ -928,11 +1151,15 @@
       <w:pPr>
         <w:ind w:left="720" w:firstLine="360"/>
         <w:rPr>
-          <w:lang w:val="en-US"/>
-        </w:rPr>
-      </w:pPr>
-      <w:r>
-        <w:rPr>
+          <w:sz w:val="24"/>
+          <w:szCs w:val="24"/>
+          <w:lang w:val="en-US"/>
+        </w:rPr>
+      </w:pPr>
+      <w:r>
+        <w:rPr>
+          <w:sz w:val="24"/>
+          <w:szCs w:val="24"/>
           <w:lang w:val="en-US"/>
         </w:rPr>
         <w:t>With Methods</w:t>
@@ -946,14 +1173,28 @@
           <w:numId w:val="1"/>
         </w:numPr>
         <w:rPr>
-          <w:lang w:val="en-US"/>
-        </w:rPr>
-      </w:pPr>
-      <w:r>
-        <w:rPr>
-          <w:lang w:val="en-US"/>
-        </w:rPr>
-        <w:t>displayData()</w:t>
+          <w:sz w:val="24"/>
+          <w:szCs w:val="24"/>
+          <w:lang w:val="en-US"/>
+        </w:rPr>
+      </w:pPr>
+      <w:proofErr w:type="spellStart"/>
+      <w:r>
+        <w:rPr>
+          <w:sz w:val="24"/>
+          <w:szCs w:val="24"/>
+          <w:lang w:val="en-US"/>
+        </w:rPr>
+        <w:t>displayData</w:t>
+      </w:r>
+      <w:proofErr w:type="spellEnd"/>
+      <w:r>
+        <w:rPr>
+          <w:sz w:val="24"/>
+          <w:szCs w:val="24"/>
+          <w:lang w:val="en-US"/>
+        </w:rPr>
+        <w:t>()</w:t>
       </w:r>
     </w:p>
     <w:p>
@@ -964,14 +1205,28 @@
           <w:numId w:val="1"/>
         </w:numPr>
         <w:rPr>
-          <w:lang w:val="en-US"/>
-        </w:rPr>
-      </w:pPr>
-      <w:r>
-        <w:rPr>
-          <w:lang w:val="en-US"/>
-        </w:rPr>
-        <w:t>setInterestRate()</w:t>
+          <w:sz w:val="24"/>
+          <w:szCs w:val="24"/>
+          <w:lang w:val="en-US"/>
+        </w:rPr>
+      </w:pPr>
+      <w:proofErr w:type="spellStart"/>
+      <w:r>
+        <w:rPr>
+          <w:sz w:val="24"/>
+          <w:szCs w:val="24"/>
+          <w:lang w:val="en-US"/>
+        </w:rPr>
+        <w:t>setInterestRate</w:t>
+      </w:r>
+      <w:proofErr w:type="spellEnd"/>
+      <w:r>
+        <w:rPr>
+          <w:sz w:val="24"/>
+          <w:szCs w:val="24"/>
+          <w:lang w:val="en-US"/>
+        </w:rPr>
+        <w:t>()</w:t>
       </w:r>
     </w:p>
     <w:p>
@@ -982,11 +1237,15 @@
           <w:numId w:val="1"/>
         </w:numPr>
         <w:rPr>
-          <w:lang w:val="en-US"/>
-        </w:rPr>
-      </w:pPr>
-      <w:r>
-        <w:rPr>
+          <w:sz w:val="24"/>
+          <w:szCs w:val="24"/>
+          <w:lang w:val="en-US"/>
+        </w:rPr>
+      </w:pPr>
+      <w:r>
+        <w:rPr>
+          <w:sz w:val="24"/>
+          <w:szCs w:val="24"/>
           <w:lang w:val="en-US"/>
         </w:rPr>
         <w:t>withdraw()</w:t>
@@ -1000,11 +1259,15 @@
           <w:numId w:val="1"/>
         </w:numPr>
         <w:rPr>
-          <w:lang w:val="en-US"/>
-        </w:rPr>
-      </w:pPr>
-      <w:r>
-        <w:rPr>
+          <w:sz w:val="24"/>
+          <w:szCs w:val="24"/>
+          <w:lang w:val="en-US"/>
+        </w:rPr>
+      </w:pPr>
+      <w:r>
+        <w:rPr>
+          <w:sz w:val="24"/>
+          <w:szCs w:val="24"/>
           <w:lang w:val="en-US"/>
         </w:rPr>
         <w:t>deposit()</w:t>
@@ -1013,11 +1276,15 @@
     <w:p>
       <w:pPr>
         <w:rPr>
-          <w:lang w:val="en-US"/>
-        </w:rPr>
-      </w:pPr>
-      <w:r>
-        <w:rPr>
+          <w:sz w:val="24"/>
+          <w:szCs w:val="24"/>
+          <w:lang w:val="en-US"/>
+        </w:rPr>
+      </w:pPr>
+      <w:r>
+        <w:rPr>
+          <w:sz w:val="24"/>
+          <w:szCs w:val="24"/>
           <w:lang w:val="en-US"/>
         </w:rPr>
         <w:br w:type="page"/>
@@ -1663,14 +1930,14 @@
         </w:numPr>
         <w:spacing w:line="256" w:lineRule="auto"/>
         <w:rPr>
-          <w:sz w:val="26"/>
-          <w:szCs w:val="24"/>
-          <w:lang w:val="en-US"/>
-        </w:rPr>
-      </w:pPr>
-      <w:r>
-        <w:rPr>
-          <w:sz w:val="26"/>
+          <w:sz w:val="24"/>
+          <w:szCs w:val="24"/>
+          <w:lang w:val="en-US"/>
+        </w:rPr>
+      </w:pPr>
+      <w:r>
+        <w:rPr>
+          <w:sz w:val="24"/>
           <w:szCs w:val="24"/>
           <w:lang w:val="en-US"/>
         </w:rPr>
@@ -1680,7 +1947,7 @@
         <w:r>
           <w:rPr>
             <w:rStyle w:val="Hyperlink"/>
-            <w:sz w:val="26"/>
+            <w:sz w:val="24"/>
             <w:szCs w:val="24"/>
             <w:lang w:val="en-US"/>
           </w:rPr>
@@ -1697,14 +1964,14 @@
         </w:numPr>
         <w:spacing w:line="256" w:lineRule="auto"/>
         <w:rPr>
-          <w:sz w:val="26"/>
-          <w:szCs w:val="24"/>
-          <w:lang w:val="en-US"/>
-        </w:rPr>
-      </w:pPr>
-      <w:r>
-        <w:rPr>
-          <w:sz w:val="26"/>
+          <w:sz w:val="24"/>
+          <w:szCs w:val="24"/>
+          <w:lang w:val="en-US"/>
+        </w:rPr>
+      </w:pPr>
+      <w:r>
+        <w:rPr>
+          <w:sz w:val="24"/>
           <w:szCs w:val="24"/>
           <w:lang w:val="en-US"/>
         </w:rPr>
@@ -1720,18 +1987,36 @@
         </w:numPr>
         <w:spacing w:line="256" w:lineRule="auto"/>
         <w:rPr>
-          <w:sz w:val="26"/>
-          <w:szCs w:val="24"/>
-          <w:lang w:val="en-US"/>
-        </w:rPr>
-      </w:pPr>
-      <w:r>
-        <w:rPr>
-          <w:sz w:val="26"/>
-          <w:szCs w:val="24"/>
-          <w:lang w:val="en-US"/>
-        </w:rPr>
-        <w:t>Enter rediff Id</w:t>
+          <w:sz w:val="24"/>
+          <w:szCs w:val="24"/>
+          <w:lang w:val="en-US"/>
+        </w:rPr>
+      </w:pPr>
+      <w:r>
+        <w:rPr>
+          <w:sz w:val="24"/>
+          <w:szCs w:val="24"/>
+          <w:lang w:val="en-US"/>
+        </w:rPr>
+        <w:t xml:space="preserve">Enter </w:t>
+      </w:r>
+      <w:proofErr w:type="spellStart"/>
+      <w:r>
+        <w:rPr>
+          <w:sz w:val="24"/>
+          <w:szCs w:val="24"/>
+          <w:lang w:val="en-US"/>
+        </w:rPr>
+        <w:t>rediff</w:t>
+      </w:r>
+      <w:proofErr w:type="spellEnd"/>
+      <w:r>
+        <w:rPr>
+          <w:sz w:val="24"/>
+          <w:szCs w:val="24"/>
+          <w:lang w:val="en-US"/>
+        </w:rPr>
+        <w:t xml:space="preserve"> Id</w:t>
       </w:r>
     </w:p>
     <w:p>
@@ -1743,14 +2028,14 @@
         </w:numPr>
         <w:spacing w:line="256" w:lineRule="auto"/>
         <w:rPr>
-          <w:sz w:val="26"/>
-          <w:szCs w:val="24"/>
-          <w:lang w:val="en-US"/>
-        </w:rPr>
-      </w:pPr>
-      <w:r>
-        <w:rPr>
-          <w:sz w:val="26"/>
+          <w:sz w:val="24"/>
+          <w:szCs w:val="24"/>
+          <w:lang w:val="en-US"/>
+        </w:rPr>
+      </w:pPr>
+      <w:r>
+        <w:rPr>
+          <w:sz w:val="24"/>
           <w:szCs w:val="24"/>
           <w:lang w:val="en-US"/>
         </w:rPr>
@@ -1766,14 +2051,14 @@
         </w:numPr>
         <w:spacing w:line="256" w:lineRule="auto"/>
         <w:rPr>
-          <w:sz w:val="26"/>
-          <w:szCs w:val="24"/>
-          <w:lang w:val="en-US"/>
-        </w:rPr>
-      </w:pPr>
-      <w:r>
-        <w:rPr>
-          <w:sz w:val="26"/>
+          <w:sz w:val="24"/>
+          <w:szCs w:val="24"/>
+          <w:lang w:val="en-US"/>
+        </w:rPr>
+      </w:pPr>
+      <w:r>
+        <w:rPr>
+          <w:sz w:val="24"/>
           <w:szCs w:val="24"/>
           <w:lang w:val="en-US"/>
         </w:rPr>
@@ -1789,14 +2074,14 @@
         </w:numPr>
         <w:spacing w:line="256" w:lineRule="auto"/>
         <w:rPr>
-          <w:sz w:val="26"/>
-          <w:szCs w:val="24"/>
-          <w:lang w:val="en-US"/>
-        </w:rPr>
-      </w:pPr>
-      <w:r>
-        <w:rPr>
-          <w:sz w:val="26"/>
+          <w:sz w:val="24"/>
+          <w:szCs w:val="24"/>
+          <w:lang w:val="en-US"/>
+        </w:rPr>
+      </w:pPr>
+      <w:r>
+        <w:rPr>
+          <w:sz w:val="24"/>
           <w:szCs w:val="24"/>
           <w:lang w:val="en-US"/>
         </w:rPr>
@@ -1812,14 +2097,14 @@
         </w:numPr>
         <w:spacing w:line="256" w:lineRule="auto"/>
         <w:rPr>
-          <w:sz w:val="26"/>
-          <w:szCs w:val="24"/>
-          <w:lang w:val="en-US"/>
-        </w:rPr>
-      </w:pPr>
-      <w:r>
-        <w:rPr>
-          <w:sz w:val="26"/>
+          <w:sz w:val="24"/>
+          <w:szCs w:val="24"/>
+          <w:lang w:val="en-US"/>
+        </w:rPr>
+      </w:pPr>
+      <w:r>
+        <w:rPr>
+          <w:sz w:val="24"/>
           <w:szCs w:val="24"/>
           <w:lang w:val="en-US"/>
         </w:rPr>
@@ -1827,7 +2112,7 @@
       </w:r>
       <w:r>
         <w:rPr>
-          <w:sz w:val="26"/>
+          <w:sz w:val="24"/>
           <w:szCs w:val="24"/>
           <w:lang w:val="en-US"/>
         </w:rPr>
@@ -1837,7 +2122,7 @@
         <w:rPr>
           <w:b/>
           <w:bCs/>
-          <w:sz w:val="26"/>
+          <w:sz w:val="24"/>
           <w:szCs w:val="24"/>
           <w:lang w:val="en-US"/>
         </w:rPr>
@@ -1847,14 +2132,400 @@
         <w:rPr>
           <w:b/>
           <w:bCs/>
-          <w:sz w:val="26"/>
+          <w:sz w:val="24"/>
           <w:szCs w:val="24"/>
           <w:lang w:val="en-US"/>
         </w:rPr>
         <w:t xml:space="preserve"> Special Characters</w:t>
+      </w:r>
+    </w:p>
+    <w:p>
+      <w:pPr>
+        <w:pStyle w:val="ListParagraph"/>
+        <w:numPr>
+          <w:ilvl w:val="0"/>
+          <w:numId w:val="9"/>
+        </w:numPr>
+        <w:rPr>
+          <w:sz w:val="24"/>
+          <w:szCs w:val="24"/>
+          <w:lang w:val="en-US"/>
+        </w:rPr>
+      </w:pPr>
+      <w:r>
+        <w:rPr>
+          <w:sz w:val="24"/>
+          <w:szCs w:val="24"/>
+          <w:lang w:val="en-US"/>
+        </w:rPr>
+        <w:t xml:space="preserve">Launch </w:t>
+      </w:r>
+      <w:hyperlink r:id="rId11" w:history="1">
+        <w:r>
+          <w:rPr>
+            <w:rStyle w:val="Hyperlink"/>
+            <w:sz w:val="24"/>
+            <w:szCs w:val="24"/>
+            <w:lang w:val="en-US"/>
+          </w:rPr>
+          <w:t>https://www.echotrak.com/Login.aspx?ReturnUrl=%2f</w:t>
+        </w:r>
+      </w:hyperlink>
+    </w:p>
+    <w:p>
+      <w:pPr>
+        <w:pStyle w:val="ListParagraph"/>
+        <w:numPr>
+          <w:ilvl w:val="1"/>
+          <w:numId w:val="9"/>
+        </w:numPr>
+        <w:rPr>
+          <w:sz w:val="24"/>
+          <w:szCs w:val="24"/>
+          <w:lang w:val="en-US"/>
+        </w:rPr>
+      </w:pPr>
+      <w:r>
+        <w:rPr>
+          <w:sz w:val="24"/>
+          <w:szCs w:val="24"/>
+          <w:lang w:val="en-US"/>
+        </w:rPr>
+        <w:t>Enter user name as your name</w:t>
+      </w:r>
+    </w:p>
+    <w:p>
+      <w:pPr>
+        <w:pStyle w:val="ListParagraph"/>
+        <w:numPr>
+          <w:ilvl w:val="1"/>
+          <w:numId w:val="9"/>
+        </w:numPr>
+        <w:rPr>
+          <w:sz w:val="24"/>
+          <w:szCs w:val="24"/>
+          <w:lang w:val="en-US"/>
+        </w:rPr>
+      </w:pPr>
+      <w:r>
+        <w:rPr>
+          <w:sz w:val="24"/>
+          <w:szCs w:val="24"/>
+          <w:lang w:val="en-US"/>
+        </w:rPr>
+        <w:t>Enter password as yourname123</w:t>
+      </w:r>
+    </w:p>
+    <w:p>
+      <w:pPr>
+        <w:pStyle w:val="ListParagraph"/>
+        <w:numPr>
+          <w:ilvl w:val="1"/>
+          <w:numId w:val="9"/>
+        </w:numPr>
+        <w:rPr>
+          <w:sz w:val="24"/>
+          <w:szCs w:val="24"/>
+          <w:lang w:val="en-US"/>
+        </w:rPr>
+      </w:pPr>
+      <w:r>
+        <w:rPr>
+          <w:sz w:val="24"/>
+          <w:szCs w:val="24"/>
+          <w:lang w:val="en-US"/>
+        </w:rPr>
+        <w:t>Click on login button</w:t>
+      </w:r>
+    </w:p>
+    <w:p>
+      <w:pPr>
+        <w:pStyle w:val="ListParagraph"/>
+        <w:numPr>
+          <w:ilvl w:val="1"/>
+          <w:numId w:val="9"/>
+        </w:numPr>
+        <w:rPr>
+          <w:sz w:val="24"/>
+          <w:szCs w:val="24"/>
+          <w:lang w:val="en-US"/>
+        </w:rPr>
+      </w:pPr>
+      <w:r>
+        <w:rPr>
+          <w:sz w:val="24"/>
+          <w:szCs w:val="24"/>
+          <w:lang w:val="en-US"/>
+        </w:rPr>
+        <w:t>Display the error message</w:t>
+      </w:r>
+      <w:r>
+        <w:rPr>
+          <w:sz w:val="24"/>
+          <w:szCs w:val="24"/>
+          <w:lang w:val="en-US"/>
+        </w:rPr>
+        <w:br/>
+      </w:r>
+      <w:r>
+        <w:rPr>
+          <w:b/>
+          <w:bCs/>
+          <w:sz w:val="24"/>
+          <w:szCs w:val="24"/>
+          <w:lang w:val="en-US"/>
+        </w:rPr>
+        <w:t xml:space="preserve">Use </w:t>
+      </w:r>
+      <w:r>
+        <w:rPr>
+          <w:b/>
+          <w:bCs/>
+          <w:sz w:val="24"/>
+          <w:szCs w:val="24"/>
+          <w:lang w:val="en-US"/>
+        </w:rPr>
+        <w:t>Absolute XPath</w:t>
+      </w:r>
+      <w:r>
+        <w:rPr>
+          <w:b/>
+          <w:bCs/>
+          <w:sz w:val="24"/>
+          <w:szCs w:val="24"/>
+          <w:lang w:val="en-US"/>
+        </w:rPr>
+        <w:t xml:space="preserve"> Locator</w:t>
+      </w:r>
+    </w:p>
+    <w:p>
+      <w:pPr>
+        <w:pStyle w:val="ListParagraph"/>
+        <w:numPr>
+          <w:ilvl w:val="0"/>
+          <w:numId w:val="9"/>
+        </w:numPr>
+        <w:spacing w:line="256" w:lineRule="auto"/>
+        <w:rPr>
+          <w:sz w:val="24"/>
+          <w:szCs w:val="24"/>
+          <w:lang w:val="en-US"/>
+        </w:rPr>
+      </w:pPr>
+      <w:r>
+        <w:rPr>
+          <w:sz w:val="24"/>
+          <w:szCs w:val="24"/>
+          <w:lang w:val="en-US"/>
+        </w:rPr>
+        <w:t xml:space="preserve">Launch </w:t>
+      </w:r>
+      <w:hyperlink r:id="rId12" w:history="1">
+        <w:r>
+          <w:rPr>
+            <w:rStyle w:val="Hyperlink"/>
+            <w:sz w:val="24"/>
+            <w:szCs w:val="24"/>
+            <w:lang w:val="en-US"/>
+          </w:rPr>
+          <w:t>https://register.rediff.com/register/register.php?FormName=user_details</w:t>
+        </w:r>
+      </w:hyperlink>
+    </w:p>
+    <w:p>
+      <w:pPr>
+        <w:pStyle w:val="ListParagraph"/>
+        <w:numPr>
+          <w:ilvl w:val="1"/>
+          <w:numId w:val="9"/>
+        </w:numPr>
+        <w:spacing w:line="256" w:lineRule="auto"/>
+        <w:rPr>
+          <w:sz w:val="24"/>
+          <w:szCs w:val="24"/>
+          <w:lang w:val="en-US"/>
+        </w:rPr>
+      </w:pPr>
+      <w:r>
+        <w:rPr>
+          <w:sz w:val="24"/>
+          <w:szCs w:val="24"/>
+          <w:lang w:val="en-US"/>
+        </w:rPr>
+        <w:t>Enter Full Name</w:t>
+      </w:r>
+    </w:p>
+    <w:p>
+      <w:pPr>
+        <w:pStyle w:val="ListParagraph"/>
+        <w:numPr>
+          <w:ilvl w:val="1"/>
+          <w:numId w:val="9"/>
+        </w:numPr>
+        <w:spacing w:line="256" w:lineRule="auto"/>
+        <w:rPr>
+          <w:sz w:val="24"/>
+          <w:szCs w:val="24"/>
+          <w:lang w:val="en-US"/>
+        </w:rPr>
+      </w:pPr>
+      <w:r>
+        <w:rPr>
+          <w:sz w:val="24"/>
+          <w:szCs w:val="24"/>
+          <w:lang w:val="en-US"/>
+        </w:rPr>
+        <w:t xml:space="preserve">Enter </w:t>
+      </w:r>
+      <w:r>
+        <w:rPr>
+          <w:sz w:val="24"/>
+          <w:szCs w:val="24"/>
+          <w:lang w:val="en-US"/>
+        </w:rPr>
+        <w:t>Rediff</w:t>
+      </w:r>
+      <w:r>
+        <w:rPr>
+          <w:sz w:val="24"/>
+          <w:szCs w:val="24"/>
+          <w:lang w:val="en-US"/>
+        </w:rPr>
+        <w:t xml:space="preserve"> Id</w:t>
       </w:r>
       <w:bookmarkStart w:id="0" w:name="_GoBack"/>
       <w:bookmarkEnd w:id="0"/>
+    </w:p>
+    <w:p>
+      <w:pPr>
+        <w:pStyle w:val="ListParagraph"/>
+        <w:numPr>
+          <w:ilvl w:val="1"/>
+          <w:numId w:val="9"/>
+        </w:numPr>
+        <w:spacing w:line="256" w:lineRule="auto"/>
+        <w:rPr>
+          <w:sz w:val="24"/>
+          <w:szCs w:val="24"/>
+          <w:lang w:val="en-US"/>
+        </w:rPr>
+      </w:pPr>
+      <w:r>
+        <w:rPr>
+          <w:sz w:val="24"/>
+          <w:szCs w:val="24"/>
+          <w:lang w:val="en-US"/>
+        </w:rPr>
+        <w:lastRenderedPageBreak/>
+        <w:t>Enter password</w:t>
+      </w:r>
+    </w:p>
+    <w:p>
+      <w:pPr>
+        <w:pStyle w:val="ListParagraph"/>
+        <w:numPr>
+          <w:ilvl w:val="1"/>
+          <w:numId w:val="9"/>
+        </w:numPr>
+        <w:spacing w:line="256" w:lineRule="auto"/>
+        <w:rPr>
+          <w:sz w:val="24"/>
+          <w:szCs w:val="24"/>
+          <w:lang w:val="en-US"/>
+        </w:rPr>
+      </w:pPr>
+      <w:r>
+        <w:rPr>
+          <w:sz w:val="24"/>
+          <w:szCs w:val="24"/>
+          <w:lang w:val="en-US"/>
+        </w:rPr>
+        <w:t>Retype password</w:t>
+      </w:r>
+    </w:p>
+    <w:p>
+      <w:pPr>
+        <w:pStyle w:val="ListParagraph"/>
+        <w:numPr>
+          <w:ilvl w:val="1"/>
+          <w:numId w:val="9"/>
+        </w:numPr>
+        <w:spacing w:line="256" w:lineRule="auto"/>
+        <w:rPr>
+          <w:sz w:val="24"/>
+          <w:szCs w:val="24"/>
+          <w:lang w:val="en-US"/>
+        </w:rPr>
+      </w:pPr>
+      <w:r>
+        <w:rPr>
+          <w:sz w:val="24"/>
+          <w:szCs w:val="24"/>
+          <w:lang w:val="en-US"/>
+        </w:rPr>
+        <w:t>Enter Recovery email</w:t>
+      </w:r>
+    </w:p>
+    <w:p>
+      <w:pPr>
+        <w:pStyle w:val="ListParagraph"/>
+        <w:numPr>
+          <w:ilvl w:val="1"/>
+          <w:numId w:val="9"/>
+        </w:numPr>
+        <w:spacing w:line="256" w:lineRule="auto"/>
+        <w:rPr>
+          <w:sz w:val="24"/>
+          <w:szCs w:val="24"/>
+          <w:lang w:val="en-US"/>
+        </w:rPr>
+      </w:pPr>
+      <w:r>
+        <w:rPr>
+          <w:sz w:val="24"/>
+          <w:szCs w:val="24"/>
+          <w:lang w:val="en-US"/>
+        </w:rPr>
+        <w:t>Enter your phone no</w:t>
+      </w:r>
+      <w:r>
+        <w:rPr>
+          <w:sz w:val="24"/>
+          <w:szCs w:val="24"/>
+          <w:lang w:val="en-US"/>
+        </w:rPr>
+        <w:br/>
+      </w:r>
+      <w:r>
+        <w:rPr>
+          <w:b/>
+          <w:bCs/>
+          <w:sz w:val="24"/>
+          <w:szCs w:val="24"/>
+          <w:lang w:val="en-US"/>
+        </w:rPr>
+        <w:t xml:space="preserve">Use </w:t>
+      </w:r>
+      <w:r>
+        <w:rPr>
+          <w:b/>
+          <w:bCs/>
+          <w:sz w:val="24"/>
+          <w:szCs w:val="24"/>
+          <w:lang w:val="en-US"/>
+        </w:rPr>
+        <w:t>Absolute XPath</w:t>
+      </w:r>
+      <w:r>
+        <w:rPr>
+          <w:b/>
+          <w:bCs/>
+          <w:sz w:val="24"/>
+          <w:szCs w:val="24"/>
+          <w:lang w:val="en-US"/>
+        </w:rPr>
+        <w:t xml:space="preserve"> Characters</w:t>
+      </w:r>
     </w:p>
     <w:p>
       <w:pPr>

</xml_diff>

<commit_message>
Date: 27 Nov 2025
</commit_message>
<xml_diff>
--- a/Assignments.docx
+++ b/Assignments.docx
@@ -173,23 +173,13 @@
           <w:lang w:val="en-US"/>
         </w:rPr>
       </w:pPr>
-      <w:proofErr w:type="spellStart"/>
-      <w:r>
-        <w:rPr>
-          <w:sz w:val="24"/>
-          <w:szCs w:val="24"/>
-          <w:lang w:val="en-US"/>
-        </w:rPr>
-        <w:t>hra</w:t>
-      </w:r>
-      <w:proofErr w:type="spellEnd"/>
-      <w:r>
-        <w:rPr>
-          <w:sz w:val="24"/>
-          <w:szCs w:val="24"/>
-          <w:lang w:val="en-US"/>
-        </w:rPr>
-        <w:t xml:space="preserve"> = 20% of basic salary</w:t>
+      <w:r>
+        <w:rPr>
+          <w:sz w:val="24"/>
+          <w:szCs w:val="24"/>
+          <w:lang w:val="en-US"/>
+        </w:rPr>
+        <w:t>hra = 20% of basic salary</w:t>
       </w:r>
     </w:p>
     <w:p>
@@ -205,23 +195,13 @@
           <w:lang w:val="en-US"/>
         </w:rPr>
       </w:pPr>
-      <w:proofErr w:type="spellStart"/>
-      <w:r>
-        <w:rPr>
-          <w:sz w:val="24"/>
-          <w:szCs w:val="24"/>
-          <w:lang w:val="en-US"/>
-        </w:rPr>
-        <w:t>pf</w:t>
-      </w:r>
-      <w:proofErr w:type="spellEnd"/>
-      <w:r>
-        <w:rPr>
-          <w:sz w:val="24"/>
-          <w:szCs w:val="24"/>
-          <w:lang w:val="en-US"/>
-        </w:rPr>
-        <w:t xml:space="preserve"> = 5 % of basic salary</w:t>
+      <w:r>
+        <w:rPr>
+          <w:sz w:val="24"/>
+          <w:szCs w:val="24"/>
+          <w:lang w:val="en-US"/>
+        </w:rPr>
+        <w:t>pf = 5 % of basic salary</w:t>
       </w:r>
     </w:p>
     <w:p>
@@ -243,18 +223,8 @@
           <w:szCs w:val="24"/>
           <w:lang w:val="en-US"/>
         </w:rPr>
-        <w:t xml:space="preserve">gross salary = basic salary + da + </w:t>
-      </w:r>
-      <w:proofErr w:type="spellStart"/>
-      <w:r>
-        <w:rPr>
-          <w:sz w:val="24"/>
-          <w:szCs w:val="24"/>
-          <w:lang w:val="en-US"/>
-        </w:rPr>
-        <w:t>hra</w:t>
-      </w:r>
-      <w:proofErr w:type="spellEnd"/>
+        <w:t>gross salary = basic salary + da + hra</w:t>
+      </w:r>
     </w:p>
     <w:p>
       <w:pPr>
@@ -275,18 +245,8 @@
           <w:szCs w:val="24"/>
           <w:lang w:val="en-US"/>
         </w:rPr>
-        <w:t xml:space="preserve">net salary = gross salary – </w:t>
-      </w:r>
-      <w:proofErr w:type="spellStart"/>
-      <w:r>
-        <w:rPr>
-          <w:sz w:val="24"/>
-          <w:szCs w:val="24"/>
-          <w:lang w:val="en-US"/>
-        </w:rPr>
-        <w:t>pf</w:t>
-      </w:r>
-      <w:proofErr w:type="spellEnd"/>
+        <w:t>net salary = gross salary – pf</w:t>
+      </w:r>
     </w:p>
     <w:p>
       <w:pPr>
@@ -329,43 +289,7 @@
           <w:szCs w:val="24"/>
           <w:lang w:val="en-US"/>
         </w:rPr>
-        <w:t>Accept any number form user and check whether it is +</w:t>
-      </w:r>
-      <w:proofErr w:type="spellStart"/>
-      <w:r>
-        <w:rPr>
-          <w:sz w:val="24"/>
-          <w:szCs w:val="24"/>
-          <w:lang w:val="en-US"/>
-        </w:rPr>
-        <w:t>ve</w:t>
-      </w:r>
-      <w:proofErr w:type="spellEnd"/>
-      <w:r>
-        <w:rPr>
-          <w:sz w:val="24"/>
-          <w:szCs w:val="24"/>
-          <w:lang w:val="en-US"/>
-        </w:rPr>
-        <w:t xml:space="preserve"> or –</w:t>
-      </w:r>
-      <w:proofErr w:type="spellStart"/>
-      <w:r>
-        <w:rPr>
-          <w:sz w:val="24"/>
-          <w:szCs w:val="24"/>
-          <w:lang w:val="en-US"/>
-        </w:rPr>
-        <w:t>ve</w:t>
-      </w:r>
-      <w:proofErr w:type="spellEnd"/>
-      <w:r>
-        <w:rPr>
-          <w:sz w:val="24"/>
-          <w:szCs w:val="24"/>
-          <w:lang w:val="en-US"/>
-        </w:rPr>
-        <w:t>.</w:t>
+        <w:t>Accept any number form user and check whether it is +ve or –ve.</w:t>
       </w:r>
     </w:p>
     <w:p>
@@ -513,25 +437,7 @@
           <w:szCs w:val="24"/>
           <w:lang w:val="en-US"/>
         </w:rPr>
-        <w:t xml:space="preserve">Accept marks of 5 subjects and </w:t>
-      </w:r>
-      <w:proofErr w:type="spellStart"/>
-      <w:r>
-        <w:rPr>
-          <w:sz w:val="24"/>
-          <w:szCs w:val="24"/>
-          <w:lang w:val="en-US"/>
-        </w:rPr>
-        <w:t>canculate</w:t>
-      </w:r>
-      <w:proofErr w:type="spellEnd"/>
-      <w:r>
-        <w:rPr>
-          <w:sz w:val="24"/>
-          <w:szCs w:val="24"/>
-          <w:lang w:val="en-US"/>
-        </w:rPr>
-        <w:t xml:space="preserve"> total and average marks also display the grade as follows</w:t>
+        <w:t>Accept marks of 5 subjects and canculate total and average marks also display the grade as follows</w:t>
       </w:r>
       <w:r>
         <w:rPr>
@@ -615,17 +521,8 @@
           <w:lang w:val="en-US"/>
         </w:rPr>
         <w:tab/>
-      </w:r>
-      <w:proofErr w:type="spellStart"/>
-      <w:r>
-        <w:rPr>
-          <w:sz w:val="24"/>
-          <w:szCs w:val="24"/>
-          <w:lang w:val="en-US"/>
-        </w:rPr>
         <w:t>Dist</w:t>
       </w:r>
-      <w:proofErr w:type="spellEnd"/>
       <w:r>
         <w:rPr>
           <w:sz w:val="24"/>
@@ -1006,25 +903,7 @@
           <w:szCs w:val="24"/>
           <w:lang w:val="en-US"/>
         </w:rPr>
-        <w:t xml:space="preserve">Create a class with name </w:t>
-      </w:r>
-      <w:proofErr w:type="spellStart"/>
-      <w:r>
-        <w:rPr>
-          <w:sz w:val="24"/>
-          <w:szCs w:val="24"/>
-          <w:lang w:val="en-US"/>
-        </w:rPr>
-        <w:t>BankAccount</w:t>
-      </w:r>
-      <w:proofErr w:type="spellEnd"/>
-      <w:r>
-        <w:rPr>
-          <w:sz w:val="24"/>
-          <w:szCs w:val="24"/>
-          <w:lang w:val="en-US"/>
-        </w:rPr>
-        <w:t xml:space="preserve"> with following members</w:t>
+        <w:t>Create a class with name BankAccount with following members</w:t>
       </w:r>
     </w:p>
     <w:p>
@@ -1084,23 +963,13 @@
           <w:lang w:val="en-US"/>
         </w:rPr>
       </w:pPr>
-      <w:proofErr w:type="spellStart"/>
-      <w:r>
-        <w:rPr>
-          <w:sz w:val="24"/>
-          <w:szCs w:val="24"/>
-          <w:lang w:val="en-US"/>
-        </w:rPr>
-        <w:t>Adhar</w:t>
-      </w:r>
-      <w:proofErr w:type="spellEnd"/>
-      <w:r>
-        <w:rPr>
-          <w:sz w:val="24"/>
-          <w:szCs w:val="24"/>
-          <w:lang w:val="en-US"/>
-        </w:rPr>
-        <w:t xml:space="preserve"> No</w:t>
+      <w:r>
+        <w:rPr>
+          <w:sz w:val="24"/>
+          <w:szCs w:val="24"/>
+          <w:lang w:val="en-US"/>
+        </w:rPr>
+        <w:t>Adhar No</w:t>
       </w:r>
     </w:p>
     <w:p>
@@ -1178,23 +1047,13 @@
           <w:lang w:val="en-US"/>
         </w:rPr>
       </w:pPr>
-      <w:proofErr w:type="spellStart"/>
-      <w:r>
-        <w:rPr>
-          <w:sz w:val="24"/>
-          <w:szCs w:val="24"/>
-          <w:lang w:val="en-US"/>
-        </w:rPr>
-        <w:t>displayData</w:t>
-      </w:r>
-      <w:proofErr w:type="spellEnd"/>
-      <w:r>
-        <w:rPr>
-          <w:sz w:val="24"/>
-          <w:szCs w:val="24"/>
-          <w:lang w:val="en-US"/>
-        </w:rPr>
-        <w:t>()</w:t>
+      <w:r>
+        <w:rPr>
+          <w:sz w:val="24"/>
+          <w:szCs w:val="24"/>
+          <w:lang w:val="en-US"/>
+        </w:rPr>
+        <w:t>displayData()</w:t>
       </w:r>
     </w:p>
     <w:p>
@@ -1210,23 +1069,13 @@
           <w:lang w:val="en-US"/>
         </w:rPr>
       </w:pPr>
-      <w:proofErr w:type="spellStart"/>
-      <w:r>
-        <w:rPr>
-          <w:sz w:val="24"/>
-          <w:szCs w:val="24"/>
-          <w:lang w:val="en-US"/>
-        </w:rPr>
-        <w:t>setInterestRate</w:t>
-      </w:r>
-      <w:proofErr w:type="spellEnd"/>
-      <w:r>
-        <w:rPr>
-          <w:sz w:val="24"/>
-          <w:szCs w:val="24"/>
-          <w:lang w:val="en-US"/>
-        </w:rPr>
-        <w:t>()</w:t>
+      <w:r>
+        <w:rPr>
+          <w:sz w:val="24"/>
+          <w:szCs w:val="24"/>
+          <w:lang w:val="en-US"/>
+        </w:rPr>
+        <w:t>setInterestRate()</w:t>
       </w:r>
     </w:p>
     <w:p>
@@ -1998,25 +1847,7 @@
           <w:szCs w:val="24"/>
           <w:lang w:val="en-US"/>
         </w:rPr>
-        <w:t xml:space="preserve">Enter </w:t>
-      </w:r>
-      <w:proofErr w:type="spellStart"/>
-      <w:r>
-        <w:rPr>
-          <w:sz w:val="24"/>
-          <w:szCs w:val="24"/>
-          <w:lang w:val="en-US"/>
-        </w:rPr>
-        <w:t>rediff</w:t>
-      </w:r>
-      <w:proofErr w:type="spellEnd"/>
-      <w:r>
-        <w:rPr>
-          <w:sz w:val="24"/>
-          <w:szCs w:val="24"/>
-          <w:lang w:val="en-US"/>
-        </w:rPr>
-        <w:t xml:space="preserve"> Id</w:t>
+        <w:t>Enter rediff Id</w:t>
       </w:r>
     </w:p>
     <w:p>
@@ -2275,27 +2106,7 @@
           <w:szCs w:val="24"/>
           <w:lang w:val="en-US"/>
         </w:rPr>
-        <w:t xml:space="preserve">Use </w:t>
-      </w:r>
-      <w:r>
-        <w:rPr>
-          <w:b/>
-          <w:bCs/>
-          <w:sz w:val="24"/>
-          <w:szCs w:val="24"/>
-          <w:lang w:val="en-US"/>
-        </w:rPr>
-        <w:t>Absolute XPath</w:t>
-      </w:r>
-      <w:r>
-        <w:rPr>
-          <w:b/>
-          <w:bCs/>
-          <w:sz w:val="24"/>
-          <w:szCs w:val="24"/>
-          <w:lang w:val="en-US"/>
-        </w:rPr>
-        <w:t xml:space="preserve"> Locator</w:t>
+        <w:t>Use Absolute XPath Locator</w:t>
       </w:r>
     </w:p>
     <w:p>
@@ -2393,109 +2204,478 @@
         </w:rPr>
         <w:t xml:space="preserve"> Id</w:t>
       </w:r>
+    </w:p>
+    <w:p>
+      <w:pPr>
+        <w:pStyle w:val="ListParagraph"/>
+        <w:numPr>
+          <w:ilvl w:val="1"/>
+          <w:numId w:val="9"/>
+        </w:numPr>
+        <w:spacing w:line="256" w:lineRule="auto"/>
+        <w:rPr>
+          <w:sz w:val="24"/>
+          <w:szCs w:val="24"/>
+          <w:lang w:val="en-US"/>
+        </w:rPr>
+      </w:pPr>
+      <w:r>
+        <w:rPr>
+          <w:sz w:val="24"/>
+          <w:szCs w:val="24"/>
+          <w:lang w:val="en-US"/>
+        </w:rPr>
+        <w:lastRenderedPageBreak/>
+        <w:t>Enter password</w:t>
+      </w:r>
+    </w:p>
+    <w:p>
+      <w:pPr>
+        <w:pStyle w:val="ListParagraph"/>
+        <w:numPr>
+          <w:ilvl w:val="1"/>
+          <w:numId w:val="9"/>
+        </w:numPr>
+        <w:spacing w:line="256" w:lineRule="auto"/>
+        <w:rPr>
+          <w:sz w:val="24"/>
+          <w:szCs w:val="24"/>
+          <w:lang w:val="en-US"/>
+        </w:rPr>
+      </w:pPr>
+      <w:r>
+        <w:rPr>
+          <w:sz w:val="24"/>
+          <w:szCs w:val="24"/>
+          <w:lang w:val="en-US"/>
+        </w:rPr>
+        <w:t>Retype password</w:t>
+      </w:r>
+    </w:p>
+    <w:p>
+      <w:pPr>
+        <w:pStyle w:val="ListParagraph"/>
+        <w:numPr>
+          <w:ilvl w:val="1"/>
+          <w:numId w:val="9"/>
+        </w:numPr>
+        <w:spacing w:line="256" w:lineRule="auto"/>
+        <w:rPr>
+          <w:sz w:val="24"/>
+          <w:szCs w:val="24"/>
+          <w:lang w:val="en-US"/>
+        </w:rPr>
+      </w:pPr>
+      <w:r>
+        <w:rPr>
+          <w:sz w:val="24"/>
+          <w:szCs w:val="24"/>
+          <w:lang w:val="en-US"/>
+        </w:rPr>
+        <w:t>Enter Recovery email</w:t>
+      </w:r>
+    </w:p>
+    <w:p>
+      <w:pPr>
+        <w:pStyle w:val="ListParagraph"/>
+        <w:numPr>
+          <w:ilvl w:val="1"/>
+          <w:numId w:val="9"/>
+        </w:numPr>
+        <w:spacing w:line="256" w:lineRule="auto"/>
+        <w:rPr>
+          <w:sz w:val="24"/>
+          <w:szCs w:val="24"/>
+          <w:lang w:val="en-US"/>
+        </w:rPr>
+      </w:pPr>
+      <w:r>
+        <w:rPr>
+          <w:sz w:val="24"/>
+          <w:szCs w:val="24"/>
+          <w:lang w:val="en-US"/>
+        </w:rPr>
+        <w:t>Enter your phone no</w:t>
+      </w:r>
+      <w:r>
+        <w:rPr>
+          <w:sz w:val="24"/>
+          <w:szCs w:val="24"/>
+          <w:lang w:val="en-US"/>
+        </w:rPr>
+        <w:br/>
+      </w:r>
+      <w:r>
+        <w:rPr>
+          <w:b/>
+          <w:bCs/>
+          <w:sz w:val="24"/>
+          <w:szCs w:val="24"/>
+          <w:lang w:val="en-US"/>
+        </w:rPr>
+        <w:t>Use Absolute XPath Characters</w:t>
+      </w:r>
+    </w:p>
+    <w:p>
+      <w:pPr>
+        <w:pStyle w:val="ListParagraph"/>
+        <w:numPr>
+          <w:ilvl w:val="0"/>
+          <w:numId w:val="9"/>
+        </w:numPr>
+        <w:rPr>
+          <w:sz w:val="24"/>
+          <w:szCs w:val="24"/>
+          <w:lang w:val="en-US"/>
+        </w:rPr>
+      </w:pPr>
+      <w:r>
+        <w:rPr>
+          <w:sz w:val="24"/>
+          <w:szCs w:val="24"/>
+          <w:lang w:val="en-US"/>
+        </w:rPr>
+        <w:t xml:space="preserve">Launch </w:t>
+      </w:r>
+      <w:hyperlink r:id="rId13" w:history="1">
+        <w:r>
+          <w:rPr>
+            <w:rStyle w:val="Hyperlink"/>
+            <w:sz w:val="24"/>
+            <w:szCs w:val="24"/>
+            <w:lang w:val="en-US"/>
+          </w:rPr>
+          <w:t>https://www.echotrak.com/Login.aspx?ReturnUrl=%2f</w:t>
+        </w:r>
+      </w:hyperlink>
+    </w:p>
+    <w:p>
+      <w:pPr>
+        <w:pStyle w:val="ListParagraph"/>
+        <w:numPr>
+          <w:ilvl w:val="1"/>
+          <w:numId w:val="9"/>
+        </w:numPr>
+        <w:rPr>
+          <w:sz w:val="24"/>
+          <w:szCs w:val="24"/>
+          <w:lang w:val="en-US"/>
+        </w:rPr>
+      </w:pPr>
+      <w:r>
+        <w:rPr>
+          <w:sz w:val="24"/>
+          <w:szCs w:val="24"/>
+          <w:lang w:val="en-US"/>
+        </w:rPr>
+        <w:t>Enter user name as your name</w:t>
+      </w:r>
+    </w:p>
+    <w:p>
+      <w:pPr>
+        <w:pStyle w:val="ListParagraph"/>
+        <w:numPr>
+          <w:ilvl w:val="1"/>
+          <w:numId w:val="9"/>
+        </w:numPr>
+        <w:rPr>
+          <w:sz w:val="24"/>
+          <w:szCs w:val="24"/>
+          <w:lang w:val="en-US"/>
+        </w:rPr>
+      </w:pPr>
+      <w:r>
+        <w:rPr>
+          <w:sz w:val="24"/>
+          <w:szCs w:val="24"/>
+          <w:lang w:val="en-US"/>
+        </w:rPr>
+        <w:t>Enter password as yourname123</w:t>
+      </w:r>
+    </w:p>
+    <w:p>
+      <w:pPr>
+        <w:pStyle w:val="ListParagraph"/>
+        <w:numPr>
+          <w:ilvl w:val="1"/>
+          <w:numId w:val="9"/>
+        </w:numPr>
+        <w:rPr>
+          <w:sz w:val="24"/>
+          <w:szCs w:val="24"/>
+          <w:lang w:val="en-US"/>
+        </w:rPr>
+      </w:pPr>
+      <w:r>
+        <w:rPr>
+          <w:sz w:val="24"/>
+          <w:szCs w:val="24"/>
+          <w:lang w:val="en-US"/>
+        </w:rPr>
+        <w:t>Click on login button</w:t>
+      </w:r>
+    </w:p>
+    <w:p>
+      <w:pPr>
+        <w:pStyle w:val="ListParagraph"/>
+        <w:numPr>
+          <w:ilvl w:val="1"/>
+          <w:numId w:val="9"/>
+        </w:numPr>
+        <w:rPr>
+          <w:sz w:val="24"/>
+          <w:szCs w:val="24"/>
+          <w:lang w:val="en-US"/>
+        </w:rPr>
+      </w:pPr>
+      <w:r>
+        <w:rPr>
+          <w:sz w:val="24"/>
+          <w:szCs w:val="24"/>
+          <w:lang w:val="en-US"/>
+        </w:rPr>
+        <w:t>Display the error message</w:t>
+      </w:r>
+      <w:r>
+        <w:rPr>
+          <w:sz w:val="24"/>
+          <w:szCs w:val="24"/>
+          <w:lang w:val="en-US"/>
+        </w:rPr>
+        <w:br/>
+      </w:r>
+      <w:r>
+        <w:rPr>
+          <w:b/>
+          <w:bCs/>
+          <w:sz w:val="24"/>
+          <w:szCs w:val="24"/>
+          <w:lang w:val="en-US"/>
+        </w:rPr>
+        <w:t xml:space="preserve">Use </w:t>
+      </w:r>
+      <w:r>
+        <w:rPr>
+          <w:b/>
+          <w:bCs/>
+          <w:sz w:val="24"/>
+          <w:szCs w:val="24"/>
+          <w:lang w:val="en-US"/>
+        </w:rPr>
+        <w:t>Relative</w:t>
+      </w:r>
+      <w:r>
+        <w:rPr>
+          <w:b/>
+          <w:bCs/>
+          <w:sz w:val="24"/>
+          <w:szCs w:val="24"/>
+          <w:lang w:val="en-US"/>
+        </w:rPr>
+        <w:t xml:space="preserve"> XPath Locator</w:t>
+      </w:r>
+    </w:p>
+    <w:p>
+      <w:pPr>
+        <w:pStyle w:val="ListParagraph"/>
+        <w:numPr>
+          <w:ilvl w:val="0"/>
+          <w:numId w:val="9"/>
+        </w:numPr>
+        <w:spacing w:line="256" w:lineRule="auto"/>
+        <w:rPr>
+          <w:sz w:val="24"/>
+          <w:szCs w:val="24"/>
+          <w:lang w:val="en-US"/>
+        </w:rPr>
+      </w:pPr>
+      <w:r>
+        <w:rPr>
+          <w:sz w:val="24"/>
+          <w:szCs w:val="24"/>
+          <w:lang w:val="en-US"/>
+        </w:rPr>
+        <w:t xml:space="preserve">Launch </w:t>
+      </w:r>
+      <w:hyperlink r:id="rId14" w:history="1">
+        <w:r>
+          <w:rPr>
+            <w:rStyle w:val="Hyperlink"/>
+            <w:sz w:val="24"/>
+            <w:szCs w:val="24"/>
+            <w:lang w:val="en-US"/>
+          </w:rPr>
+          <w:t>https://register.rediff.com/register/register.php?FormName=user_details</w:t>
+        </w:r>
+      </w:hyperlink>
+    </w:p>
+    <w:p>
+      <w:pPr>
+        <w:pStyle w:val="ListParagraph"/>
+        <w:numPr>
+          <w:ilvl w:val="1"/>
+          <w:numId w:val="9"/>
+        </w:numPr>
+        <w:spacing w:line="256" w:lineRule="auto"/>
+        <w:rPr>
+          <w:sz w:val="24"/>
+          <w:szCs w:val="24"/>
+          <w:lang w:val="en-US"/>
+        </w:rPr>
+      </w:pPr>
+      <w:r>
+        <w:rPr>
+          <w:sz w:val="24"/>
+          <w:szCs w:val="24"/>
+          <w:lang w:val="en-US"/>
+        </w:rPr>
+        <w:t>Enter Full Name</w:t>
+      </w:r>
+    </w:p>
+    <w:p>
+      <w:pPr>
+        <w:pStyle w:val="ListParagraph"/>
+        <w:numPr>
+          <w:ilvl w:val="1"/>
+          <w:numId w:val="9"/>
+        </w:numPr>
+        <w:spacing w:line="256" w:lineRule="auto"/>
+        <w:rPr>
+          <w:sz w:val="24"/>
+          <w:szCs w:val="24"/>
+          <w:lang w:val="en-US"/>
+        </w:rPr>
+      </w:pPr>
+      <w:r>
+        <w:rPr>
+          <w:sz w:val="24"/>
+          <w:szCs w:val="24"/>
+          <w:lang w:val="en-US"/>
+        </w:rPr>
+        <w:t>Enter Rediff Id</w:t>
+      </w:r>
+    </w:p>
+    <w:p>
+      <w:pPr>
+        <w:pStyle w:val="ListParagraph"/>
+        <w:numPr>
+          <w:ilvl w:val="1"/>
+          <w:numId w:val="9"/>
+        </w:numPr>
+        <w:spacing w:line="256" w:lineRule="auto"/>
+        <w:rPr>
+          <w:sz w:val="24"/>
+          <w:szCs w:val="24"/>
+          <w:lang w:val="en-US"/>
+        </w:rPr>
+      </w:pPr>
+      <w:r>
+        <w:rPr>
+          <w:sz w:val="24"/>
+          <w:szCs w:val="24"/>
+          <w:lang w:val="en-US"/>
+        </w:rPr>
+        <w:t>Enter password</w:t>
+      </w:r>
+    </w:p>
+    <w:p>
+      <w:pPr>
+        <w:pStyle w:val="ListParagraph"/>
+        <w:numPr>
+          <w:ilvl w:val="1"/>
+          <w:numId w:val="9"/>
+        </w:numPr>
+        <w:spacing w:line="256" w:lineRule="auto"/>
+        <w:rPr>
+          <w:sz w:val="24"/>
+          <w:szCs w:val="24"/>
+          <w:lang w:val="en-US"/>
+        </w:rPr>
+      </w:pPr>
+      <w:r>
+        <w:rPr>
+          <w:sz w:val="24"/>
+          <w:szCs w:val="24"/>
+          <w:lang w:val="en-US"/>
+        </w:rPr>
+        <w:t>Retype password</w:t>
+      </w:r>
+    </w:p>
+    <w:p>
+      <w:pPr>
+        <w:pStyle w:val="ListParagraph"/>
+        <w:numPr>
+          <w:ilvl w:val="1"/>
+          <w:numId w:val="9"/>
+        </w:numPr>
+        <w:spacing w:line="256" w:lineRule="auto"/>
+        <w:rPr>
+          <w:sz w:val="24"/>
+          <w:szCs w:val="24"/>
+          <w:lang w:val="en-US"/>
+        </w:rPr>
+      </w:pPr>
+      <w:r>
+        <w:rPr>
+          <w:sz w:val="24"/>
+          <w:szCs w:val="24"/>
+          <w:lang w:val="en-US"/>
+        </w:rPr>
+        <w:t>Enter Recovery email</w:t>
+      </w:r>
+    </w:p>
+    <w:p>
+      <w:pPr>
+        <w:pStyle w:val="ListParagraph"/>
+        <w:numPr>
+          <w:ilvl w:val="1"/>
+          <w:numId w:val="9"/>
+        </w:numPr>
+        <w:spacing w:line="256" w:lineRule="auto"/>
+        <w:rPr>
+          <w:sz w:val="24"/>
+          <w:szCs w:val="24"/>
+          <w:lang w:val="en-US"/>
+        </w:rPr>
+      </w:pPr>
+      <w:r>
+        <w:rPr>
+          <w:sz w:val="24"/>
+          <w:szCs w:val="24"/>
+          <w:lang w:val="en-US"/>
+        </w:rPr>
+        <w:t>Enter your phone no</w:t>
+      </w:r>
+      <w:r>
+        <w:rPr>
+          <w:sz w:val="24"/>
+          <w:szCs w:val="24"/>
+          <w:lang w:val="en-US"/>
+        </w:rPr>
+        <w:br/>
+      </w:r>
+      <w:r>
+        <w:rPr>
+          <w:b/>
+          <w:bCs/>
+          <w:sz w:val="24"/>
+          <w:szCs w:val="24"/>
+          <w:lang w:val="en-US"/>
+        </w:rPr>
+        <w:t xml:space="preserve">Use </w:t>
+      </w:r>
+      <w:r>
+        <w:rPr>
+          <w:b/>
+          <w:bCs/>
+          <w:sz w:val="24"/>
+          <w:szCs w:val="24"/>
+          <w:lang w:val="en-US"/>
+        </w:rPr>
+        <w:t>Relative</w:t>
+      </w:r>
       <w:bookmarkStart w:id="0" w:name="_GoBack"/>
       <w:bookmarkEnd w:id="0"/>
-    </w:p>
-    <w:p>
-      <w:pPr>
-        <w:pStyle w:val="ListParagraph"/>
-        <w:numPr>
-          <w:ilvl w:val="1"/>
-          <w:numId w:val="9"/>
-        </w:numPr>
-        <w:spacing w:line="256" w:lineRule="auto"/>
-        <w:rPr>
-          <w:sz w:val="24"/>
-          <w:szCs w:val="24"/>
-          <w:lang w:val="en-US"/>
-        </w:rPr>
-      </w:pPr>
-      <w:r>
-        <w:rPr>
-          <w:sz w:val="24"/>
-          <w:szCs w:val="24"/>
-          <w:lang w:val="en-US"/>
-        </w:rPr>
-        <w:lastRenderedPageBreak/>
-        <w:t>Enter password</w:t>
-      </w:r>
-    </w:p>
-    <w:p>
-      <w:pPr>
-        <w:pStyle w:val="ListParagraph"/>
-        <w:numPr>
-          <w:ilvl w:val="1"/>
-          <w:numId w:val="9"/>
-        </w:numPr>
-        <w:spacing w:line="256" w:lineRule="auto"/>
-        <w:rPr>
-          <w:sz w:val="24"/>
-          <w:szCs w:val="24"/>
-          <w:lang w:val="en-US"/>
-        </w:rPr>
-      </w:pPr>
-      <w:r>
-        <w:rPr>
-          <w:sz w:val="24"/>
-          <w:szCs w:val="24"/>
-          <w:lang w:val="en-US"/>
-        </w:rPr>
-        <w:t>Retype password</w:t>
-      </w:r>
-    </w:p>
-    <w:p>
-      <w:pPr>
-        <w:pStyle w:val="ListParagraph"/>
-        <w:numPr>
-          <w:ilvl w:val="1"/>
-          <w:numId w:val="9"/>
-        </w:numPr>
-        <w:spacing w:line="256" w:lineRule="auto"/>
-        <w:rPr>
-          <w:sz w:val="24"/>
-          <w:szCs w:val="24"/>
-          <w:lang w:val="en-US"/>
-        </w:rPr>
-      </w:pPr>
-      <w:r>
-        <w:rPr>
-          <w:sz w:val="24"/>
-          <w:szCs w:val="24"/>
-          <w:lang w:val="en-US"/>
-        </w:rPr>
-        <w:t>Enter Recovery email</w:t>
-      </w:r>
-    </w:p>
-    <w:p>
-      <w:pPr>
-        <w:pStyle w:val="ListParagraph"/>
-        <w:numPr>
-          <w:ilvl w:val="1"/>
-          <w:numId w:val="9"/>
-        </w:numPr>
-        <w:spacing w:line="256" w:lineRule="auto"/>
-        <w:rPr>
-          <w:sz w:val="24"/>
-          <w:szCs w:val="24"/>
-          <w:lang w:val="en-US"/>
-        </w:rPr>
-      </w:pPr>
-      <w:r>
-        <w:rPr>
-          <w:sz w:val="24"/>
-          <w:szCs w:val="24"/>
-          <w:lang w:val="en-US"/>
-        </w:rPr>
-        <w:t>Enter your phone no</w:t>
-      </w:r>
-      <w:r>
-        <w:rPr>
-          <w:sz w:val="24"/>
-          <w:szCs w:val="24"/>
-          <w:lang w:val="en-US"/>
-        </w:rPr>
-        <w:br/>
-      </w:r>
       <w:r>
         <w:rPr>
           <w:b/>
@@ -2504,27 +2684,7 @@
           <w:szCs w:val="24"/>
           <w:lang w:val="en-US"/>
         </w:rPr>
-        <w:t xml:space="preserve">Use </w:t>
-      </w:r>
-      <w:r>
-        <w:rPr>
-          <w:b/>
-          <w:bCs/>
-          <w:sz w:val="24"/>
-          <w:szCs w:val="24"/>
-          <w:lang w:val="en-US"/>
-        </w:rPr>
-        <w:t>Absolute XPath</w:t>
-      </w:r>
-      <w:r>
-        <w:rPr>
-          <w:b/>
-          <w:bCs/>
-          <w:sz w:val="24"/>
-          <w:szCs w:val="24"/>
-          <w:lang w:val="en-US"/>
-        </w:rPr>
-        <w:t xml:space="preserve"> Characters</w:t>
+        <w:t xml:space="preserve"> XPath Characters</w:t>
       </w:r>
     </w:p>
     <w:p>

</xml_diff>

<commit_message>
Date: 28 Nov 2025
</commit_message>
<xml_diff>
--- a/Assignments.docx
+++ b/Assignments.docx
@@ -173,13 +173,23 @@
           <w:lang w:val="en-US"/>
         </w:rPr>
       </w:pPr>
-      <w:r>
-        <w:rPr>
-          <w:sz w:val="24"/>
-          <w:szCs w:val="24"/>
-          <w:lang w:val="en-US"/>
-        </w:rPr>
-        <w:t>hra = 20% of basic salary</w:t>
+      <w:proofErr w:type="spellStart"/>
+      <w:r>
+        <w:rPr>
+          <w:sz w:val="24"/>
+          <w:szCs w:val="24"/>
+          <w:lang w:val="en-US"/>
+        </w:rPr>
+        <w:t>hra</w:t>
+      </w:r>
+      <w:proofErr w:type="spellEnd"/>
+      <w:r>
+        <w:rPr>
+          <w:sz w:val="24"/>
+          <w:szCs w:val="24"/>
+          <w:lang w:val="en-US"/>
+        </w:rPr>
+        <w:t xml:space="preserve"> = 20% of basic salary</w:t>
       </w:r>
     </w:p>
     <w:p>
@@ -195,13 +205,23 @@
           <w:lang w:val="en-US"/>
         </w:rPr>
       </w:pPr>
-      <w:r>
-        <w:rPr>
-          <w:sz w:val="24"/>
-          <w:szCs w:val="24"/>
-          <w:lang w:val="en-US"/>
-        </w:rPr>
-        <w:t>pf = 5 % of basic salary</w:t>
+      <w:proofErr w:type="spellStart"/>
+      <w:r>
+        <w:rPr>
+          <w:sz w:val="24"/>
+          <w:szCs w:val="24"/>
+          <w:lang w:val="en-US"/>
+        </w:rPr>
+        <w:t>pf</w:t>
+      </w:r>
+      <w:proofErr w:type="spellEnd"/>
+      <w:r>
+        <w:rPr>
+          <w:sz w:val="24"/>
+          <w:szCs w:val="24"/>
+          <w:lang w:val="en-US"/>
+        </w:rPr>
+        <w:t xml:space="preserve"> = 5 % of basic salary</w:t>
       </w:r>
     </w:p>
     <w:p>
@@ -223,8 +243,18 @@
           <w:szCs w:val="24"/>
           <w:lang w:val="en-US"/>
         </w:rPr>
-        <w:t>gross salary = basic salary + da + hra</w:t>
-      </w:r>
+        <w:t xml:space="preserve">gross salary = basic salary + da + </w:t>
+      </w:r>
+      <w:proofErr w:type="spellStart"/>
+      <w:r>
+        <w:rPr>
+          <w:sz w:val="24"/>
+          <w:szCs w:val="24"/>
+          <w:lang w:val="en-US"/>
+        </w:rPr>
+        <w:t>hra</w:t>
+      </w:r>
+      <w:proofErr w:type="spellEnd"/>
     </w:p>
     <w:p>
       <w:pPr>
@@ -245,8 +275,18 @@
           <w:szCs w:val="24"/>
           <w:lang w:val="en-US"/>
         </w:rPr>
-        <w:t>net salary = gross salary – pf</w:t>
-      </w:r>
+        <w:t xml:space="preserve">net salary = gross salary – </w:t>
+      </w:r>
+      <w:proofErr w:type="spellStart"/>
+      <w:r>
+        <w:rPr>
+          <w:sz w:val="24"/>
+          <w:szCs w:val="24"/>
+          <w:lang w:val="en-US"/>
+        </w:rPr>
+        <w:t>pf</w:t>
+      </w:r>
+      <w:proofErr w:type="spellEnd"/>
     </w:p>
     <w:p>
       <w:pPr>
@@ -289,7 +329,43 @@
           <w:szCs w:val="24"/>
           <w:lang w:val="en-US"/>
         </w:rPr>
-        <w:t>Accept any number form user and check whether it is +ve or –ve.</w:t>
+        <w:t>Accept any number form user and check whether it is +</w:t>
+      </w:r>
+      <w:proofErr w:type="spellStart"/>
+      <w:r>
+        <w:rPr>
+          <w:sz w:val="24"/>
+          <w:szCs w:val="24"/>
+          <w:lang w:val="en-US"/>
+        </w:rPr>
+        <w:t>ve</w:t>
+      </w:r>
+      <w:proofErr w:type="spellEnd"/>
+      <w:r>
+        <w:rPr>
+          <w:sz w:val="24"/>
+          <w:szCs w:val="24"/>
+          <w:lang w:val="en-US"/>
+        </w:rPr>
+        <w:t xml:space="preserve"> or –</w:t>
+      </w:r>
+      <w:proofErr w:type="spellStart"/>
+      <w:r>
+        <w:rPr>
+          <w:sz w:val="24"/>
+          <w:szCs w:val="24"/>
+          <w:lang w:val="en-US"/>
+        </w:rPr>
+        <w:t>ve</w:t>
+      </w:r>
+      <w:proofErr w:type="spellEnd"/>
+      <w:r>
+        <w:rPr>
+          <w:sz w:val="24"/>
+          <w:szCs w:val="24"/>
+          <w:lang w:val="en-US"/>
+        </w:rPr>
+        <w:t>.</w:t>
       </w:r>
     </w:p>
     <w:p>
@@ -437,7 +513,25 @@
           <w:szCs w:val="24"/>
           <w:lang w:val="en-US"/>
         </w:rPr>
-        <w:t>Accept marks of 5 subjects and canculate total and average marks also display the grade as follows</w:t>
+        <w:t xml:space="preserve">Accept marks of 5 subjects and </w:t>
+      </w:r>
+      <w:proofErr w:type="spellStart"/>
+      <w:r>
+        <w:rPr>
+          <w:sz w:val="24"/>
+          <w:szCs w:val="24"/>
+          <w:lang w:val="en-US"/>
+        </w:rPr>
+        <w:t>canculate</w:t>
+      </w:r>
+      <w:proofErr w:type="spellEnd"/>
+      <w:r>
+        <w:rPr>
+          <w:sz w:val="24"/>
+          <w:szCs w:val="24"/>
+          <w:lang w:val="en-US"/>
+        </w:rPr>
+        <w:t xml:space="preserve"> total and average marks also display the grade as follows</w:t>
       </w:r>
       <w:r>
         <w:rPr>
@@ -521,8 +615,17 @@
           <w:lang w:val="en-US"/>
         </w:rPr>
         <w:tab/>
+      </w:r>
+      <w:proofErr w:type="spellStart"/>
+      <w:r>
+        <w:rPr>
+          <w:sz w:val="24"/>
+          <w:szCs w:val="24"/>
+          <w:lang w:val="en-US"/>
+        </w:rPr>
         <w:t>Dist</w:t>
       </w:r>
+      <w:proofErr w:type="spellEnd"/>
       <w:r>
         <w:rPr>
           <w:sz w:val="24"/>
@@ -903,7 +1006,25 @@
           <w:szCs w:val="24"/>
           <w:lang w:val="en-US"/>
         </w:rPr>
-        <w:t>Create a class with name BankAccount with following members</w:t>
+        <w:t xml:space="preserve">Create a class with name </w:t>
+      </w:r>
+      <w:proofErr w:type="spellStart"/>
+      <w:r>
+        <w:rPr>
+          <w:sz w:val="24"/>
+          <w:szCs w:val="24"/>
+          <w:lang w:val="en-US"/>
+        </w:rPr>
+        <w:t>BankAccount</w:t>
+      </w:r>
+      <w:proofErr w:type="spellEnd"/>
+      <w:r>
+        <w:rPr>
+          <w:sz w:val="24"/>
+          <w:szCs w:val="24"/>
+          <w:lang w:val="en-US"/>
+        </w:rPr>
+        <w:t xml:space="preserve"> with following members</w:t>
       </w:r>
     </w:p>
     <w:p>
@@ -963,13 +1084,23 @@
           <w:lang w:val="en-US"/>
         </w:rPr>
       </w:pPr>
-      <w:r>
-        <w:rPr>
-          <w:sz w:val="24"/>
-          <w:szCs w:val="24"/>
-          <w:lang w:val="en-US"/>
-        </w:rPr>
-        <w:t>Adhar No</w:t>
+      <w:proofErr w:type="spellStart"/>
+      <w:r>
+        <w:rPr>
+          <w:sz w:val="24"/>
+          <w:szCs w:val="24"/>
+          <w:lang w:val="en-US"/>
+        </w:rPr>
+        <w:t>Adhar</w:t>
+      </w:r>
+      <w:proofErr w:type="spellEnd"/>
+      <w:r>
+        <w:rPr>
+          <w:sz w:val="24"/>
+          <w:szCs w:val="24"/>
+          <w:lang w:val="en-US"/>
+        </w:rPr>
+        <w:t xml:space="preserve"> No</w:t>
       </w:r>
     </w:p>
     <w:p>
@@ -1047,13 +1178,23 @@
           <w:lang w:val="en-US"/>
         </w:rPr>
       </w:pPr>
-      <w:r>
-        <w:rPr>
-          <w:sz w:val="24"/>
-          <w:szCs w:val="24"/>
-          <w:lang w:val="en-US"/>
-        </w:rPr>
-        <w:t>displayData()</w:t>
+      <w:proofErr w:type="spellStart"/>
+      <w:r>
+        <w:rPr>
+          <w:sz w:val="24"/>
+          <w:szCs w:val="24"/>
+          <w:lang w:val="en-US"/>
+        </w:rPr>
+        <w:t>displayData</w:t>
+      </w:r>
+      <w:proofErr w:type="spellEnd"/>
+      <w:r>
+        <w:rPr>
+          <w:sz w:val="24"/>
+          <w:szCs w:val="24"/>
+          <w:lang w:val="en-US"/>
+        </w:rPr>
+        <w:t>()</w:t>
       </w:r>
     </w:p>
     <w:p>
@@ -1069,13 +1210,23 @@
           <w:lang w:val="en-US"/>
         </w:rPr>
       </w:pPr>
-      <w:r>
-        <w:rPr>
-          <w:sz w:val="24"/>
-          <w:szCs w:val="24"/>
-          <w:lang w:val="en-US"/>
-        </w:rPr>
-        <w:t>setInterestRate()</w:t>
+      <w:proofErr w:type="spellStart"/>
+      <w:r>
+        <w:rPr>
+          <w:sz w:val="24"/>
+          <w:szCs w:val="24"/>
+          <w:lang w:val="en-US"/>
+        </w:rPr>
+        <w:t>setInterestRate</w:t>
+      </w:r>
+      <w:proofErr w:type="spellEnd"/>
+      <w:r>
+        <w:rPr>
+          <w:sz w:val="24"/>
+          <w:szCs w:val="24"/>
+          <w:lang w:val="en-US"/>
+        </w:rPr>
+        <w:t>()</w:t>
       </w:r>
     </w:p>
     <w:p>
@@ -1847,7 +1998,25 @@
           <w:szCs w:val="24"/>
           <w:lang w:val="en-US"/>
         </w:rPr>
-        <w:t>Enter rediff Id</w:t>
+        <w:t xml:space="preserve">Enter </w:t>
+      </w:r>
+      <w:proofErr w:type="spellStart"/>
+      <w:r>
+        <w:rPr>
+          <w:sz w:val="24"/>
+          <w:szCs w:val="24"/>
+          <w:lang w:val="en-US"/>
+        </w:rPr>
+        <w:t>rediff</w:t>
+      </w:r>
+      <w:proofErr w:type="spellEnd"/>
+      <w:r>
+        <w:rPr>
+          <w:sz w:val="24"/>
+          <w:szCs w:val="24"/>
+          <w:lang w:val="en-US"/>
+        </w:rPr>
+        <w:t xml:space="preserve"> Id</w:t>
       </w:r>
     </w:p>
     <w:p>
@@ -2674,17 +2843,386 @@
         </w:rPr>
         <w:t>Relative</w:t>
       </w:r>
+      <w:r>
+        <w:rPr>
+          <w:b/>
+          <w:bCs/>
+          <w:sz w:val="24"/>
+          <w:szCs w:val="24"/>
+          <w:lang w:val="en-US"/>
+        </w:rPr>
+        <w:t xml:space="preserve"> XPath Characters</w:t>
+      </w:r>
+    </w:p>
+    <w:p>
+      <w:pPr>
+        <w:pStyle w:val="ListParagraph"/>
+        <w:numPr>
+          <w:ilvl w:val="0"/>
+          <w:numId w:val="9"/>
+        </w:numPr>
+        <w:spacing w:line="256" w:lineRule="auto"/>
+        <w:rPr>
+          <w:sz w:val="24"/>
+          <w:szCs w:val="22"/>
+          <w:lang w:val="en-US"/>
+        </w:rPr>
+      </w:pPr>
+      <w:r>
+        <w:rPr>
+          <w:sz w:val="24"/>
+          <w:szCs w:val="22"/>
+          <w:lang w:val="en-US"/>
+        </w:rPr>
+        <w:t xml:space="preserve">Launch </w:t>
+      </w:r>
+      <w:hyperlink r:id="rId15" w:history="1">
+        <w:r>
+          <w:rPr>
+            <w:rStyle w:val="Hyperlink"/>
+            <w:sz w:val="24"/>
+            <w:szCs w:val="22"/>
+            <w:lang w:val="en-US"/>
+          </w:rPr>
+          <w:t>https://www.facebook.com/</w:t>
+        </w:r>
+      </w:hyperlink>
+    </w:p>
+    <w:p>
+      <w:pPr>
+        <w:pStyle w:val="ListParagraph"/>
+        <w:numPr>
+          <w:ilvl w:val="1"/>
+          <w:numId w:val="9"/>
+        </w:numPr>
+        <w:spacing w:line="256" w:lineRule="auto"/>
+        <w:rPr>
+          <w:sz w:val="24"/>
+          <w:szCs w:val="22"/>
+          <w:lang w:val="en-US"/>
+        </w:rPr>
+      </w:pPr>
+      <w:r>
+        <w:rPr>
+          <w:sz w:val="24"/>
+          <w:szCs w:val="22"/>
+          <w:lang w:val="en-US"/>
+        </w:rPr>
+        <w:t xml:space="preserve">Enter username as </w:t>
+      </w:r>
+      <w:hyperlink r:id="rId16" w:history="1">
+        <w:r>
+          <w:rPr>
+            <w:rStyle w:val="Hyperlink"/>
+            <w:sz w:val="24"/>
+            <w:szCs w:val="22"/>
+            <w:lang w:val="en-US"/>
+          </w:rPr>
+          <w:t>test@gmail.com</w:t>
+        </w:r>
+      </w:hyperlink>
+    </w:p>
+    <w:p>
+      <w:pPr>
+        <w:pStyle w:val="ListParagraph"/>
+        <w:numPr>
+          <w:ilvl w:val="1"/>
+          <w:numId w:val="9"/>
+        </w:numPr>
+        <w:spacing w:line="256" w:lineRule="auto"/>
+        <w:rPr>
+          <w:sz w:val="24"/>
+          <w:szCs w:val="22"/>
+          <w:lang w:val="en-US"/>
+        </w:rPr>
+      </w:pPr>
+      <w:r>
+        <w:rPr>
+          <w:sz w:val="24"/>
+          <w:szCs w:val="22"/>
+          <w:lang w:val="en-US"/>
+        </w:rPr>
+        <w:t>Enter password as test@123</w:t>
+      </w:r>
+    </w:p>
+    <w:p>
+      <w:pPr>
+        <w:pStyle w:val="ListParagraph"/>
+        <w:numPr>
+          <w:ilvl w:val="1"/>
+          <w:numId w:val="9"/>
+        </w:numPr>
+        <w:spacing w:line="256" w:lineRule="auto"/>
+        <w:rPr>
+          <w:sz w:val="24"/>
+          <w:szCs w:val="22"/>
+          <w:lang w:val="en-US"/>
+        </w:rPr>
+      </w:pPr>
+      <w:r>
+        <w:rPr>
+          <w:sz w:val="24"/>
+          <w:szCs w:val="22"/>
+          <w:lang w:val="en-US"/>
+        </w:rPr>
+        <w:t>Click on Login Button</w:t>
+      </w:r>
+    </w:p>
+    <w:p>
+      <w:pPr>
+        <w:pStyle w:val="ListParagraph"/>
+        <w:numPr>
+          <w:ilvl w:val="1"/>
+          <w:numId w:val="9"/>
+        </w:numPr>
+        <w:spacing w:line="256" w:lineRule="auto"/>
+        <w:rPr>
+          <w:sz w:val="24"/>
+          <w:szCs w:val="22"/>
+          <w:lang w:val="en-US"/>
+        </w:rPr>
+      </w:pPr>
+      <w:r>
+        <w:rPr>
+          <w:sz w:val="24"/>
+          <w:szCs w:val="22"/>
+          <w:lang w:val="en-US"/>
+        </w:rPr>
+        <w:t>Display the error message.</w:t>
+      </w:r>
+      <w:r>
+        <w:rPr>
+          <w:sz w:val="24"/>
+          <w:szCs w:val="22"/>
+          <w:lang w:val="en-US"/>
+        </w:rPr>
+        <w:br/>
+      </w:r>
+      <w:r>
+        <w:rPr>
+          <w:b/>
+          <w:bCs/>
+          <w:sz w:val="24"/>
+          <w:szCs w:val="22"/>
+          <w:lang w:val="en-US"/>
+        </w:rPr>
+        <w:t>Use the relative xpath Locator</w:t>
+      </w:r>
+    </w:p>
+    <w:p>
+      <w:pPr>
+        <w:pStyle w:val="ListParagraph"/>
+        <w:numPr>
+          <w:ilvl w:val="0"/>
+          <w:numId w:val="9"/>
+        </w:numPr>
+        <w:spacing w:line="256" w:lineRule="auto"/>
+        <w:rPr>
+          <w:sz w:val="24"/>
+          <w:szCs w:val="24"/>
+          <w:lang w:val="en-US"/>
+        </w:rPr>
+      </w:pPr>
+      <w:r>
+        <w:rPr>
+          <w:sz w:val="24"/>
+          <w:szCs w:val="24"/>
+          <w:lang w:val="en-US"/>
+        </w:rPr>
+        <w:t xml:space="preserve">Open </w:t>
+      </w:r>
+      <w:hyperlink r:id="rId17" w:history="1">
+        <w:r>
+          <w:rPr>
+            <w:rStyle w:val="Hyperlink"/>
+            <w:sz w:val="24"/>
+            <w:szCs w:val="24"/>
+            <w:lang w:val="en-US"/>
+          </w:rPr>
+          <w:t>https://echoecho.com/htmlforms09.htm</w:t>
+        </w:r>
+      </w:hyperlink>
+    </w:p>
+    <w:p>
+      <w:pPr>
+        <w:pStyle w:val="ListParagraph"/>
+        <w:numPr>
+          <w:ilvl w:val="1"/>
+          <w:numId w:val="9"/>
+        </w:numPr>
+        <w:spacing w:line="256" w:lineRule="auto"/>
+        <w:rPr>
+          <w:sz w:val="24"/>
+          <w:szCs w:val="24"/>
+          <w:lang w:val="en-US"/>
+        </w:rPr>
+      </w:pPr>
+      <w:r>
+        <w:rPr>
+          <w:sz w:val="24"/>
+          <w:szCs w:val="24"/>
+          <w:lang w:val="en-US"/>
+        </w:rPr>
+        <w:t>Display the status of all 3 checkboxes (Milk, butter and Cheese)</w:t>
+      </w:r>
+    </w:p>
+    <w:p>
+      <w:pPr>
+        <w:pStyle w:val="ListParagraph"/>
+        <w:numPr>
+          <w:ilvl w:val="1"/>
+          <w:numId w:val="9"/>
+        </w:numPr>
+        <w:spacing w:line="256" w:lineRule="auto"/>
+        <w:rPr>
+          <w:sz w:val="24"/>
+          <w:szCs w:val="24"/>
+          <w:lang w:val="en-US"/>
+        </w:rPr>
+      </w:pPr>
+      <w:r>
+        <w:rPr>
+          <w:sz w:val="24"/>
+          <w:szCs w:val="24"/>
+          <w:lang w:val="en-US"/>
+        </w:rPr>
+        <w:t>Only select those checkboxes those are not selected</w:t>
+      </w:r>
+    </w:p>
+    <w:p>
+      <w:pPr>
+        <w:pStyle w:val="ListParagraph"/>
+        <w:numPr>
+          <w:ilvl w:val="1"/>
+          <w:numId w:val="9"/>
+        </w:numPr>
+        <w:spacing w:line="256" w:lineRule="auto"/>
+        <w:rPr>
+          <w:sz w:val="24"/>
+          <w:szCs w:val="24"/>
+          <w:lang w:val="en-US"/>
+        </w:rPr>
+      </w:pPr>
+      <w:r>
+        <w:rPr>
+          <w:sz w:val="24"/>
+          <w:szCs w:val="24"/>
+          <w:lang w:val="en-US"/>
+        </w:rPr>
+        <w:t>Display the status.</w:t>
+      </w:r>
+    </w:p>
+    <w:p>
+      <w:pPr>
+        <w:pStyle w:val="ListParagraph"/>
+        <w:numPr>
+          <w:ilvl w:val="0"/>
+          <w:numId w:val="9"/>
+        </w:numPr>
+        <w:spacing w:line="256" w:lineRule="auto"/>
+        <w:rPr>
+          <w:sz w:val="24"/>
+          <w:szCs w:val="24"/>
+          <w:lang w:val="en-US"/>
+        </w:rPr>
+      </w:pPr>
+      <w:r>
+        <w:rPr>
+          <w:sz w:val="24"/>
+          <w:szCs w:val="24"/>
+          <w:lang w:val="en-US"/>
+        </w:rPr>
+        <w:t xml:space="preserve">Open </w:t>
+      </w:r>
+      <w:hyperlink r:id="rId18" w:history="1">
+        <w:r>
+          <w:rPr>
+            <w:rStyle w:val="Hyperlink"/>
+            <w:sz w:val="24"/>
+            <w:szCs w:val="24"/>
+            <w:lang w:val="en-US"/>
+          </w:rPr>
+          <w:t>https://echoecho.com/htmlforms10.htm</w:t>
+        </w:r>
+      </w:hyperlink>
+    </w:p>
+    <w:p>
+      <w:pPr>
+        <w:pStyle w:val="ListParagraph"/>
+        <w:numPr>
+          <w:ilvl w:val="1"/>
+          <w:numId w:val="9"/>
+        </w:numPr>
+        <w:spacing w:line="256" w:lineRule="auto"/>
+        <w:rPr>
+          <w:sz w:val="24"/>
+          <w:szCs w:val="24"/>
+          <w:lang w:val="en-US"/>
+        </w:rPr>
+      </w:pPr>
+      <w:r>
+        <w:rPr>
+          <w:sz w:val="24"/>
+          <w:szCs w:val="24"/>
+          <w:lang w:val="en-US"/>
+        </w:rPr>
+        <w:t>Displa</w:t>
+      </w:r>
       <w:bookmarkStart w:id="0" w:name="_GoBack"/>
       <w:bookmarkEnd w:id="0"/>
       <w:r>
         <w:rPr>
-          <w:b/>
-          <w:bCs/>
-          <w:sz w:val="24"/>
-          <w:szCs w:val="24"/>
-          <w:lang w:val="en-US"/>
-        </w:rPr>
-        <w:t xml:space="preserve"> XPath Characters</w:t>
+          <w:sz w:val="24"/>
+          <w:szCs w:val="24"/>
+          <w:lang w:val="en-US"/>
+        </w:rPr>
+        <w:t>y the status of each radio button</w:t>
+      </w:r>
+    </w:p>
+    <w:p>
+      <w:pPr>
+        <w:pStyle w:val="ListParagraph"/>
+        <w:numPr>
+          <w:ilvl w:val="1"/>
+          <w:numId w:val="9"/>
+        </w:numPr>
+        <w:spacing w:line="256" w:lineRule="auto"/>
+        <w:rPr>
+          <w:sz w:val="24"/>
+          <w:szCs w:val="24"/>
+          <w:lang w:val="en-US"/>
+        </w:rPr>
+      </w:pPr>
+      <w:r>
+        <w:rPr>
+          <w:sz w:val="24"/>
+          <w:szCs w:val="24"/>
+          <w:lang w:val="en-US"/>
+        </w:rPr>
+        <w:t>Click on each radio button</w:t>
+      </w:r>
+    </w:p>
+    <w:p>
+      <w:pPr>
+        <w:pStyle w:val="ListParagraph"/>
+        <w:numPr>
+          <w:ilvl w:val="1"/>
+          <w:numId w:val="9"/>
+        </w:numPr>
+        <w:spacing w:line="256" w:lineRule="auto"/>
+        <w:rPr>
+          <w:sz w:val="24"/>
+          <w:szCs w:val="24"/>
+          <w:lang w:val="en-US"/>
+        </w:rPr>
+      </w:pPr>
+      <w:r>
+        <w:rPr>
+          <w:sz w:val="24"/>
+          <w:szCs w:val="24"/>
+          <w:lang w:val="en-US"/>
+        </w:rPr>
+        <w:t>Display the status of each radio button.</w:t>
       </w:r>
     </w:p>
     <w:p>
@@ -3423,6 +3961,92 @@
     </w:lvl>
   </w:abstractNum>
   <w:abstractNum w:abstractNumId="8">
+    <w:nsid w:val="4E5B4A02"/>
+    <w:multiLevelType w:val="hybridMultilevel"/>
+    <w:tmpl w:val="E8BC0844"/>
+    <w:lvl w:ilvl="0" w:tplc="4009000F">
+      <w:start w:val="1"/>
+      <w:numFmt w:val="decimal"/>
+      <w:lvlText w:val="%1."/>
+      <w:lvlJc w:val="left"/>
+      <w:pPr>
+        <w:ind w:left="720" w:hanging="360"/>
+      </w:pPr>
+    </w:lvl>
+    <w:lvl w:ilvl="1" w:tplc="40090019">
+      <w:start w:val="1"/>
+      <w:numFmt w:val="lowerLetter"/>
+      <w:lvlText w:val="%2."/>
+      <w:lvlJc w:val="left"/>
+      <w:pPr>
+        <w:ind w:left="1440" w:hanging="360"/>
+      </w:pPr>
+    </w:lvl>
+    <w:lvl w:ilvl="2" w:tplc="4009001B">
+      <w:start w:val="1"/>
+      <w:numFmt w:val="lowerRoman"/>
+      <w:lvlText w:val="%3."/>
+      <w:lvlJc w:val="right"/>
+      <w:pPr>
+        <w:ind w:left="2160" w:hanging="180"/>
+      </w:pPr>
+    </w:lvl>
+    <w:lvl w:ilvl="3" w:tplc="4009000F">
+      <w:start w:val="1"/>
+      <w:numFmt w:val="decimal"/>
+      <w:lvlText w:val="%4."/>
+      <w:lvlJc w:val="left"/>
+      <w:pPr>
+        <w:ind w:left="2880" w:hanging="360"/>
+      </w:pPr>
+    </w:lvl>
+    <w:lvl w:ilvl="4" w:tplc="40090019">
+      <w:start w:val="1"/>
+      <w:numFmt w:val="lowerLetter"/>
+      <w:lvlText w:val="%5."/>
+      <w:lvlJc w:val="left"/>
+      <w:pPr>
+        <w:ind w:left="3600" w:hanging="360"/>
+      </w:pPr>
+    </w:lvl>
+    <w:lvl w:ilvl="5" w:tplc="4009001B">
+      <w:start w:val="1"/>
+      <w:numFmt w:val="lowerRoman"/>
+      <w:lvlText w:val="%6."/>
+      <w:lvlJc w:val="right"/>
+      <w:pPr>
+        <w:ind w:left="4320" w:hanging="180"/>
+      </w:pPr>
+    </w:lvl>
+    <w:lvl w:ilvl="6" w:tplc="4009000F">
+      <w:start w:val="1"/>
+      <w:numFmt w:val="decimal"/>
+      <w:lvlText w:val="%7."/>
+      <w:lvlJc w:val="left"/>
+      <w:pPr>
+        <w:ind w:left="5040" w:hanging="360"/>
+      </w:pPr>
+    </w:lvl>
+    <w:lvl w:ilvl="7" w:tplc="40090019">
+      <w:start w:val="1"/>
+      <w:numFmt w:val="lowerLetter"/>
+      <w:lvlText w:val="%8."/>
+      <w:lvlJc w:val="left"/>
+      <w:pPr>
+        <w:ind w:left="5760" w:hanging="360"/>
+      </w:pPr>
+    </w:lvl>
+    <w:lvl w:ilvl="8" w:tplc="4009001B">
+      <w:start w:val="1"/>
+      <w:numFmt w:val="lowerRoman"/>
+      <w:lvlText w:val="%9."/>
+      <w:lvlJc w:val="right"/>
+      <w:pPr>
+        <w:ind w:left="6480" w:hanging="180"/>
+      </w:pPr>
+    </w:lvl>
+  </w:abstractNum>
+  <w:abstractNum w:abstractNumId="9">
     <w:nsid w:val="738A5881"/>
     <w:multiLevelType w:val="hybridMultilevel"/>
     <w:tmpl w:val="22764A26"/>
@@ -3511,7 +4135,7 @@
       </w:pPr>
     </w:lvl>
   </w:abstractNum>
-  <w:abstractNum w:abstractNumId="9">
+  <w:abstractNum w:abstractNumId="10">
     <w:nsid w:val="73D636EC"/>
     <w:multiLevelType w:val="hybridMultilevel"/>
     <w:tmpl w:val="00CAB3BC"/>
@@ -3613,13 +4237,13 @@
     <w:abstractNumId w:val="3"/>
   </w:num>
   <w:num w:numId="5">
-    <w:abstractNumId w:val="9"/>
+    <w:abstractNumId w:val="10"/>
   </w:num>
   <w:num w:numId="6">
     <w:abstractNumId w:val="2"/>
   </w:num>
   <w:num w:numId="7">
-    <w:abstractNumId w:val="8"/>
+    <w:abstractNumId w:val="9"/>
   </w:num>
   <w:num w:numId="8">
     <w:abstractNumId w:val="4"/>
@@ -3629,6 +4253,36 @@
   </w:num>
   <w:num w:numId="10">
     <w:abstractNumId w:val="1"/>
+    <w:lvlOverride w:ilvl="0">
+      <w:startOverride w:val="1"/>
+    </w:lvlOverride>
+    <w:lvlOverride w:ilvl="1">
+      <w:startOverride w:val="1"/>
+    </w:lvlOverride>
+    <w:lvlOverride w:ilvl="2">
+      <w:startOverride w:val="1"/>
+    </w:lvlOverride>
+    <w:lvlOverride w:ilvl="3">
+      <w:startOverride w:val="1"/>
+    </w:lvlOverride>
+    <w:lvlOverride w:ilvl="4">
+      <w:startOverride w:val="1"/>
+    </w:lvlOverride>
+    <w:lvlOverride w:ilvl="5">
+      <w:startOverride w:val="1"/>
+    </w:lvlOverride>
+    <w:lvlOverride w:ilvl="6">
+      <w:startOverride w:val="1"/>
+    </w:lvlOverride>
+    <w:lvlOverride w:ilvl="7">
+      <w:startOverride w:val="1"/>
+    </w:lvlOverride>
+    <w:lvlOverride w:ilvl="8">
+      <w:startOverride w:val="1"/>
+    </w:lvlOverride>
+  </w:num>
+  <w:num w:numId="11">
+    <w:abstractNumId w:val="8"/>
     <w:lvlOverride w:ilvl="0">
       <w:startOverride w:val="1"/>
     </w:lvlOverride>

</xml_diff>

<commit_message>
Date: 02 Dec 2025
</commit_message>
<xml_diff>
--- a/Assignments.docx
+++ b/Assignments.docx
@@ -3949,6 +3949,147 @@
           <w:ilvl w:val="0"/>
           <w:numId w:val="9"/>
         </w:numPr>
+        <w:rPr>
+          <w:sz w:val="24"/>
+          <w:szCs w:val="24"/>
+          <w:lang w:val="en-US"/>
+        </w:rPr>
+      </w:pPr>
+      <w:r>
+        <w:rPr>
+          <w:sz w:val="24"/>
+          <w:szCs w:val="24"/>
+          <w:lang w:val="en-US"/>
+        </w:rPr>
+        <w:t xml:space="preserve">Open </w:t>
+      </w:r>
+      <w:hyperlink r:id="rId23" w:history="1">
+        <w:r>
+          <w:rPr>
+            <w:rStyle w:val="Hyperlink"/>
+            <w:sz w:val="24"/>
+            <w:szCs w:val="24"/>
+            <w:lang w:val="en-US"/>
+          </w:rPr>
+          <w:t>https://dash.bl</w:t>
+        </w:r>
+        <w:bookmarkStart w:id="0" w:name="_GoBack"/>
+        <w:bookmarkEnd w:id="0"/>
+        <w:r>
+          <w:rPr>
+            <w:rStyle w:val="Hyperlink"/>
+            <w:sz w:val="24"/>
+            <w:szCs w:val="24"/>
+            <w:lang w:val="en-US"/>
+          </w:rPr>
+          <w:t>i</w:t>
+        </w:r>
+        <w:r>
+          <w:rPr>
+            <w:rStyle w:val="Hyperlink"/>
+            <w:sz w:val="24"/>
+            <w:szCs w:val="24"/>
+            <w:lang w:val="en-US"/>
+          </w:rPr>
+          <w:t>ng-center.com/platform/signIn.html</w:t>
+        </w:r>
+      </w:hyperlink>
+    </w:p>
+    <w:p>
+      <w:pPr>
+        <w:pStyle w:val="ListParagraph"/>
+        <w:numPr>
+          <w:ilvl w:val="1"/>
+          <w:numId w:val="9"/>
+        </w:numPr>
+        <w:rPr>
+          <w:sz w:val="24"/>
+          <w:szCs w:val="24"/>
+          <w:lang w:val="en-US"/>
+        </w:rPr>
+      </w:pPr>
+      <w:r>
+        <w:rPr>
+          <w:sz w:val="24"/>
+          <w:szCs w:val="24"/>
+          <w:lang w:val="en-US"/>
+        </w:rPr>
+        <w:t>Click on forgot password</w:t>
+      </w:r>
+    </w:p>
+    <w:p>
+      <w:pPr>
+        <w:pStyle w:val="ListParagraph"/>
+        <w:numPr>
+          <w:ilvl w:val="1"/>
+          <w:numId w:val="9"/>
+        </w:numPr>
+        <w:rPr>
+          <w:sz w:val="24"/>
+          <w:szCs w:val="24"/>
+          <w:lang w:val="en-US"/>
+        </w:rPr>
+      </w:pPr>
+      <w:r>
+        <w:rPr>
+          <w:sz w:val="24"/>
+          <w:szCs w:val="24"/>
+          <w:lang w:val="en-US"/>
+        </w:rPr>
+        <w:t>Enter your email id</w:t>
+      </w:r>
+    </w:p>
+    <w:p>
+      <w:pPr>
+        <w:pStyle w:val="ListParagraph"/>
+        <w:numPr>
+          <w:ilvl w:val="1"/>
+          <w:numId w:val="9"/>
+        </w:numPr>
+        <w:rPr>
+          <w:sz w:val="24"/>
+          <w:szCs w:val="24"/>
+          <w:lang w:val="en-US"/>
+        </w:rPr>
+      </w:pPr>
+      <w:r>
+        <w:rPr>
+          <w:sz w:val="24"/>
+          <w:szCs w:val="24"/>
+          <w:lang w:val="en-US"/>
+        </w:rPr>
+        <w:t>Click on reset password button</w:t>
+      </w:r>
+    </w:p>
+    <w:p>
+      <w:pPr>
+        <w:pStyle w:val="ListParagraph"/>
+        <w:numPr>
+          <w:ilvl w:val="1"/>
+          <w:numId w:val="9"/>
+        </w:numPr>
+        <w:rPr>
+          <w:sz w:val="24"/>
+          <w:szCs w:val="24"/>
+          <w:lang w:val="en-US"/>
+        </w:rPr>
+      </w:pPr>
+      <w:r>
+        <w:rPr>
+          <w:sz w:val="24"/>
+          <w:szCs w:val="24"/>
+          <w:lang w:val="en-US"/>
+        </w:rPr>
+        <w:t>Display the text (message) in green color.</w:t>
+      </w:r>
+    </w:p>
+    <w:p>
+      <w:pPr>
+        <w:pStyle w:val="ListParagraph"/>
+        <w:numPr>
+          <w:ilvl w:val="0"/>
+          <w:numId w:val="9"/>
+        </w:numPr>
         <w:spacing w:line="256" w:lineRule="auto"/>
         <w:rPr>
           <w:sz w:val="24"/>
@@ -3956,8 +4097,6 @@
           <w:lang w:val="en-US"/>
         </w:rPr>
       </w:pPr>
-      <w:bookmarkStart w:id="0" w:name="_GoBack"/>
-      <w:bookmarkEnd w:id="0"/>
     </w:p>
     <w:p>
       <w:pPr>
@@ -5042,6 +5181,9 @@
   </w:num>
   <w:num w:numId="12">
     <w:abstractNumId w:val="8"/>
+  </w:num>
+  <w:num w:numId="13">
+    <w:abstractNumId w:val="1"/>
   </w:num>
 </w:numbering>
 </file>
@@ -5491,6 +5633,18 @@
       <w:u w:val="single"/>
     </w:rPr>
   </w:style>
+  <w:style w:type="character" w:styleId="FollowedHyperlink">
+    <w:name w:val="FollowedHyperlink"/>
+    <w:basedOn w:val="DefaultParagraphFont"/>
+    <w:uiPriority w:val="99"/>
+    <w:semiHidden/>
+    <w:unhideWhenUsed/>
+    <w:rsid w:val="00823E09"/>
+    <w:rPr>
+      <w:color w:val="954F72" w:themeColor="followedHyperlink"/>
+      <w:u w:val="single"/>
+    </w:rPr>
+  </w:style>
 </w:styles>
 </file>
 

</xml_diff>

<commit_message>
Date: 04 Dec 2025
</commit_message>
<xml_diff>
--- a/Assignments.docx
+++ b/Assignments.docx
@@ -173,13 +173,23 @@
           <w:lang w:val="en-US"/>
         </w:rPr>
       </w:pPr>
-      <w:r>
-        <w:rPr>
-          <w:sz w:val="24"/>
-          <w:szCs w:val="24"/>
-          <w:lang w:val="en-US"/>
-        </w:rPr>
-        <w:t>hra = 20% of basic salary</w:t>
+      <w:proofErr w:type="spellStart"/>
+      <w:r>
+        <w:rPr>
+          <w:sz w:val="24"/>
+          <w:szCs w:val="24"/>
+          <w:lang w:val="en-US"/>
+        </w:rPr>
+        <w:t>hra</w:t>
+      </w:r>
+      <w:proofErr w:type="spellEnd"/>
+      <w:r>
+        <w:rPr>
+          <w:sz w:val="24"/>
+          <w:szCs w:val="24"/>
+          <w:lang w:val="en-US"/>
+        </w:rPr>
+        <w:t xml:space="preserve"> = 20% of basic salary</w:t>
       </w:r>
     </w:p>
     <w:p>
@@ -195,13 +205,23 @@
           <w:lang w:val="en-US"/>
         </w:rPr>
       </w:pPr>
-      <w:r>
-        <w:rPr>
-          <w:sz w:val="24"/>
-          <w:szCs w:val="24"/>
-          <w:lang w:val="en-US"/>
-        </w:rPr>
-        <w:t>pf = 5 % of basic salary</w:t>
+      <w:proofErr w:type="spellStart"/>
+      <w:r>
+        <w:rPr>
+          <w:sz w:val="24"/>
+          <w:szCs w:val="24"/>
+          <w:lang w:val="en-US"/>
+        </w:rPr>
+        <w:t>pf</w:t>
+      </w:r>
+      <w:proofErr w:type="spellEnd"/>
+      <w:r>
+        <w:rPr>
+          <w:sz w:val="24"/>
+          <w:szCs w:val="24"/>
+          <w:lang w:val="en-US"/>
+        </w:rPr>
+        <w:t xml:space="preserve"> = 5 % of basic salary</w:t>
       </w:r>
     </w:p>
     <w:p>
@@ -223,8 +243,18 @@
           <w:szCs w:val="24"/>
           <w:lang w:val="en-US"/>
         </w:rPr>
-        <w:t>gross salary = basic salary + da + hra</w:t>
-      </w:r>
+        <w:t xml:space="preserve">gross salary = basic salary + da + </w:t>
+      </w:r>
+      <w:proofErr w:type="spellStart"/>
+      <w:r>
+        <w:rPr>
+          <w:sz w:val="24"/>
+          <w:szCs w:val="24"/>
+          <w:lang w:val="en-US"/>
+        </w:rPr>
+        <w:t>hra</w:t>
+      </w:r>
+      <w:proofErr w:type="spellEnd"/>
     </w:p>
     <w:p>
       <w:pPr>
@@ -245,8 +275,18 @@
           <w:szCs w:val="24"/>
           <w:lang w:val="en-US"/>
         </w:rPr>
-        <w:t>net salary = gross salary – pf</w:t>
-      </w:r>
+        <w:t xml:space="preserve">net salary = gross salary – </w:t>
+      </w:r>
+      <w:proofErr w:type="spellStart"/>
+      <w:r>
+        <w:rPr>
+          <w:sz w:val="24"/>
+          <w:szCs w:val="24"/>
+          <w:lang w:val="en-US"/>
+        </w:rPr>
+        <w:t>pf</w:t>
+      </w:r>
+      <w:proofErr w:type="spellEnd"/>
     </w:p>
     <w:p>
       <w:pPr>
@@ -289,7 +329,43 @@
           <w:szCs w:val="24"/>
           <w:lang w:val="en-US"/>
         </w:rPr>
-        <w:t>Accept any number form user and check whether it is +ve or –ve.</w:t>
+        <w:t>Accept any number form user and check whether it is +</w:t>
+      </w:r>
+      <w:proofErr w:type="spellStart"/>
+      <w:r>
+        <w:rPr>
+          <w:sz w:val="24"/>
+          <w:szCs w:val="24"/>
+          <w:lang w:val="en-US"/>
+        </w:rPr>
+        <w:t>ve</w:t>
+      </w:r>
+      <w:proofErr w:type="spellEnd"/>
+      <w:r>
+        <w:rPr>
+          <w:sz w:val="24"/>
+          <w:szCs w:val="24"/>
+          <w:lang w:val="en-US"/>
+        </w:rPr>
+        <w:t xml:space="preserve"> or –</w:t>
+      </w:r>
+      <w:proofErr w:type="spellStart"/>
+      <w:r>
+        <w:rPr>
+          <w:sz w:val="24"/>
+          <w:szCs w:val="24"/>
+          <w:lang w:val="en-US"/>
+        </w:rPr>
+        <w:t>ve</w:t>
+      </w:r>
+      <w:proofErr w:type="spellEnd"/>
+      <w:r>
+        <w:rPr>
+          <w:sz w:val="24"/>
+          <w:szCs w:val="24"/>
+          <w:lang w:val="en-US"/>
+        </w:rPr>
+        <w:t>.</w:t>
       </w:r>
     </w:p>
     <w:p>
@@ -437,7 +513,25 @@
           <w:szCs w:val="24"/>
           <w:lang w:val="en-US"/>
         </w:rPr>
-        <w:t>Accept marks of 5 subjects and canculate total and average marks also display the grade as follows</w:t>
+        <w:t xml:space="preserve">Accept marks of 5 subjects and </w:t>
+      </w:r>
+      <w:proofErr w:type="spellStart"/>
+      <w:r>
+        <w:rPr>
+          <w:sz w:val="24"/>
+          <w:szCs w:val="24"/>
+          <w:lang w:val="en-US"/>
+        </w:rPr>
+        <w:t>canculate</w:t>
+      </w:r>
+      <w:proofErr w:type="spellEnd"/>
+      <w:r>
+        <w:rPr>
+          <w:sz w:val="24"/>
+          <w:szCs w:val="24"/>
+          <w:lang w:val="en-US"/>
+        </w:rPr>
+        <w:t xml:space="preserve"> total and average marks also display the grade as follows</w:t>
       </w:r>
       <w:r>
         <w:rPr>
@@ -521,8 +615,17 @@
           <w:lang w:val="en-US"/>
         </w:rPr>
         <w:tab/>
+      </w:r>
+      <w:proofErr w:type="spellStart"/>
+      <w:r>
+        <w:rPr>
+          <w:sz w:val="24"/>
+          <w:szCs w:val="24"/>
+          <w:lang w:val="en-US"/>
+        </w:rPr>
         <w:t>Dist</w:t>
       </w:r>
+      <w:proofErr w:type="spellEnd"/>
       <w:r>
         <w:rPr>
           <w:sz w:val="24"/>
@@ -903,7 +1006,25 @@
           <w:szCs w:val="24"/>
           <w:lang w:val="en-US"/>
         </w:rPr>
-        <w:t>Create a class with name BankAccount with following members</w:t>
+        <w:t xml:space="preserve">Create a class with name </w:t>
+      </w:r>
+      <w:proofErr w:type="spellStart"/>
+      <w:r>
+        <w:rPr>
+          <w:sz w:val="24"/>
+          <w:szCs w:val="24"/>
+          <w:lang w:val="en-US"/>
+        </w:rPr>
+        <w:t>BankAccount</w:t>
+      </w:r>
+      <w:proofErr w:type="spellEnd"/>
+      <w:r>
+        <w:rPr>
+          <w:sz w:val="24"/>
+          <w:szCs w:val="24"/>
+          <w:lang w:val="en-US"/>
+        </w:rPr>
+        <w:t xml:space="preserve"> with following members</w:t>
       </w:r>
     </w:p>
     <w:p>
@@ -963,13 +1084,23 @@
           <w:lang w:val="en-US"/>
         </w:rPr>
       </w:pPr>
-      <w:r>
-        <w:rPr>
-          <w:sz w:val="24"/>
-          <w:szCs w:val="24"/>
-          <w:lang w:val="en-US"/>
-        </w:rPr>
-        <w:t>Adhar No</w:t>
+      <w:proofErr w:type="spellStart"/>
+      <w:r>
+        <w:rPr>
+          <w:sz w:val="24"/>
+          <w:szCs w:val="24"/>
+          <w:lang w:val="en-US"/>
+        </w:rPr>
+        <w:t>Adhar</w:t>
+      </w:r>
+      <w:proofErr w:type="spellEnd"/>
+      <w:r>
+        <w:rPr>
+          <w:sz w:val="24"/>
+          <w:szCs w:val="24"/>
+          <w:lang w:val="en-US"/>
+        </w:rPr>
+        <w:t xml:space="preserve"> No</w:t>
       </w:r>
     </w:p>
     <w:p>
@@ -1047,13 +1178,23 @@
           <w:lang w:val="en-US"/>
         </w:rPr>
       </w:pPr>
-      <w:r>
-        <w:rPr>
-          <w:sz w:val="24"/>
-          <w:szCs w:val="24"/>
-          <w:lang w:val="en-US"/>
-        </w:rPr>
-        <w:t>displayData()</w:t>
+      <w:proofErr w:type="spellStart"/>
+      <w:r>
+        <w:rPr>
+          <w:sz w:val="24"/>
+          <w:szCs w:val="24"/>
+          <w:lang w:val="en-US"/>
+        </w:rPr>
+        <w:t>displayData</w:t>
+      </w:r>
+      <w:proofErr w:type="spellEnd"/>
+      <w:r>
+        <w:rPr>
+          <w:sz w:val="24"/>
+          <w:szCs w:val="24"/>
+          <w:lang w:val="en-US"/>
+        </w:rPr>
+        <w:t>()</w:t>
       </w:r>
     </w:p>
     <w:p>
@@ -1069,13 +1210,23 @@
           <w:lang w:val="en-US"/>
         </w:rPr>
       </w:pPr>
-      <w:r>
-        <w:rPr>
-          <w:sz w:val="24"/>
-          <w:szCs w:val="24"/>
-          <w:lang w:val="en-US"/>
-        </w:rPr>
-        <w:t>setInterestRate()</w:t>
+      <w:proofErr w:type="spellStart"/>
+      <w:r>
+        <w:rPr>
+          <w:sz w:val="24"/>
+          <w:szCs w:val="24"/>
+          <w:lang w:val="en-US"/>
+        </w:rPr>
+        <w:t>setInterestRate</w:t>
+      </w:r>
+      <w:proofErr w:type="spellEnd"/>
+      <w:r>
+        <w:rPr>
+          <w:sz w:val="24"/>
+          <w:szCs w:val="24"/>
+          <w:lang w:val="en-US"/>
+        </w:rPr>
+        <w:t>()</w:t>
       </w:r>
     </w:p>
     <w:p>
@@ -1847,7 +1998,25 @@
           <w:szCs w:val="24"/>
           <w:lang w:val="en-US"/>
         </w:rPr>
-        <w:t>Enter rediff Id</w:t>
+        <w:t xml:space="preserve">Enter </w:t>
+      </w:r>
+      <w:proofErr w:type="spellStart"/>
+      <w:r>
+        <w:rPr>
+          <w:sz w:val="24"/>
+          <w:szCs w:val="24"/>
+          <w:lang w:val="en-US"/>
+        </w:rPr>
+        <w:t>rediff</w:t>
+      </w:r>
+      <w:proofErr w:type="spellEnd"/>
+      <w:r>
+        <w:rPr>
+          <w:sz w:val="24"/>
+          <w:szCs w:val="24"/>
+          <w:lang w:val="en-US"/>
+        </w:rPr>
+        <w:t xml:space="preserve"> Id</w:t>
       </w:r>
     </w:p>
     <w:p>
@@ -3292,7 +3461,25 @@
           <w:szCs w:val="24"/>
           <w:lang w:val="en-US"/>
         </w:rPr>
-        <w:t>Enter first 4 characters from your city (Kolhapur – kolh)</w:t>
+        <w:t xml:space="preserve">Enter first 4 characters from your city (Kolhapur – </w:t>
+      </w:r>
+      <w:proofErr w:type="spellStart"/>
+      <w:r>
+        <w:rPr>
+          <w:sz w:val="24"/>
+          <w:szCs w:val="24"/>
+          <w:lang w:val="en-US"/>
+        </w:rPr>
+        <w:t>kolh</w:t>
+      </w:r>
+      <w:proofErr w:type="spellEnd"/>
+      <w:r>
+        <w:rPr>
+          <w:sz w:val="24"/>
+          <w:szCs w:val="24"/>
+          <w:lang w:val="en-US"/>
+        </w:rPr>
+        <w:t>)</w:t>
       </w:r>
     </w:p>
     <w:p>
@@ -3946,15 +4133,1227 @@
           <w:ilvl w:val="0"/>
           <w:numId w:val="9"/>
         </w:numPr>
-        <w:spacing w:line="256" w:lineRule="auto"/>
-        <w:rPr>
-          <w:sz w:val="24"/>
-          <w:szCs w:val="24"/>
-          <w:lang w:val="en-US"/>
-        </w:rPr>
-      </w:pPr>
+        <w:rPr>
+          <w:sz w:val="26"/>
+          <w:szCs w:val="24"/>
+          <w:lang w:val="en-US"/>
+        </w:rPr>
+      </w:pPr>
+      <w:r>
+        <w:rPr>
+          <w:sz w:val="26"/>
+          <w:szCs w:val="24"/>
+          <w:lang w:val="en-US"/>
+        </w:rPr>
+        <w:t xml:space="preserve">Launch </w:t>
+      </w:r>
+      <w:hyperlink r:id="rId24" w:history="1">
+        <w:r>
+          <w:rPr>
+            <w:rStyle w:val="Hyperlink"/>
+            <w:sz w:val="26"/>
+            <w:szCs w:val="24"/>
+            <w:lang w:val="en-US"/>
+          </w:rPr>
+          <w:t>https://opensource-demo.orangehrmlive.com/web/index.php/auth/login</w:t>
+        </w:r>
+      </w:hyperlink>
+    </w:p>
+    <w:p>
+      <w:pPr>
+        <w:pStyle w:val="ListParagraph"/>
+        <w:numPr>
+          <w:ilvl w:val="1"/>
+          <w:numId w:val="9"/>
+        </w:numPr>
+        <w:rPr>
+          <w:sz w:val="26"/>
+          <w:szCs w:val="24"/>
+          <w:lang w:val="en-US"/>
+        </w:rPr>
+      </w:pPr>
+      <w:r>
+        <w:rPr>
+          <w:sz w:val="26"/>
+          <w:szCs w:val="24"/>
+          <w:lang w:val="en-US"/>
+        </w:rPr>
+        <w:t>Enter user name as admin</w:t>
+      </w:r>
+    </w:p>
+    <w:p>
+      <w:pPr>
+        <w:pStyle w:val="ListParagraph"/>
+        <w:numPr>
+          <w:ilvl w:val="1"/>
+          <w:numId w:val="9"/>
+        </w:numPr>
+        <w:rPr>
+          <w:sz w:val="26"/>
+          <w:szCs w:val="24"/>
+          <w:lang w:val="en-US"/>
+        </w:rPr>
+      </w:pPr>
+      <w:r>
+        <w:rPr>
+          <w:sz w:val="26"/>
+          <w:szCs w:val="24"/>
+          <w:lang w:val="en-US"/>
+        </w:rPr>
+        <w:t>Enter password as admin123</w:t>
+      </w:r>
+    </w:p>
+    <w:p>
+      <w:pPr>
+        <w:pStyle w:val="ListParagraph"/>
+        <w:numPr>
+          <w:ilvl w:val="1"/>
+          <w:numId w:val="9"/>
+        </w:numPr>
+        <w:rPr>
+          <w:sz w:val="26"/>
+          <w:szCs w:val="24"/>
+          <w:lang w:val="en-US"/>
+        </w:rPr>
+      </w:pPr>
+      <w:r>
+        <w:rPr>
+          <w:sz w:val="26"/>
+          <w:szCs w:val="24"/>
+          <w:lang w:val="en-US"/>
+        </w:rPr>
+        <w:t>Click on Login button</w:t>
+      </w:r>
+    </w:p>
+    <w:p>
+      <w:pPr>
+        <w:pStyle w:val="ListParagraph"/>
+        <w:numPr>
+          <w:ilvl w:val="1"/>
+          <w:numId w:val="9"/>
+        </w:numPr>
+        <w:rPr>
+          <w:sz w:val="26"/>
+          <w:szCs w:val="24"/>
+          <w:lang w:val="en-US"/>
+        </w:rPr>
+      </w:pPr>
+      <w:r>
+        <w:rPr>
+          <w:sz w:val="26"/>
+          <w:szCs w:val="24"/>
+          <w:lang w:val="en-US"/>
+        </w:rPr>
+        <w:t>Logout the application (only if login is successful)</w:t>
+      </w:r>
+    </w:p>
+    <w:p>
+      <w:pPr>
+        <w:pStyle w:val="ListParagraph"/>
+        <w:numPr>
+          <w:ilvl w:val="0"/>
+          <w:numId w:val="9"/>
+        </w:numPr>
+        <w:spacing w:line="254" w:lineRule="auto"/>
+        <w:rPr>
+          <w:sz w:val="24"/>
+          <w:szCs w:val="24"/>
+          <w:lang w:val="en-US"/>
+        </w:rPr>
+      </w:pPr>
+      <w:r>
+        <w:rPr>
+          <w:sz w:val="24"/>
+          <w:szCs w:val="24"/>
+          <w:lang w:val="en-US"/>
+        </w:rPr>
+        <w:t xml:space="preserve">Open </w:t>
+      </w:r>
+      <w:hyperlink r:id="rId25" w:history="1">
+        <w:r>
+          <w:rPr>
+            <w:rStyle w:val="Hyperlink"/>
+            <w:sz w:val="24"/>
+            <w:szCs w:val="24"/>
+            <w:lang w:val="en-US"/>
+          </w:rPr>
+          <w:t>https://opensource-demo.orangehrmlive.com/web/index.php/auth/login</w:t>
+        </w:r>
+      </w:hyperlink>
+    </w:p>
+    <w:p>
+      <w:pPr>
+        <w:pStyle w:val="ListParagraph"/>
+        <w:numPr>
+          <w:ilvl w:val="1"/>
+          <w:numId w:val="9"/>
+        </w:numPr>
+        <w:spacing w:line="254" w:lineRule="auto"/>
+        <w:rPr>
+          <w:sz w:val="24"/>
+          <w:szCs w:val="24"/>
+          <w:lang w:val="en-US"/>
+        </w:rPr>
+      </w:pPr>
+      <w:r>
+        <w:rPr>
+          <w:sz w:val="24"/>
+          <w:szCs w:val="24"/>
+          <w:lang w:val="en-US"/>
+        </w:rPr>
+        <w:t>Login with Admin (admin, admin123)</w:t>
+      </w:r>
+    </w:p>
+    <w:p>
+      <w:pPr>
+        <w:pStyle w:val="ListParagraph"/>
+        <w:numPr>
+          <w:ilvl w:val="1"/>
+          <w:numId w:val="9"/>
+        </w:numPr>
+        <w:spacing w:line="254" w:lineRule="auto"/>
+        <w:rPr>
+          <w:sz w:val="24"/>
+          <w:szCs w:val="24"/>
+          <w:lang w:val="en-US"/>
+        </w:rPr>
+      </w:pPr>
+      <w:r>
+        <w:rPr>
+          <w:sz w:val="24"/>
+          <w:szCs w:val="24"/>
+          <w:lang w:val="en-US"/>
+        </w:rPr>
+        <w:t>Click on PIM</w:t>
+      </w:r>
+    </w:p>
+    <w:p>
+      <w:pPr>
+        <w:pStyle w:val="ListParagraph"/>
+        <w:numPr>
+          <w:ilvl w:val="1"/>
+          <w:numId w:val="9"/>
+        </w:numPr>
+        <w:spacing w:line="254" w:lineRule="auto"/>
+        <w:rPr>
+          <w:sz w:val="24"/>
+          <w:szCs w:val="24"/>
+          <w:lang w:val="en-US"/>
+        </w:rPr>
+      </w:pPr>
+      <w:r>
+        <w:rPr>
+          <w:sz w:val="24"/>
+          <w:szCs w:val="24"/>
+          <w:lang w:val="en-US"/>
+        </w:rPr>
+        <w:t>Click on + Add button</w:t>
+      </w:r>
+    </w:p>
+    <w:p>
+      <w:pPr>
+        <w:pStyle w:val="ListParagraph"/>
+        <w:numPr>
+          <w:ilvl w:val="1"/>
+          <w:numId w:val="9"/>
+        </w:numPr>
+        <w:spacing w:line="254" w:lineRule="auto"/>
+        <w:rPr>
+          <w:sz w:val="24"/>
+          <w:szCs w:val="24"/>
+          <w:lang w:val="en-US"/>
+        </w:rPr>
+      </w:pPr>
+      <w:r>
+        <w:rPr>
+          <w:sz w:val="24"/>
+          <w:szCs w:val="24"/>
+          <w:lang w:val="en-US"/>
+        </w:rPr>
+        <w:t>Enter First Name</w:t>
+      </w:r>
+    </w:p>
+    <w:p>
+      <w:pPr>
+        <w:pStyle w:val="ListParagraph"/>
+        <w:numPr>
+          <w:ilvl w:val="1"/>
+          <w:numId w:val="9"/>
+        </w:numPr>
+        <w:spacing w:line="254" w:lineRule="auto"/>
+        <w:rPr>
+          <w:sz w:val="24"/>
+          <w:szCs w:val="24"/>
+          <w:lang w:val="en-US"/>
+        </w:rPr>
+      </w:pPr>
+      <w:r>
+        <w:rPr>
+          <w:sz w:val="24"/>
+          <w:szCs w:val="24"/>
+          <w:lang w:val="en-US"/>
+        </w:rPr>
+        <w:t>Enter Middle Name</w:t>
+      </w:r>
+    </w:p>
+    <w:p>
+      <w:pPr>
+        <w:pStyle w:val="ListParagraph"/>
+        <w:numPr>
+          <w:ilvl w:val="1"/>
+          <w:numId w:val="9"/>
+        </w:numPr>
+        <w:spacing w:line="254" w:lineRule="auto"/>
+        <w:rPr>
+          <w:sz w:val="24"/>
+          <w:szCs w:val="24"/>
+          <w:lang w:val="en-US"/>
+        </w:rPr>
+      </w:pPr>
+      <w:r>
+        <w:rPr>
+          <w:sz w:val="24"/>
+          <w:szCs w:val="24"/>
+          <w:lang w:val="en-US"/>
+        </w:rPr>
+        <w:t>Enter Last Name</w:t>
+      </w:r>
+    </w:p>
+    <w:p>
+      <w:pPr>
+        <w:pStyle w:val="ListParagraph"/>
+        <w:numPr>
+          <w:ilvl w:val="1"/>
+          <w:numId w:val="9"/>
+        </w:numPr>
+        <w:spacing w:line="254" w:lineRule="auto"/>
+        <w:rPr>
+          <w:sz w:val="24"/>
+          <w:szCs w:val="24"/>
+          <w:lang w:val="en-US"/>
+        </w:rPr>
+      </w:pPr>
+      <w:r>
+        <w:rPr>
+          <w:sz w:val="24"/>
+          <w:szCs w:val="24"/>
+          <w:lang w:val="en-US"/>
+        </w:rPr>
+        <w:t>Click on Create Login Details</w:t>
+      </w:r>
+    </w:p>
+    <w:p>
+      <w:pPr>
+        <w:pStyle w:val="ListParagraph"/>
+        <w:numPr>
+          <w:ilvl w:val="1"/>
+          <w:numId w:val="9"/>
+        </w:numPr>
+        <w:spacing w:line="254" w:lineRule="auto"/>
+        <w:rPr>
+          <w:sz w:val="24"/>
+          <w:szCs w:val="24"/>
+          <w:lang w:val="en-US"/>
+        </w:rPr>
+      </w:pPr>
+      <w:r>
+        <w:rPr>
+          <w:sz w:val="24"/>
+          <w:szCs w:val="24"/>
+          <w:lang w:val="en-US"/>
+        </w:rPr>
+        <w:t>Enter User Name</w:t>
+      </w:r>
+    </w:p>
+    <w:p>
+      <w:pPr>
+        <w:pStyle w:val="ListParagraph"/>
+        <w:numPr>
+          <w:ilvl w:val="1"/>
+          <w:numId w:val="9"/>
+        </w:numPr>
+        <w:spacing w:line="254" w:lineRule="auto"/>
+        <w:rPr>
+          <w:sz w:val="24"/>
+          <w:szCs w:val="24"/>
+          <w:lang w:val="en-US"/>
+        </w:rPr>
+      </w:pPr>
+      <w:r>
+        <w:rPr>
+          <w:sz w:val="24"/>
+          <w:szCs w:val="24"/>
+          <w:lang w:val="en-US"/>
+        </w:rPr>
+        <w:t>Enter Password</w:t>
+      </w:r>
+    </w:p>
+    <w:p>
+      <w:pPr>
+        <w:pStyle w:val="ListParagraph"/>
+        <w:numPr>
+          <w:ilvl w:val="1"/>
+          <w:numId w:val="9"/>
+        </w:numPr>
+        <w:spacing w:line="254" w:lineRule="auto"/>
+        <w:rPr>
+          <w:sz w:val="24"/>
+          <w:szCs w:val="24"/>
+          <w:lang w:val="en-US"/>
+        </w:rPr>
+      </w:pPr>
+      <w:r>
+        <w:rPr>
+          <w:sz w:val="24"/>
+          <w:szCs w:val="24"/>
+          <w:lang w:val="en-US"/>
+        </w:rPr>
+        <w:t>Enter Confirm Password</w:t>
+      </w:r>
+    </w:p>
+    <w:p>
+      <w:pPr>
+        <w:pStyle w:val="ListParagraph"/>
+        <w:numPr>
+          <w:ilvl w:val="1"/>
+          <w:numId w:val="9"/>
+        </w:numPr>
+        <w:spacing w:line="254" w:lineRule="auto"/>
+        <w:rPr>
+          <w:sz w:val="24"/>
+          <w:szCs w:val="24"/>
+          <w:lang w:val="en-US"/>
+        </w:rPr>
+      </w:pPr>
+      <w:r>
+        <w:rPr>
+          <w:sz w:val="24"/>
+          <w:szCs w:val="24"/>
+          <w:lang w:val="en-US"/>
+        </w:rPr>
+        <w:lastRenderedPageBreak/>
+        <w:t>Click on Save Button</w:t>
+      </w:r>
+    </w:p>
+    <w:p>
+      <w:pPr>
+        <w:pStyle w:val="ListParagraph"/>
+        <w:numPr>
+          <w:ilvl w:val="1"/>
+          <w:numId w:val="9"/>
+        </w:numPr>
+        <w:spacing w:line="254" w:lineRule="auto"/>
+        <w:rPr>
+          <w:sz w:val="24"/>
+          <w:szCs w:val="24"/>
+          <w:lang w:val="en-US"/>
+        </w:rPr>
+      </w:pPr>
+      <w:r>
+        <w:rPr>
+          <w:sz w:val="24"/>
+          <w:szCs w:val="24"/>
+          <w:lang w:val="en-US"/>
+        </w:rPr>
+        <w:t>Logout</w:t>
+      </w:r>
+    </w:p>
+    <w:p>
+      <w:pPr>
+        <w:pStyle w:val="ListParagraph"/>
+        <w:numPr>
+          <w:ilvl w:val="1"/>
+          <w:numId w:val="9"/>
+        </w:numPr>
+        <w:spacing w:line="254" w:lineRule="auto"/>
+        <w:rPr>
+          <w:sz w:val="24"/>
+          <w:szCs w:val="24"/>
+          <w:lang w:val="en-US"/>
+        </w:rPr>
+      </w:pPr>
+      <w:r>
+        <w:rPr>
+          <w:sz w:val="24"/>
+          <w:szCs w:val="24"/>
+          <w:lang w:val="en-US"/>
+        </w:rPr>
+        <w:t xml:space="preserve">Login using data provided in step no h &amp; </w:t>
+      </w:r>
+      <w:proofErr w:type="spellStart"/>
+      <w:r>
+        <w:rPr>
+          <w:sz w:val="24"/>
+          <w:szCs w:val="24"/>
+          <w:lang w:val="en-US"/>
+        </w:rPr>
+        <w:t>i</w:t>
+      </w:r>
+      <w:proofErr w:type="spellEnd"/>
+    </w:p>
+    <w:p>
+      <w:pPr>
+        <w:pStyle w:val="ListParagraph"/>
+        <w:numPr>
+          <w:ilvl w:val="1"/>
+          <w:numId w:val="9"/>
+        </w:numPr>
+        <w:spacing w:line="254" w:lineRule="auto"/>
+        <w:rPr>
+          <w:sz w:val="24"/>
+          <w:szCs w:val="24"/>
+          <w:lang w:val="en-US"/>
+        </w:rPr>
+      </w:pPr>
+      <w:r>
+        <w:rPr>
+          <w:sz w:val="24"/>
+          <w:szCs w:val="24"/>
+          <w:lang w:val="en-US"/>
+        </w:rPr>
+        <w:t>Display name of employee on logout link</w:t>
+      </w:r>
+    </w:p>
+    <w:p>
+      <w:pPr>
+        <w:pStyle w:val="ListParagraph"/>
+        <w:numPr>
+          <w:ilvl w:val="1"/>
+          <w:numId w:val="9"/>
+        </w:numPr>
+        <w:spacing w:line="254" w:lineRule="auto"/>
+        <w:rPr>
+          <w:sz w:val="24"/>
+          <w:szCs w:val="24"/>
+          <w:lang w:val="en-US"/>
+        </w:rPr>
+      </w:pPr>
+      <w:r>
+        <w:rPr>
+          <w:sz w:val="24"/>
+          <w:szCs w:val="24"/>
+          <w:lang w:val="en-US"/>
+        </w:rPr>
+        <w:t>Click on My Info</w:t>
+      </w:r>
+    </w:p>
+    <w:p>
+      <w:pPr>
+        <w:pStyle w:val="ListParagraph"/>
+        <w:numPr>
+          <w:ilvl w:val="1"/>
+          <w:numId w:val="9"/>
+        </w:numPr>
+        <w:spacing w:line="254" w:lineRule="auto"/>
+        <w:rPr>
+          <w:sz w:val="24"/>
+          <w:szCs w:val="24"/>
+          <w:lang w:val="en-US"/>
+        </w:rPr>
+      </w:pPr>
+      <w:r>
+        <w:rPr>
+          <w:sz w:val="24"/>
+          <w:szCs w:val="24"/>
+          <w:lang w:val="en-US"/>
+        </w:rPr>
+        <w:t>Display the Employee ID</w:t>
+      </w:r>
+    </w:p>
+    <w:p>
+      <w:pPr>
+        <w:pStyle w:val="ListParagraph"/>
+        <w:numPr>
+          <w:ilvl w:val="1"/>
+          <w:numId w:val="9"/>
+        </w:numPr>
+        <w:spacing w:line="254" w:lineRule="auto"/>
+        <w:rPr>
+          <w:sz w:val="24"/>
+          <w:szCs w:val="24"/>
+          <w:lang w:val="en-US"/>
+        </w:rPr>
+      </w:pPr>
+      <w:r>
+        <w:rPr>
+          <w:sz w:val="24"/>
+          <w:szCs w:val="24"/>
+          <w:lang w:val="en-US"/>
+        </w:rPr>
+        <w:t>Logout</w:t>
+      </w:r>
+    </w:p>
+    <w:p>
+      <w:pPr>
+        <w:pStyle w:val="ListParagraph"/>
+        <w:numPr>
+          <w:ilvl w:val="1"/>
+          <w:numId w:val="9"/>
+        </w:numPr>
+        <w:spacing w:line="254" w:lineRule="auto"/>
+        <w:rPr>
+          <w:sz w:val="24"/>
+          <w:szCs w:val="24"/>
+          <w:lang w:val="en-US"/>
+        </w:rPr>
+      </w:pPr>
+      <w:r>
+        <w:rPr>
+          <w:sz w:val="24"/>
+          <w:szCs w:val="24"/>
+          <w:lang w:val="en-US"/>
+        </w:rPr>
+        <w:t>Login with admin</w:t>
+      </w:r>
+    </w:p>
+    <w:p>
+      <w:pPr>
+        <w:pStyle w:val="ListParagraph"/>
+        <w:numPr>
+          <w:ilvl w:val="1"/>
+          <w:numId w:val="9"/>
+        </w:numPr>
+        <w:spacing w:line="254" w:lineRule="auto"/>
+        <w:rPr>
+          <w:sz w:val="24"/>
+          <w:szCs w:val="24"/>
+          <w:lang w:val="en-US"/>
+        </w:rPr>
+      </w:pPr>
+      <w:r>
+        <w:rPr>
+          <w:sz w:val="24"/>
+          <w:szCs w:val="24"/>
+          <w:lang w:val="en-US"/>
+        </w:rPr>
+        <w:t>Click on Admin</w:t>
+      </w:r>
+    </w:p>
+    <w:p>
+      <w:pPr>
+        <w:pStyle w:val="ListParagraph"/>
+        <w:numPr>
+          <w:ilvl w:val="1"/>
+          <w:numId w:val="9"/>
+        </w:numPr>
+        <w:spacing w:line="254" w:lineRule="auto"/>
+        <w:rPr>
+          <w:sz w:val="24"/>
+          <w:szCs w:val="24"/>
+          <w:lang w:val="en-US"/>
+        </w:rPr>
+      </w:pPr>
+      <w:r>
+        <w:rPr>
+          <w:sz w:val="24"/>
+          <w:szCs w:val="24"/>
+          <w:lang w:val="en-US"/>
+        </w:rPr>
+        <w:t>Enter user name</w:t>
+      </w:r>
+    </w:p>
+    <w:p>
+      <w:pPr>
+        <w:pStyle w:val="ListParagraph"/>
+        <w:numPr>
+          <w:ilvl w:val="1"/>
+          <w:numId w:val="9"/>
+        </w:numPr>
+        <w:spacing w:line="254" w:lineRule="auto"/>
+        <w:rPr>
+          <w:sz w:val="24"/>
+          <w:szCs w:val="24"/>
+          <w:lang w:val="en-US"/>
+        </w:rPr>
+      </w:pPr>
+      <w:r>
+        <w:rPr>
+          <w:sz w:val="24"/>
+          <w:szCs w:val="24"/>
+          <w:lang w:val="en-US"/>
+        </w:rPr>
+        <w:t xml:space="preserve">Click on Search </w:t>
+      </w:r>
+    </w:p>
+    <w:p>
+      <w:pPr>
+        <w:pStyle w:val="ListParagraph"/>
+        <w:numPr>
+          <w:ilvl w:val="1"/>
+          <w:numId w:val="9"/>
+        </w:numPr>
+        <w:spacing w:line="254" w:lineRule="auto"/>
+        <w:rPr>
+          <w:sz w:val="24"/>
+          <w:szCs w:val="24"/>
+          <w:lang w:val="en-US"/>
+        </w:rPr>
+      </w:pPr>
+      <w:r>
+        <w:rPr>
+          <w:sz w:val="24"/>
+          <w:szCs w:val="24"/>
+          <w:lang w:val="en-US"/>
+        </w:rPr>
+        <w:t>Delete the record displayed</w:t>
+      </w:r>
+    </w:p>
+    <w:p>
+      <w:pPr>
+        <w:pStyle w:val="ListParagraph"/>
+        <w:numPr>
+          <w:ilvl w:val="1"/>
+          <w:numId w:val="9"/>
+        </w:numPr>
+        <w:rPr>
+          <w:sz w:val="26"/>
+          <w:szCs w:val="24"/>
+          <w:lang w:val="en-US"/>
+        </w:rPr>
+      </w:pPr>
+      <w:r>
+        <w:rPr>
+          <w:sz w:val="24"/>
+          <w:szCs w:val="24"/>
+          <w:lang w:val="en-US"/>
+        </w:rPr>
+        <w:t>Logout</w:t>
+      </w:r>
+    </w:p>
+    <w:p>
+      <w:pPr>
+        <w:pStyle w:val="ListParagraph"/>
+        <w:numPr>
+          <w:ilvl w:val="0"/>
+          <w:numId w:val="9"/>
+        </w:numPr>
+        <w:spacing w:line="254" w:lineRule="auto"/>
+        <w:rPr>
+          <w:sz w:val="24"/>
+          <w:szCs w:val="24"/>
+          <w:lang w:val="en-US"/>
+        </w:rPr>
+      </w:pPr>
+      <w:r>
+        <w:rPr>
+          <w:sz w:val="24"/>
+          <w:szCs w:val="24"/>
+          <w:lang w:val="en-US"/>
+        </w:rPr>
+        <w:t xml:space="preserve">Open </w:t>
+      </w:r>
+      <w:hyperlink r:id="rId26" w:history="1">
+        <w:r>
+          <w:rPr>
+            <w:rStyle w:val="Hyperlink"/>
+            <w:sz w:val="24"/>
+            <w:szCs w:val="24"/>
+            <w:lang w:val="en-US"/>
+          </w:rPr>
+          <w:t>https://www.rediff.com/</w:t>
+        </w:r>
+      </w:hyperlink>
+      <w:r>
+        <w:rPr>
+          <w:sz w:val="24"/>
+          <w:szCs w:val="24"/>
+          <w:lang w:val="en-US"/>
+        </w:rPr>
+        <w:t xml:space="preserve"> </w:t>
+      </w:r>
+    </w:p>
+    <w:p>
+      <w:pPr>
+        <w:pStyle w:val="ListParagraph"/>
+        <w:numPr>
+          <w:ilvl w:val="1"/>
+          <w:numId w:val="9"/>
+        </w:numPr>
+        <w:spacing w:line="254" w:lineRule="auto"/>
+        <w:rPr>
+          <w:sz w:val="24"/>
+          <w:szCs w:val="24"/>
+          <w:lang w:val="en-US"/>
+        </w:rPr>
+      </w:pPr>
+      <w:r>
+        <w:rPr>
+          <w:sz w:val="24"/>
+          <w:szCs w:val="24"/>
+          <w:lang w:val="en-US"/>
+        </w:rPr>
+        <w:t>Click on Money</w:t>
+      </w:r>
+    </w:p>
+    <w:p>
+      <w:pPr>
+        <w:pStyle w:val="ListParagraph"/>
+        <w:numPr>
+          <w:ilvl w:val="1"/>
+          <w:numId w:val="9"/>
+        </w:numPr>
+        <w:spacing w:line="254" w:lineRule="auto"/>
+        <w:rPr>
+          <w:sz w:val="24"/>
+          <w:szCs w:val="24"/>
+          <w:lang w:val="en-US"/>
+        </w:rPr>
+      </w:pPr>
+      <w:r>
+        <w:rPr>
+          <w:sz w:val="24"/>
+          <w:szCs w:val="24"/>
+          <w:lang w:val="en-US"/>
+        </w:rPr>
+        <w:t>Click on More Gainers</w:t>
+      </w:r>
+    </w:p>
+    <w:p>
+      <w:pPr>
+        <w:pStyle w:val="ListParagraph"/>
+        <w:numPr>
+          <w:ilvl w:val="1"/>
+          <w:numId w:val="9"/>
+        </w:numPr>
+        <w:spacing w:line="254" w:lineRule="auto"/>
+        <w:rPr>
+          <w:sz w:val="24"/>
+          <w:szCs w:val="24"/>
+          <w:lang w:val="en-US"/>
+        </w:rPr>
+      </w:pPr>
+      <w:r>
+        <w:rPr>
+          <w:sz w:val="24"/>
+          <w:szCs w:val="24"/>
+          <w:lang w:val="en-US"/>
+        </w:rPr>
+        <w:t>Display title of all the headers</w:t>
+      </w:r>
+    </w:p>
+    <w:p>
+      <w:pPr>
+        <w:pStyle w:val="ListParagraph"/>
+        <w:numPr>
+          <w:ilvl w:val="1"/>
+          <w:numId w:val="9"/>
+        </w:numPr>
+        <w:spacing w:line="254" w:lineRule="auto"/>
+        <w:rPr>
+          <w:sz w:val="24"/>
+          <w:szCs w:val="24"/>
+          <w:lang w:val="en-US"/>
+        </w:rPr>
+      </w:pPr>
+      <w:r>
+        <w:rPr>
+          <w:sz w:val="24"/>
+          <w:szCs w:val="24"/>
+          <w:lang w:val="en-US"/>
+        </w:rPr>
+        <w:t>Display total no of rows</w:t>
+      </w:r>
+    </w:p>
+    <w:p>
+      <w:pPr>
+        <w:pStyle w:val="ListParagraph"/>
+        <w:numPr>
+          <w:ilvl w:val="1"/>
+          <w:numId w:val="9"/>
+        </w:numPr>
+        <w:spacing w:line="254" w:lineRule="auto"/>
+        <w:rPr>
+          <w:sz w:val="24"/>
+          <w:szCs w:val="24"/>
+          <w:lang w:val="en-US"/>
+        </w:rPr>
+      </w:pPr>
+      <w:r>
+        <w:rPr>
+          <w:sz w:val="24"/>
+          <w:szCs w:val="24"/>
+          <w:lang w:val="en-US"/>
+        </w:rPr>
+        <w:t>Display any row randomly</w:t>
+      </w:r>
+    </w:p>
+    <w:p>
+      <w:pPr>
+        <w:pStyle w:val="ListParagraph"/>
+        <w:numPr>
+          <w:ilvl w:val="1"/>
+          <w:numId w:val="9"/>
+        </w:numPr>
+        <w:spacing w:line="254" w:lineRule="auto"/>
+        <w:rPr>
+          <w:sz w:val="24"/>
+          <w:szCs w:val="24"/>
+          <w:lang w:val="en-US"/>
+        </w:rPr>
+      </w:pPr>
+      <w:r>
+        <w:rPr>
+          <w:sz w:val="24"/>
+          <w:szCs w:val="24"/>
+          <w:lang w:val="en-US"/>
+        </w:rPr>
+        <w:t>Display list of all the companies (Company name only)</w:t>
+      </w:r>
+    </w:p>
+    <w:p>
+      <w:pPr>
+        <w:pStyle w:val="ListParagraph"/>
+        <w:numPr>
+          <w:ilvl w:val="1"/>
+          <w:numId w:val="9"/>
+        </w:numPr>
+        <w:rPr>
+          <w:sz w:val="24"/>
+          <w:szCs w:val="24"/>
+          <w:lang w:val="en-US"/>
+        </w:rPr>
+      </w:pPr>
+      <w:r>
+        <w:rPr>
+          <w:sz w:val="24"/>
+          <w:szCs w:val="24"/>
+          <w:lang w:val="en-US"/>
+        </w:rPr>
+        <w:t>Read all current price and display the highest price.</w:t>
+      </w:r>
+      <w:r>
+        <w:rPr>
+          <w:sz w:val="24"/>
+          <w:szCs w:val="24"/>
+          <w:lang w:val="en-US"/>
+        </w:rPr>
+        <w:br/>
+        <w:t>(Read all the current price, store in array and then sort an array so you will get highest price)</w:t>
+      </w:r>
+    </w:p>
+    <w:p>
+      <w:pPr>
+        <w:pStyle w:val="ListParagraph"/>
+        <w:numPr>
+          <w:ilvl w:val="0"/>
+          <w:numId w:val="9"/>
+        </w:numPr>
+        <w:spacing w:line="254" w:lineRule="auto"/>
+        <w:rPr>
+          <w:sz w:val="24"/>
+          <w:szCs w:val="24"/>
+          <w:lang w:val="en-US"/>
+        </w:rPr>
+      </w:pPr>
+      <w:r>
+        <w:rPr>
+          <w:sz w:val="24"/>
+          <w:szCs w:val="24"/>
+          <w:lang w:val="en-US"/>
+        </w:rPr>
+        <w:t xml:space="preserve">Open </w:t>
+      </w:r>
+      <w:hyperlink r:id="rId27" w:history="1">
+        <w:r>
+          <w:rPr>
+            <w:rStyle w:val="Hyperlink"/>
+            <w:sz w:val="24"/>
+            <w:szCs w:val="24"/>
+            <w:lang w:val="en-US"/>
+          </w:rPr>
+          <w:t>https://demoqa.com/webtables</w:t>
+        </w:r>
+      </w:hyperlink>
+      <w:r>
+        <w:rPr>
+          <w:sz w:val="24"/>
+          <w:szCs w:val="24"/>
+          <w:lang w:val="en-US"/>
+        </w:rPr>
+        <w:t xml:space="preserve"> </w:t>
+      </w:r>
+    </w:p>
+    <w:p>
+      <w:pPr>
+        <w:pStyle w:val="ListParagraph"/>
+        <w:numPr>
+          <w:ilvl w:val="1"/>
+          <w:numId w:val="9"/>
+        </w:numPr>
+        <w:spacing w:line="254" w:lineRule="auto"/>
+        <w:rPr>
+          <w:sz w:val="24"/>
+          <w:szCs w:val="24"/>
+          <w:lang w:val="en-US"/>
+        </w:rPr>
+      </w:pPr>
+      <w:r>
+        <w:rPr>
+          <w:sz w:val="24"/>
+          <w:szCs w:val="24"/>
+          <w:lang w:val="en-US"/>
+        </w:rPr>
+        <w:t>Try to display all header columns</w:t>
+      </w:r>
+    </w:p>
+    <w:p>
+      <w:pPr>
+        <w:pStyle w:val="ListParagraph"/>
+        <w:numPr>
+          <w:ilvl w:val="1"/>
+          <w:numId w:val="9"/>
+        </w:numPr>
+        <w:spacing w:line="254" w:lineRule="auto"/>
+        <w:rPr>
+          <w:sz w:val="24"/>
+          <w:szCs w:val="24"/>
+          <w:lang w:val="en-US"/>
+        </w:rPr>
+      </w:pPr>
+      <w:r>
+        <w:rPr>
+          <w:sz w:val="24"/>
+          <w:szCs w:val="24"/>
+          <w:lang w:val="en-US"/>
+        </w:rPr>
+        <w:t>Click on Add button</w:t>
+      </w:r>
+    </w:p>
+    <w:p>
+      <w:pPr>
+        <w:pStyle w:val="ListParagraph"/>
+        <w:numPr>
+          <w:ilvl w:val="1"/>
+          <w:numId w:val="9"/>
+        </w:numPr>
+        <w:spacing w:line="254" w:lineRule="auto"/>
+        <w:rPr>
+          <w:sz w:val="24"/>
+          <w:szCs w:val="24"/>
+          <w:lang w:val="en-US"/>
+        </w:rPr>
+      </w:pPr>
+      <w:r>
+        <w:rPr>
+          <w:sz w:val="24"/>
+          <w:szCs w:val="24"/>
+          <w:lang w:val="en-US"/>
+        </w:rPr>
+        <w:t>Enter all the data</w:t>
+      </w:r>
+    </w:p>
+    <w:p>
+      <w:pPr>
+        <w:pStyle w:val="ListParagraph"/>
+        <w:numPr>
+          <w:ilvl w:val="1"/>
+          <w:numId w:val="9"/>
+        </w:numPr>
+        <w:spacing w:line="254" w:lineRule="auto"/>
+        <w:rPr>
+          <w:sz w:val="24"/>
+          <w:szCs w:val="24"/>
+          <w:lang w:val="en-US"/>
+        </w:rPr>
+      </w:pPr>
+      <w:r>
+        <w:rPr>
+          <w:sz w:val="24"/>
+          <w:szCs w:val="24"/>
+          <w:lang w:val="en-US"/>
+        </w:rPr>
+        <w:t>Search the first name in First Name column</w:t>
+      </w:r>
+    </w:p>
+    <w:p>
+      <w:pPr>
+        <w:pStyle w:val="ListParagraph"/>
+        <w:numPr>
+          <w:ilvl w:val="1"/>
+          <w:numId w:val="9"/>
+        </w:numPr>
+        <w:spacing w:line="254" w:lineRule="auto"/>
+        <w:rPr>
+          <w:sz w:val="24"/>
+          <w:szCs w:val="24"/>
+          <w:lang w:val="en-US"/>
+        </w:rPr>
+      </w:pPr>
+      <w:r>
+        <w:rPr>
+          <w:sz w:val="24"/>
+          <w:szCs w:val="24"/>
+          <w:lang w:val="en-US"/>
+        </w:rPr>
+        <w:t>Click on delete button in the same row (Don’t copy the xpath of delete button from last row)</w:t>
+      </w:r>
+    </w:p>
+    <w:p>
+      <w:pPr>
+        <w:pStyle w:val="ListParagraph"/>
+        <w:numPr>
+          <w:ilvl w:val="0"/>
+          <w:numId w:val="9"/>
+        </w:numPr>
+        <w:spacing w:line="254" w:lineRule="auto"/>
+        <w:rPr>
+          <w:sz w:val="24"/>
+          <w:szCs w:val="24"/>
+          <w:lang w:val="en-US"/>
+        </w:rPr>
+      </w:pPr>
+      <w:r>
+        <w:rPr>
+          <w:sz w:val="24"/>
+          <w:szCs w:val="24"/>
+          <w:lang w:val="en-US"/>
+        </w:rPr>
+        <w:t xml:space="preserve">Open </w:t>
+      </w:r>
+      <w:hyperlink r:id="rId28" w:history="1">
+        <w:r>
+          <w:rPr>
+            <w:rStyle w:val="Hyperlink"/>
+            <w:sz w:val="24"/>
+            <w:szCs w:val="24"/>
+            <w:lang w:val="en-US"/>
+          </w:rPr>
+          <w:t>https://www.iplt20.com/points-table/men/2024</w:t>
+        </w:r>
+      </w:hyperlink>
+      <w:r>
+        <w:rPr>
+          <w:sz w:val="24"/>
+          <w:szCs w:val="24"/>
+          <w:lang w:val="en-US"/>
+        </w:rPr>
+        <w:t xml:space="preserve"> </w:t>
+      </w:r>
+    </w:p>
+    <w:p>
+      <w:pPr>
+        <w:pStyle w:val="ListParagraph"/>
+        <w:numPr>
+          <w:ilvl w:val="1"/>
+          <w:numId w:val="9"/>
+        </w:numPr>
+        <w:spacing w:line="254" w:lineRule="auto"/>
+        <w:rPr>
+          <w:sz w:val="24"/>
+          <w:szCs w:val="24"/>
+          <w:lang w:val="en-US"/>
+        </w:rPr>
+      </w:pPr>
+      <w:r>
+        <w:rPr>
+          <w:sz w:val="24"/>
+          <w:szCs w:val="24"/>
+          <w:lang w:val="en-US"/>
+        </w:rPr>
+        <w:t>Display list of all the Teams</w:t>
+      </w:r>
+    </w:p>
+    <w:p>
+      <w:pPr>
+        <w:pStyle w:val="ListParagraph"/>
+        <w:numPr>
+          <w:ilvl w:val="1"/>
+          <w:numId w:val="9"/>
+        </w:numPr>
+        <w:spacing w:line="254" w:lineRule="auto"/>
+        <w:rPr>
+          <w:sz w:val="24"/>
+          <w:szCs w:val="24"/>
+          <w:lang w:val="en-US"/>
+        </w:rPr>
+      </w:pPr>
+      <w:r>
+        <w:rPr>
+          <w:sz w:val="24"/>
+          <w:szCs w:val="24"/>
+          <w:lang w:val="en-US"/>
+        </w:rPr>
+        <w:t>Display all result of each team about N W L</w:t>
+      </w:r>
+    </w:p>
+    <w:p>
+      <w:pPr>
+        <w:pStyle w:val="ListParagraph"/>
+        <w:ind w:left="1080"/>
+        <w:rPr>
+          <w:sz w:val="24"/>
+          <w:szCs w:val="24"/>
+          <w:lang w:val="en-US"/>
+        </w:rPr>
+      </w:pPr>
+      <w:r>
+        <w:rPr>
+          <w:sz w:val="24"/>
+          <w:szCs w:val="24"/>
+          <w:lang w:val="en-US"/>
+        </w:rPr>
+        <w:t>Display count of N, W &amp; L</w:t>
+      </w:r>
+      <w:r>
+        <w:rPr>
+          <w:sz w:val="24"/>
+          <w:szCs w:val="24"/>
+          <w:lang w:val="en-US"/>
+        </w:rPr>
+        <w:br/>
+      </w:r>
       <w:bookmarkStart w:id="0" w:name="_GoBack"/>
       <w:bookmarkEnd w:id="0"/>
+      <w:r>
+        <w:rPr>
+          <w:sz w:val="24"/>
+          <w:szCs w:val="24"/>
+          <w:lang w:val="en-US"/>
+        </w:rPr>
+        <w:t>Display the result as follow</w:t>
+      </w:r>
+      <w:r>
+        <w:rPr>
+          <w:sz w:val="24"/>
+          <w:szCs w:val="24"/>
+          <w:lang w:val="en-US"/>
+        </w:rPr>
+        <w:br/>
+        <w:t>KKR</w:t>
+      </w:r>
+      <w:r>
+        <w:rPr>
+          <w:sz w:val="24"/>
+          <w:szCs w:val="24"/>
+          <w:lang w:val="en-US"/>
+        </w:rPr>
+        <w:tab/>
+        <w:t>NNWWW</w:t>
+      </w:r>
+      <w:r>
+        <w:rPr>
+          <w:sz w:val="24"/>
+          <w:szCs w:val="24"/>
+          <w:lang w:val="en-US"/>
+        </w:rPr>
+        <w:tab/>
+        <w:t>N-2, W-3, L-0</w:t>
+      </w:r>
+    </w:p>
+    <w:p>
+      <w:pPr>
+        <w:pStyle w:val="ListParagraph"/>
+        <w:numPr>
+          <w:ilvl w:val="0"/>
+          <w:numId w:val="9"/>
+        </w:numPr>
+        <w:spacing w:line="256" w:lineRule="auto"/>
+        <w:rPr>
+          <w:sz w:val="24"/>
+          <w:szCs w:val="24"/>
+          <w:lang w:val="en-US"/>
+        </w:rPr>
+      </w:pPr>
     </w:p>
     <w:p>
       <w:pPr>

</xml_diff>

<commit_message>
Date: 06 Dec 2025
</commit_message>
<xml_diff>
--- a/Assignments.docx
+++ b/Assignments.docx
@@ -5301,59 +5301,358 @@
           <w:lang w:val="en-US"/>
         </w:rPr>
         <w:br/>
-      </w:r>
+        <w:t>Display the result as follow</w:t>
+      </w:r>
+      <w:r>
+        <w:rPr>
+          <w:sz w:val="24"/>
+          <w:szCs w:val="24"/>
+          <w:lang w:val="en-US"/>
+        </w:rPr>
+        <w:br/>
+        <w:t>KKR</w:t>
+      </w:r>
+      <w:r>
+        <w:rPr>
+          <w:sz w:val="24"/>
+          <w:szCs w:val="24"/>
+          <w:lang w:val="en-US"/>
+        </w:rPr>
+        <w:tab/>
+        <w:t>NNWWW</w:t>
+      </w:r>
+      <w:r>
+        <w:rPr>
+          <w:sz w:val="24"/>
+          <w:szCs w:val="24"/>
+          <w:lang w:val="en-US"/>
+        </w:rPr>
+        <w:tab/>
+        <w:t>N-2, W-3, L-0</w:t>
+      </w:r>
+    </w:p>
+    <w:p>
+      <w:pPr>
+        <w:pStyle w:val="ListParagraph"/>
+        <w:numPr>
+          <w:ilvl w:val="0"/>
+          <w:numId w:val="9"/>
+        </w:numPr>
+        <w:spacing w:line="254" w:lineRule="auto"/>
+        <w:rPr>
+          <w:sz w:val="24"/>
+          <w:szCs w:val="24"/>
+          <w:lang w:val="en-US"/>
+        </w:rPr>
+      </w:pPr>
+      <w:r>
+        <w:rPr>
+          <w:sz w:val="24"/>
+          <w:szCs w:val="24"/>
+          <w:lang w:val="en-US"/>
+        </w:rPr>
+        <w:t xml:space="preserve">Open </w:t>
+      </w:r>
+      <w:hyperlink r:id="rId29" w:history="1">
+        <w:r>
+          <w:rPr>
+            <w:rStyle w:val="Hyperlink"/>
+            <w:sz w:val="24"/>
+            <w:szCs w:val="24"/>
+            <w:lang w:val="en-US"/>
+          </w:rPr>
+          <w:t>https://omayo.blogspot.com/</w:t>
+        </w:r>
+      </w:hyperlink>
+    </w:p>
+    <w:p>
+      <w:pPr>
+        <w:pStyle w:val="ListParagraph"/>
+        <w:numPr>
+          <w:ilvl w:val="1"/>
+          <w:numId w:val="9"/>
+        </w:numPr>
+        <w:spacing w:line="254" w:lineRule="auto"/>
+        <w:rPr>
+          <w:sz w:val="24"/>
+          <w:szCs w:val="24"/>
+          <w:lang w:val="en-US"/>
+        </w:rPr>
+      </w:pPr>
+      <w:r>
+        <w:rPr>
+          <w:sz w:val="24"/>
+          <w:szCs w:val="24"/>
+          <w:lang w:val="en-US"/>
+        </w:rPr>
+        <w:t xml:space="preserve">Click on </w:t>
+      </w:r>
+      <w:proofErr w:type="spellStart"/>
+      <w:r>
+        <w:rPr>
+          <w:sz w:val="24"/>
+          <w:szCs w:val="24"/>
+          <w:lang w:val="en-US"/>
+        </w:rPr>
+        <w:t>ClickToGetAlert</w:t>
+      </w:r>
+      <w:proofErr w:type="spellEnd"/>
+      <w:r>
+        <w:rPr>
+          <w:sz w:val="24"/>
+          <w:szCs w:val="24"/>
+          <w:lang w:val="en-US"/>
+        </w:rPr>
+        <w:t xml:space="preserve"> button</w:t>
+      </w:r>
+    </w:p>
+    <w:p>
+      <w:pPr>
+        <w:pStyle w:val="ListParagraph"/>
+        <w:numPr>
+          <w:ilvl w:val="1"/>
+          <w:numId w:val="9"/>
+        </w:numPr>
+        <w:spacing w:line="254" w:lineRule="auto"/>
+        <w:rPr>
+          <w:sz w:val="24"/>
+          <w:szCs w:val="24"/>
+          <w:lang w:val="en-US"/>
+        </w:rPr>
+      </w:pPr>
+      <w:r>
+        <w:rPr>
+          <w:sz w:val="24"/>
+          <w:szCs w:val="24"/>
+          <w:lang w:val="en-US"/>
+        </w:rPr>
+        <w:t>Display the text on alert</w:t>
+      </w:r>
+    </w:p>
+    <w:p>
+      <w:pPr>
+        <w:pStyle w:val="ListParagraph"/>
+        <w:numPr>
+          <w:ilvl w:val="1"/>
+          <w:numId w:val="9"/>
+        </w:numPr>
+        <w:spacing w:line="254" w:lineRule="auto"/>
+        <w:rPr>
+          <w:sz w:val="24"/>
+          <w:szCs w:val="24"/>
+          <w:lang w:val="en-US"/>
+        </w:rPr>
+      </w:pPr>
+      <w:r>
+        <w:rPr>
+          <w:sz w:val="24"/>
+          <w:szCs w:val="24"/>
+          <w:lang w:val="en-US"/>
+        </w:rPr>
+        <w:t>Click on Ok button</w:t>
+      </w:r>
+    </w:p>
+    <w:p>
+      <w:pPr>
+        <w:pStyle w:val="ListParagraph"/>
+        <w:numPr>
+          <w:ilvl w:val="1"/>
+          <w:numId w:val="9"/>
+        </w:numPr>
+        <w:spacing w:line="254" w:lineRule="auto"/>
+        <w:rPr>
+          <w:sz w:val="24"/>
+          <w:szCs w:val="24"/>
+          <w:lang w:val="en-US"/>
+        </w:rPr>
+      </w:pPr>
+      <w:r>
+        <w:rPr>
+          <w:sz w:val="24"/>
+          <w:szCs w:val="24"/>
+          <w:lang w:val="en-US"/>
+        </w:rPr>
+        <w:t xml:space="preserve">Click on </w:t>
+      </w:r>
+      <w:proofErr w:type="spellStart"/>
+      <w:r>
+        <w:rPr>
+          <w:sz w:val="24"/>
+          <w:szCs w:val="24"/>
+          <w:lang w:val="en-US"/>
+        </w:rPr>
+        <w:t>GetPrompt</w:t>
+      </w:r>
+      <w:proofErr w:type="spellEnd"/>
+      <w:r>
+        <w:rPr>
+          <w:sz w:val="24"/>
+          <w:szCs w:val="24"/>
+          <w:lang w:val="en-US"/>
+        </w:rPr>
+        <w:t xml:space="preserve"> Button</w:t>
+      </w:r>
+    </w:p>
+    <w:p>
+      <w:pPr>
+        <w:pStyle w:val="ListParagraph"/>
+        <w:numPr>
+          <w:ilvl w:val="1"/>
+          <w:numId w:val="9"/>
+        </w:numPr>
+        <w:spacing w:line="254" w:lineRule="auto"/>
+        <w:rPr>
+          <w:sz w:val="24"/>
+          <w:szCs w:val="24"/>
+          <w:lang w:val="en-US"/>
+        </w:rPr>
+      </w:pPr>
+      <w:r>
+        <w:rPr>
+          <w:sz w:val="24"/>
+          <w:szCs w:val="24"/>
+          <w:lang w:val="en-US"/>
+        </w:rPr>
+        <w:t xml:space="preserve">Enter your name </w:t>
+      </w:r>
+    </w:p>
+    <w:p>
+      <w:pPr>
+        <w:pStyle w:val="ListParagraph"/>
+        <w:numPr>
+          <w:ilvl w:val="1"/>
+          <w:numId w:val="9"/>
+        </w:numPr>
+        <w:spacing w:line="254" w:lineRule="auto"/>
+        <w:rPr>
+          <w:sz w:val="24"/>
+          <w:szCs w:val="24"/>
+          <w:lang w:val="en-US"/>
+        </w:rPr>
+      </w:pPr>
+      <w:r>
+        <w:rPr>
+          <w:sz w:val="24"/>
+          <w:szCs w:val="24"/>
+          <w:lang w:val="en-US"/>
+        </w:rPr>
+        <w:t>Click on Ok button</w:t>
+      </w:r>
+    </w:p>
+    <w:p>
+      <w:pPr>
+        <w:pStyle w:val="ListParagraph"/>
+        <w:numPr>
+          <w:ilvl w:val="1"/>
+          <w:numId w:val="9"/>
+        </w:numPr>
+        <w:spacing w:line="254" w:lineRule="auto"/>
+        <w:rPr>
+          <w:sz w:val="24"/>
+          <w:szCs w:val="24"/>
+          <w:lang w:val="en-US"/>
+        </w:rPr>
+      </w:pPr>
+      <w:r>
+        <w:rPr>
+          <w:sz w:val="24"/>
+          <w:szCs w:val="24"/>
+          <w:lang w:val="en-US"/>
+        </w:rPr>
+        <w:t xml:space="preserve">Click on </w:t>
+      </w:r>
+      <w:proofErr w:type="spellStart"/>
+      <w:r>
+        <w:rPr>
+          <w:sz w:val="24"/>
+          <w:szCs w:val="24"/>
+          <w:lang w:val="en-US"/>
+        </w:rPr>
+        <w:t>GetConfirmation</w:t>
+      </w:r>
+      <w:proofErr w:type="spellEnd"/>
+      <w:r>
+        <w:rPr>
+          <w:sz w:val="24"/>
+          <w:szCs w:val="24"/>
+          <w:lang w:val="en-US"/>
+        </w:rPr>
+        <w:t xml:space="preserve"> Button </w:t>
+      </w:r>
+    </w:p>
+    <w:p>
+      <w:pPr>
+        <w:pStyle w:val="ListParagraph"/>
+        <w:numPr>
+          <w:ilvl w:val="1"/>
+          <w:numId w:val="9"/>
+        </w:numPr>
+        <w:rPr>
+          <w:sz w:val="24"/>
+          <w:szCs w:val="24"/>
+          <w:lang w:val="en-US"/>
+        </w:rPr>
+      </w:pPr>
+      <w:r>
+        <w:rPr>
+          <w:sz w:val="24"/>
+          <w:szCs w:val="24"/>
+          <w:lang w:val="en-US"/>
+        </w:rPr>
+        <w:lastRenderedPageBreak/>
+        <w:t>Click on Cancel button</w:t>
+      </w:r>
+    </w:p>
+    <w:p>
+      <w:pPr>
+        <w:pStyle w:val="ListParagraph"/>
+        <w:numPr>
+          <w:ilvl w:val="0"/>
+          <w:numId w:val="9"/>
+        </w:numPr>
+        <w:spacing w:line="254" w:lineRule="auto"/>
+        <w:rPr>
+          <w:sz w:val="24"/>
+          <w:szCs w:val="24"/>
+          <w:lang w:val="en-US"/>
+        </w:rPr>
+      </w:pPr>
+      <w:r>
+        <w:rPr>
+          <w:sz w:val="24"/>
+          <w:szCs w:val="24"/>
+          <w:lang w:val="en-US"/>
+        </w:rPr>
+        <w:t xml:space="preserve">Complete the registration process on </w:t>
+      </w:r>
+      <w:hyperlink r:id="rId30" w:history="1">
+        <w:r>
+          <w:rPr>
+            <w:rStyle w:val="Hyperlink"/>
+            <w:sz w:val="24"/>
+            <w:szCs w:val="24"/>
+            <w:lang w:val="en-US"/>
+          </w:rPr>
+          <w:t>https://demoqa.com/automation-practice-form</w:t>
+        </w:r>
+      </w:hyperlink>
+    </w:p>
+    <w:p>
+      <w:pPr>
+        <w:pStyle w:val="ListParagraph"/>
+        <w:numPr>
+          <w:ilvl w:val="0"/>
+          <w:numId w:val="9"/>
+        </w:numPr>
+        <w:spacing w:line="256" w:lineRule="auto"/>
+        <w:rPr>
+          <w:sz w:val="24"/>
+          <w:szCs w:val="24"/>
+          <w:lang w:val="en-US"/>
+        </w:rPr>
+      </w:pPr>
       <w:bookmarkStart w:id="0" w:name="_GoBack"/>
       <w:bookmarkEnd w:id="0"/>
-      <w:r>
-        <w:rPr>
-          <w:sz w:val="24"/>
-          <w:szCs w:val="24"/>
-          <w:lang w:val="en-US"/>
-        </w:rPr>
-        <w:t>Display the result as follow</w:t>
-      </w:r>
-      <w:r>
-        <w:rPr>
-          <w:sz w:val="24"/>
-          <w:szCs w:val="24"/>
-          <w:lang w:val="en-US"/>
-        </w:rPr>
-        <w:br/>
-        <w:t>KKR</w:t>
-      </w:r>
-      <w:r>
-        <w:rPr>
-          <w:sz w:val="24"/>
-          <w:szCs w:val="24"/>
-          <w:lang w:val="en-US"/>
-        </w:rPr>
-        <w:tab/>
-        <w:t>NNWWW</w:t>
-      </w:r>
-      <w:r>
-        <w:rPr>
-          <w:sz w:val="24"/>
-          <w:szCs w:val="24"/>
-          <w:lang w:val="en-US"/>
-        </w:rPr>
-        <w:tab/>
-        <w:t>N-2, W-3, L-0</w:t>
-      </w:r>
-    </w:p>
-    <w:p>
-      <w:pPr>
-        <w:pStyle w:val="ListParagraph"/>
-        <w:numPr>
-          <w:ilvl w:val="0"/>
-          <w:numId w:val="9"/>
-        </w:numPr>
-        <w:spacing w:line="256" w:lineRule="auto"/>
-        <w:rPr>
-          <w:sz w:val="24"/>
-          <w:szCs w:val="24"/>
-          <w:lang w:val="en-US"/>
-        </w:rPr>
-      </w:pPr>
     </w:p>
     <w:p>
       <w:pPr>

</xml_diff>

<commit_message>
Date: 08 Dec 2025
</commit_message>
<xml_diff>
--- a/Assignments.docx
+++ b/Assignments.docx
@@ -5636,6 +5636,182 @@
           <w:t>https://demoqa.com/automation-practice-form</w:t>
         </w:r>
       </w:hyperlink>
+    </w:p>
+    <w:p>
+      <w:pPr>
+        <w:pStyle w:val="ListParagraph"/>
+        <w:numPr>
+          <w:ilvl w:val="0"/>
+          <w:numId w:val="9"/>
+        </w:numPr>
+        <w:spacing w:line="254" w:lineRule="auto"/>
+        <w:rPr>
+          <w:b/>
+          <w:bCs/>
+          <w:sz w:val="24"/>
+          <w:szCs w:val="24"/>
+          <w:lang w:val="en-US"/>
+        </w:rPr>
+      </w:pPr>
+      <w:r>
+        <w:rPr>
+          <w:b/>
+          <w:bCs/>
+          <w:sz w:val="24"/>
+          <w:szCs w:val="24"/>
+          <w:lang w:val="en-US"/>
+        </w:rPr>
+        <w:t xml:space="preserve">Open </w:t>
+      </w:r>
+      <w:hyperlink r:id="rId31" w:history="1">
+        <w:r>
+          <w:rPr>
+            <w:rStyle w:val="Hyperlink"/>
+            <w:b/>
+            <w:bCs/>
+            <w:sz w:val="24"/>
+            <w:szCs w:val="24"/>
+            <w:lang w:val="en-US"/>
+          </w:rPr>
+          <w:t>https://sampleapp.tricentis.com/101/index.php</w:t>
+        </w:r>
+      </w:hyperlink>
+    </w:p>
+    <w:p>
+      <w:pPr>
+        <w:pStyle w:val="ListParagraph"/>
+        <w:numPr>
+          <w:ilvl w:val="1"/>
+          <w:numId w:val="9"/>
+        </w:numPr>
+        <w:spacing w:line="254" w:lineRule="auto"/>
+        <w:rPr>
+          <w:b/>
+          <w:bCs/>
+          <w:sz w:val="24"/>
+          <w:szCs w:val="24"/>
+          <w:lang w:val="en-US"/>
+        </w:rPr>
+      </w:pPr>
+      <w:r>
+        <w:rPr>
+          <w:b/>
+          <w:bCs/>
+          <w:sz w:val="24"/>
+          <w:szCs w:val="24"/>
+          <w:lang w:val="en-US"/>
+        </w:rPr>
+        <w:t>Click on Automobile</w:t>
+      </w:r>
+    </w:p>
+    <w:p>
+      <w:pPr>
+        <w:pStyle w:val="ListParagraph"/>
+        <w:numPr>
+          <w:ilvl w:val="1"/>
+          <w:numId w:val="9"/>
+        </w:numPr>
+        <w:spacing w:line="254" w:lineRule="auto"/>
+        <w:rPr>
+          <w:b/>
+          <w:bCs/>
+          <w:sz w:val="24"/>
+          <w:szCs w:val="24"/>
+          <w:lang w:val="en-US"/>
+        </w:rPr>
+      </w:pPr>
+      <w:r>
+        <w:rPr>
+          <w:b/>
+          <w:bCs/>
+          <w:sz w:val="24"/>
+          <w:szCs w:val="24"/>
+          <w:lang w:val="en-US"/>
+        </w:rPr>
+        <w:t>Click on Enter Insurant Data</w:t>
+      </w:r>
+    </w:p>
+    <w:p>
+      <w:pPr>
+        <w:pStyle w:val="ListParagraph"/>
+        <w:numPr>
+          <w:ilvl w:val="1"/>
+          <w:numId w:val="9"/>
+        </w:numPr>
+        <w:spacing w:line="254" w:lineRule="auto"/>
+        <w:rPr>
+          <w:b/>
+          <w:bCs/>
+          <w:sz w:val="24"/>
+          <w:szCs w:val="24"/>
+          <w:lang w:val="en-US"/>
+        </w:rPr>
+      </w:pPr>
+      <w:r>
+        <w:rPr>
+          <w:b/>
+          <w:bCs/>
+          <w:sz w:val="24"/>
+          <w:szCs w:val="24"/>
+          <w:lang w:val="en-US"/>
+        </w:rPr>
+        <w:t>Upload your picture</w:t>
+      </w:r>
+    </w:p>
+    <w:p>
+      <w:pPr>
+        <w:pStyle w:val="ListParagraph"/>
+        <w:numPr>
+          <w:ilvl w:val="0"/>
+          <w:numId w:val="9"/>
+        </w:numPr>
+        <w:rPr>
+          <w:sz w:val="24"/>
+          <w:szCs w:val="24"/>
+          <w:lang w:val="en-US"/>
+        </w:rPr>
+      </w:pPr>
+      <w:r>
+        <w:rPr>
+          <w:sz w:val="24"/>
+          <w:szCs w:val="24"/>
+          <w:lang w:val="en-US"/>
+        </w:rPr>
+        <w:t xml:space="preserve">Open </w:t>
+      </w:r>
+      <w:hyperlink r:id="rId32" w:history="1">
+        <w:r>
+          <w:rPr>
+            <w:rStyle w:val="Hyperlink"/>
+            <w:sz w:val="24"/>
+            <w:szCs w:val="24"/>
+            <w:lang w:val="en-US"/>
+          </w:rPr>
+          <w:t>https://istqb.in/</w:t>
+        </w:r>
+      </w:hyperlink>
+    </w:p>
+    <w:p>
+      <w:pPr>
+        <w:pStyle w:val="ListParagraph"/>
+        <w:numPr>
+          <w:ilvl w:val="1"/>
+          <w:numId w:val="9"/>
+        </w:numPr>
+        <w:rPr>
+          <w:sz w:val="24"/>
+          <w:szCs w:val="22"/>
+          <w:lang w:val="en-US"/>
+        </w:rPr>
+      </w:pPr>
+      <w:r>
+        <w:rPr>
+          <w:sz w:val="24"/>
+          <w:szCs w:val="24"/>
+          <w:lang w:val="en-US"/>
+        </w:rPr>
+        <w:t>Display all 8 menus</w:t>
+      </w:r>
     </w:p>
     <w:p>
       <w:pPr>

</xml_diff>

<commit_message>
Date: 13 Dec 2025
</commit_message>
<xml_diff>
--- a/Assignments.docx
+++ b/Assignments.docx
@@ -5827,17 +5827,543 @@
           <w:lang w:val="en-US"/>
         </w:rPr>
       </w:pPr>
+    </w:p>
+    <w:p>
+      <w:pPr>
+        <w:rPr>
+          <w:sz w:val="24"/>
+          <w:szCs w:val="24"/>
+          <w:lang w:val="en-US"/>
+        </w:rPr>
+      </w:pPr>
+      <w:r>
+        <w:rPr>
+          <w:sz w:val="24"/>
+          <w:szCs w:val="24"/>
+          <w:lang w:val="en-US"/>
+        </w:rPr>
+        <w:br w:type="page"/>
+      </w:r>
+    </w:p>
+    <w:p>
+      <w:pPr>
+        <w:rPr>
+          <w:b/>
+          <w:bCs/>
+          <w:sz w:val="26"/>
+          <w:szCs w:val="22"/>
+          <w:lang w:val="en-US"/>
+        </w:rPr>
+      </w:pPr>
+      <w:r>
+        <w:rPr>
+          <w:b/>
+          <w:bCs/>
+          <w:sz w:val="26"/>
+          <w:szCs w:val="22"/>
+          <w:lang w:val="en-US"/>
+        </w:rPr>
+        <w:lastRenderedPageBreak/>
+        <w:t>TestNG Assignments</w:t>
+      </w:r>
+    </w:p>
+    <w:p>
+      <w:pPr>
+        <w:pStyle w:val="ListParagraph"/>
+        <w:numPr>
+          <w:ilvl w:val="3"/>
+          <w:numId w:val="14"/>
+        </w:numPr>
+        <w:spacing w:line="254" w:lineRule="auto"/>
+        <w:ind w:left="1276" w:hanging="709"/>
+        <w:rPr>
+          <w:b/>
+          <w:bCs/>
+          <w:sz w:val="24"/>
+          <w:szCs w:val="24"/>
+          <w:lang w:val="en-US"/>
+        </w:rPr>
+      </w:pPr>
+      <w:r>
+        <w:rPr>
+          <w:b/>
+          <w:bCs/>
+          <w:sz w:val="24"/>
+          <w:szCs w:val="24"/>
+          <w:lang w:val="en-US"/>
+        </w:rPr>
+        <w:t>Flipkart Assignment</w:t>
+      </w:r>
+    </w:p>
+    <w:p>
+      <w:pPr>
+        <w:pStyle w:val="ListParagraph"/>
+        <w:numPr>
+          <w:ilvl w:val="4"/>
+          <w:numId w:val="14"/>
+        </w:numPr>
+        <w:spacing w:line="254" w:lineRule="auto"/>
+        <w:ind w:left="1276"/>
+        <w:rPr>
+          <w:sz w:val="24"/>
+          <w:szCs w:val="24"/>
+          <w:lang w:val="en-US"/>
+        </w:rPr>
+      </w:pPr>
+      <w:r>
+        <w:rPr>
+          <w:sz w:val="24"/>
+          <w:szCs w:val="24"/>
+          <w:lang w:val="en-US"/>
+        </w:rPr>
+        <w:t xml:space="preserve">Launch </w:t>
+      </w:r>
+      <w:hyperlink r:id="rId33" w:history="1">
+        <w:r>
+          <w:rPr>
+            <w:rStyle w:val="Hyperlink"/>
+            <w:sz w:val="24"/>
+            <w:szCs w:val="24"/>
+            <w:lang w:val="en-US"/>
+          </w:rPr>
+          <w:t>https://www.flipkart.com/</w:t>
+        </w:r>
+      </w:hyperlink>
+    </w:p>
+    <w:p>
+      <w:pPr>
+        <w:pStyle w:val="ListParagraph"/>
+        <w:numPr>
+          <w:ilvl w:val="4"/>
+          <w:numId w:val="14"/>
+        </w:numPr>
+        <w:spacing w:line="254" w:lineRule="auto"/>
+        <w:ind w:left="1276"/>
+        <w:rPr>
+          <w:sz w:val="24"/>
+          <w:szCs w:val="24"/>
+          <w:lang w:val="en-US"/>
+        </w:rPr>
+      </w:pPr>
+      <w:r>
+        <w:rPr>
+          <w:sz w:val="24"/>
+          <w:szCs w:val="24"/>
+          <w:lang w:val="en-US"/>
+        </w:rPr>
+        <w:t>Print the title</w:t>
+      </w:r>
+    </w:p>
+    <w:p>
+      <w:pPr>
+        <w:pStyle w:val="ListParagraph"/>
+        <w:numPr>
+          <w:ilvl w:val="4"/>
+          <w:numId w:val="14"/>
+        </w:numPr>
+        <w:spacing w:line="254" w:lineRule="auto"/>
+        <w:ind w:left="1276"/>
+        <w:rPr>
+          <w:b/>
+          <w:bCs/>
+          <w:sz w:val="24"/>
+          <w:szCs w:val="24"/>
+          <w:lang w:val="en-US"/>
+        </w:rPr>
+      </w:pPr>
+      <w:r>
+        <w:rPr>
+          <w:b/>
+          <w:bCs/>
+          <w:sz w:val="24"/>
+          <w:szCs w:val="24"/>
+          <w:lang w:val="en-US"/>
+        </w:rPr>
+        <w:t>Click on Mobiles &amp; Tablet</w:t>
+      </w:r>
+    </w:p>
+    <w:p>
+      <w:pPr>
+        <w:pStyle w:val="ListParagraph"/>
+        <w:numPr>
+          <w:ilvl w:val="4"/>
+          <w:numId w:val="14"/>
+        </w:numPr>
+        <w:spacing w:line="254" w:lineRule="auto"/>
+        <w:ind w:left="1276"/>
+        <w:rPr>
+          <w:sz w:val="24"/>
+          <w:szCs w:val="24"/>
+          <w:lang w:val="en-US"/>
+        </w:rPr>
+      </w:pPr>
+      <w:r>
+        <w:rPr>
+          <w:sz w:val="24"/>
+          <w:szCs w:val="24"/>
+          <w:lang w:val="en-US"/>
+        </w:rPr>
+        <w:t>Print the title</w:t>
+      </w:r>
+      <w:r>
+        <w:rPr>
+          <w:sz w:val="24"/>
+          <w:szCs w:val="24"/>
+          <w:lang w:val="en-US"/>
+        </w:rPr>
+        <w:br/>
+      </w:r>
+    </w:p>
+    <w:p>
+      <w:pPr>
+        <w:pStyle w:val="ListParagraph"/>
+        <w:numPr>
+          <w:ilvl w:val="4"/>
+          <w:numId w:val="14"/>
+        </w:numPr>
+        <w:spacing w:line="254" w:lineRule="auto"/>
+        <w:ind w:left="1276"/>
+        <w:rPr>
+          <w:sz w:val="24"/>
+          <w:szCs w:val="24"/>
+          <w:lang w:val="en-US"/>
+        </w:rPr>
+      </w:pPr>
+      <w:r>
+        <w:rPr>
+          <w:sz w:val="24"/>
+          <w:szCs w:val="24"/>
+          <w:lang w:val="en-US"/>
+        </w:rPr>
+        <w:t xml:space="preserve">Launch </w:t>
+      </w:r>
+      <w:hyperlink r:id="rId34" w:history="1">
+        <w:r>
+          <w:rPr>
+            <w:rStyle w:val="Hyperlink"/>
+            <w:sz w:val="24"/>
+            <w:szCs w:val="24"/>
+            <w:lang w:val="en-US"/>
+          </w:rPr>
+          <w:t>https://www.flipkart.com/</w:t>
+        </w:r>
+      </w:hyperlink>
+    </w:p>
+    <w:p>
+      <w:pPr>
+        <w:pStyle w:val="ListParagraph"/>
+        <w:numPr>
+          <w:ilvl w:val="4"/>
+          <w:numId w:val="14"/>
+        </w:numPr>
+        <w:spacing w:line="254" w:lineRule="auto"/>
+        <w:ind w:left="1276"/>
+        <w:rPr>
+          <w:sz w:val="24"/>
+          <w:szCs w:val="24"/>
+          <w:lang w:val="en-US"/>
+        </w:rPr>
+      </w:pPr>
+      <w:r>
+        <w:rPr>
+          <w:sz w:val="24"/>
+          <w:szCs w:val="24"/>
+          <w:lang w:val="en-US"/>
+        </w:rPr>
+        <w:t>Print the title</w:t>
+      </w:r>
+    </w:p>
+    <w:p>
+      <w:pPr>
+        <w:pStyle w:val="ListParagraph"/>
+        <w:numPr>
+          <w:ilvl w:val="4"/>
+          <w:numId w:val="14"/>
+        </w:numPr>
+        <w:spacing w:line="254" w:lineRule="auto"/>
+        <w:ind w:left="1276"/>
+        <w:rPr>
+          <w:b/>
+          <w:bCs/>
+          <w:sz w:val="24"/>
+          <w:szCs w:val="24"/>
+          <w:lang w:val="en-US"/>
+        </w:rPr>
+      </w:pPr>
+      <w:r>
+        <w:rPr>
+          <w:b/>
+          <w:bCs/>
+          <w:sz w:val="24"/>
+          <w:szCs w:val="24"/>
+          <w:lang w:val="en-US"/>
+        </w:rPr>
+        <w:t>Click on TV &amp; Appliances</w:t>
+      </w:r>
+    </w:p>
+    <w:p>
+      <w:pPr>
+        <w:pStyle w:val="ListParagraph"/>
+        <w:numPr>
+          <w:ilvl w:val="4"/>
+          <w:numId w:val="14"/>
+        </w:numPr>
+        <w:spacing w:line="254" w:lineRule="auto"/>
+        <w:ind w:left="1276"/>
+        <w:rPr>
+          <w:sz w:val="24"/>
+          <w:szCs w:val="24"/>
+          <w:lang w:val="en-US"/>
+        </w:rPr>
+      </w:pPr>
+      <w:r>
+        <w:rPr>
+          <w:sz w:val="24"/>
+          <w:szCs w:val="24"/>
+          <w:lang w:val="en-US"/>
+        </w:rPr>
+        <w:t>Print the title</w:t>
+      </w:r>
+      <w:r>
+        <w:rPr>
+          <w:sz w:val="24"/>
+          <w:szCs w:val="24"/>
+          <w:lang w:val="en-US"/>
+        </w:rPr>
+        <w:br/>
+      </w:r>
+    </w:p>
+    <w:p>
+      <w:pPr>
+        <w:pStyle w:val="ListParagraph"/>
+        <w:numPr>
+          <w:ilvl w:val="4"/>
+          <w:numId w:val="14"/>
+        </w:numPr>
+        <w:spacing w:line="254" w:lineRule="auto"/>
+        <w:ind w:left="1276"/>
+        <w:rPr>
+          <w:sz w:val="24"/>
+          <w:szCs w:val="24"/>
+          <w:lang w:val="en-US"/>
+        </w:rPr>
+      </w:pPr>
+      <w:r>
+        <w:rPr>
+          <w:sz w:val="24"/>
+          <w:szCs w:val="24"/>
+          <w:lang w:val="en-US"/>
+        </w:rPr>
+        <w:t xml:space="preserve">Launch </w:t>
+      </w:r>
+      <w:hyperlink r:id="rId35" w:history="1">
+        <w:r>
+          <w:rPr>
+            <w:rStyle w:val="Hyperlink"/>
+            <w:sz w:val="24"/>
+            <w:szCs w:val="24"/>
+            <w:lang w:val="en-US"/>
+          </w:rPr>
+          <w:t>https://www.flipkart.com/</w:t>
+        </w:r>
+      </w:hyperlink>
+    </w:p>
+    <w:p>
+      <w:pPr>
+        <w:pStyle w:val="ListParagraph"/>
+        <w:numPr>
+          <w:ilvl w:val="4"/>
+          <w:numId w:val="14"/>
+        </w:numPr>
+        <w:spacing w:line="254" w:lineRule="auto"/>
+        <w:ind w:left="1276"/>
+        <w:rPr>
+          <w:sz w:val="24"/>
+          <w:szCs w:val="24"/>
+          <w:lang w:val="en-US"/>
+        </w:rPr>
+      </w:pPr>
+      <w:r>
+        <w:rPr>
+          <w:sz w:val="24"/>
+          <w:szCs w:val="24"/>
+          <w:lang w:val="en-US"/>
+        </w:rPr>
+        <w:t>Print the title</w:t>
+      </w:r>
+    </w:p>
+    <w:p>
+      <w:pPr>
+        <w:pStyle w:val="ListParagraph"/>
+        <w:numPr>
+          <w:ilvl w:val="4"/>
+          <w:numId w:val="14"/>
+        </w:numPr>
+        <w:spacing w:line="254" w:lineRule="auto"/>
+        <w:ind w:left="1276"/>
+        <w:rPr>
+          <w:b/>
+          <w:bCs/>
+          <w:sz w:val="24"/>
+          <w:szCs w:val="24"/>
+          <w:lang w:val="en-US"/>
+        </w:rPr>
+      </w:pPr>
+      <w:r>
+        <w:rPr>
+          <w:b/>
+          <w:bCs/>
+          <w:sz w:val="24"/>
+          <w:szCs w:val="24"/>
+          <w:lang w:val="en-US"/>
+        </w:rPr>
+        <w:t>Click on Flight Booking</w:t>
+      </w:r>
+    </w:p>
+    <w:p>
+      <w:pPr>
+        <w:pStyle w:val="ListParagraph"/>
+        <w:numPr>
+          <w:ilvl w:val="4"/>
+          <w:numId w:val="14"/>
+        </w:numPr>
+        <w:spacing w:line="254" w:lineRule="auto"/>
+        <w:ind w:left="1276"/>
+        <w:rPr>
+          <w:sz w:val="24"/>
+          <w:szCs w:val="24"/>
+          <w:lang w:val="en-US"/>
+        </w:rPr>
+      </w:pPr>
+      <w:r>
+        <w:rPr>
+          <w:sz w:val="24"/>
+          <w:szCs w:val="24"/>
+          <w:lang w:val="en-US"/>
+        </w:rPr>
+        <w:t>Print the title</w:t>
+      </w:r>
       <w:bookmarkStart w:id="0" w:name="_GoBack"/>
       <w:bookmarkEnd w:id="0"/>
-    </w:p>
-    <w:p>
-      <w:pPr>
-        <w:rPr>
-          <w:sz w:val="24"/>
-          <w:szCs w:val="24"/>
-          <w:lang w:val="en-US"/>
-        </w:rPr>
-      </w:pPr>
+      <w:r>
+        <w:rPr>
+          <w:sz w:val="24"/>
+          <w:szCs w:val="24"/>
+          <w:lang w:val="en-US"/>
+        </w:rPr>
+        <w:br/>
+      </w:r>
+    </w:p>
+    <w:p>
+      <w:pPr>
+        <w:pStyle w:val="ListParagraph"/>
+        <w:numPr>
+          <w:ilvl w:val="4"/>
+          <w:numId w:val="14"/>
+        </w:numPr>
+        <w:spacing w:line="254" w:lineRule="auto"/>
+        <w:ind w:left="1276"/>
+        <w:rPr>
+          <w:sz w:val="24"/>
+          <w:szCs w:val="24"/>
+          <w:lang w:val="en-US"/>
+        </w:rPr>
+      </w:pPr>
+      <w:r>
+        <w:rPr>
+          <w:sz w:val="24"/>
+          <w:szCs w:val="24"/>
+          <w:lang w:val="en-US"/>
+        </w:rPr>
+        <w:t xml:space="preserve">Launch </w:t>
+      </w:r>
+      <w:hyperlink r:id="rId36" w:history="1">
+        <w:r>
+          <w:rPr>
+            <w:rStyle w:val="Hyperlink"/>
+            <w:sz w:val="24"/>
+            <w:szCs w:val="24"/>
+            <w:lang w:val="en-US"/>
+          </w:rPr>
+          <w:t>https://www.flipkart.com/</w:t>
+        </w:r>
+      </w:hyperlink>
+    </w:p>
+    <w:p>
+      <w:pPr>
+        <w:pStyle w:val="ListParagraph"/>
+        <w:numPr>
+          <w:ilvl w:val="4"/>
+          <w:numId w:val="14"/>
+        </w:numPr>
+        <w:spacing w:line="254" w:lineRule="auto"/>
+        <w:ind w:left="1276"/>
+        <w:rPr>
+          <w:sz w:val="24"/>
+          <w:szCs w:val="24"/>
+          <w:lang w:val="en-US"/>
+        </w:rPr>
+      </w:pPr>
+      <w:r>
+        <w:rPr>
+          <w:sz w:val="24"/>
+          <w:szCs w:val="24"/>
+          <w:lang w:val="en-US"/>
+        </w:rPr>
+        <w:t>Print the title</w:t>
+      </w:r>
+    </w:p>
+    <w:p>
+      <w:pPr>
+        <w:pStyle w:val="ListParagraph"/>
+        <w:numPr>
+          <w:ilvl w:val="4"/>
+          <w:numId w:val="14"/>
+        </w:numPr>
+        <w:spacing w:line="254" w:lineRule="auto"/>
+        <w:ind w:left="1276"/>
+        <w:rPr>
+          <w:b/>
+          <w:bCs/>
+          <w:sz w:val="24"/>
+          <w:szCs w:val="24"/>
+          <w:lang w:val="en-US"/>
+        </w:rPr>
+      </w:pPr>
+      <w:r>
+        <w:rPr>
+          <w:b/>
+          <w:bCs/>
+          <w:sz w:val="24"/>
+          <w:szCs w:val="24"/>
+          <w:lang w:val="en-US"/>
+        </w:rPr>
+        <w:t>Click on Grocery</w:t>
+      </w:r>
+    </w:p>
+    <w:p>
+      <w:pPr>
+        <w:pStyle w:val="ListParagraph"/>
+        <w:numPr>
+          <w:ilvl w:val="4"/>
+          <w:numId w:val="14"/>
+        </w:numPr>
+        <w:spacing w:line="254" w:lineRule="auto"/>
+        <w:ind w:left="1276"/>
+        <w:rPr>
+          <w:sz w:val="24"/>
+          <w:szCs w:val="24"/>
+          <w:lang w:val="en-US"/>
+        </w:rPr>
+      </w:pPr>
+      <w:r>
+        <w:rPr>
+          <w:sz w:val="24"/>
+          <w:szCs w:val="24"/>
+          <w:lang w:val="en-US"/>
+        </w:rPr>
+        <w:t>Print the title</w:t>
+      </w:r>
     </w:p>
     <w:sectPr>
       <w:pgSz w:w="11906" w:h="16838"/>
@@ -6294,6 +6820,92 @@
     </w:lvl>
   </w:abstractNum>
   <w:abstractNum w:abstractNumId="5">
+    <w:nsid w:val="465166F1"/>
+    <w:multiLevelType w:val="hybridMultilevel"/>
+    <w:tmpl w:val="B9547906"/>
+    <w:lvl w:ilvl="0" w:tplc="4009000F">
+      <w:start w:val="1"/>
+      <w:numFmt w:val="decimal"/>
+      <w:lvlText w:val="%1."/>
+      <w:lvlJc w:val="left"/>
+      <w:pPr>
+        <w:ind w:left="720" w:hanging="360"/>
+      </w:pPr>
+    </w:lvl>
+    <w:lvl w:ilvl="1" w:tplc="40090019">
+      <w:start w:val="1"/>
+      <w:numFmt w:val="lowerLetter"/>
+      <w:lvlText w:val="%2."/>
+      <w:lvlJc w:val="left"/>
+      <w:pPr>
+        <w:ind w:left="1440" w:hanging="360"/>
+      </w:pPr>
+    </w:lvl>
+    <w:lvl w:ilvl="2" w:tplc="4009001B">
+      <w:start w:val="1"/>
+      <w:numFmt w:val="lowerRoman"/>
+      <w:lvlText w:val="%3."/>
+      <w:lvlJc w:val="right"/>
+      <w:pPr>
+        <w:ind w:left="2160" w:hanging="180"/>
+      </w:pPr>
+    </w:lvl>
+    <w:lvl w:ilvl="3" w:tplc="4009000F">
+      <w:start w:val="1"/>
+      <w:numFmt w:val="decimal"/>
+      <w:lvlText w:val="%4."/>
+      <w:lvlJc w:val="left"/>
+      <w:pPr>
+        <w:ind w:left="2880" w:hanging="360"/>
+      </w:pPr>
+    </w:lvl>
+    <w:lvl w:ilvl="4" w:tplc="40090019">
+      <w:start w:val="1"/>
+      <w:numFmt w:val="lowerLetter"/>
+      <w:lvlText w:val="%5."/>
+      <w:lvlJc w:val="left"/>
+      <w:pPr>
+        <w:ind w:left="3600" w:hanging="360"/>
+      </w:pPr>
+    </w:lvl>
+    <w:lvl w:ilvl="5" w:tplc="4009001B">
+      <w:start w:val="1"/>
+      <w:numFmt w:val="lowerRoman"/>
+      <w:lvlText w:val="%6."/>
+      <w:lvlJc w:val="right"/>
+      <w:pPr>
+        <w:ind w:left="4320" w:hanging="180"/>
+      </w:pPr>
+    </w:lvl>
+    <w:lvl w:ilvl="6" w:tplc="4009000F">
+      <w:start w:val="1"/>
+      <w:numFmt w:val="decimal"/>
+      <w:lvlText w:val="%7."/>
+      <w:lvlJc w:val="left"/>
+      <w:pPr>
+        <w:ind w:left="5040" w:hanging="360"/>
+      </w:pPr>
+    </w:lvl>
+    <w:lvl w:ilvl="7" w:tplc="40090019">
+      <w:start w:val="1"/>
+      <w:numFmt w:val="lowerLetter"/>
+      <w:lvlText w:val="%8."/>
+      <w:lvlJc w:val="left"/>
+      <w:pPr>
+        <w:ind w:left="5760" w:hanging="360"/>
+      </w:pPr>
+    </w:lvl>
+    <w:lvl w:ilvl="8" w:tplc="4009001B">
+      <w:start w:val="1"/>
+      <w:numFmt w:val="lowerRoman"/>
+      <w:lvlText w:val="%9."/>
+      <w:lvlJc w:val="right"/>
+      <w:pPr>
+        <w:ind w:left="6480" w:hanging="180"/>
+      </w:pPr>
+    </w:lvl>
+  </w:abstractNum>
+  <w:abstractNum w:abstractNumId="6">
     <w:nsid w:val="466B4299"/>
     <w:multiLevelType w:val="hybridMultilevel"/>
     <w:tmpl w:val="1FD23D4A"/>
@@ -6382,7 +6994,7 @@
       </w:pPr>
     </w:lvl>
   </w:abstractNum>
-  <w:abstractNum w:abstractNumId="6">
+  <w:abstractNum w:abstractNumId="7">
     <w:nsid w:val="49835F9F"/>
     <w:multiLevelType w:val="hybridMultilevel"/>
     <w:tmpl w:val="C9B8350E"/>
@@ -6471,7 +7083,7 @@
       </w:pPr>
     </w:lvl>
   </w:abstractNum>
-  <w:abstractNum w:abstractNumId="7">
+  <w:abstractNum w:abstractNumId="8">
     <w:nsid w:val="4A590F86"/>
     <w:multiLevelType w:val="hybridMultilevel"/>
     <w:tmpl w:val="099618B6"/>
@@ -6560,7 +7172,7 @@
       </w:pPr>
     </w:lvl>
   </w:abstractNum>
-  <w:abstractNum w:abstractNumId="8">
+  <w:abstractNum w:abstractNumId="9">
     <w:nsid w:val="4E5B4A02"/>
     <w:multiLevelType w:val="hybridMultilevel"/>
     <w:tmpl w:val="E8BC0844"/>
@@ -6646,7 +7258,7 @@
       </w:pPr>
     </w:lvl>
   </w:abstractNum>
-  <w:abstractNum w:abstractNumId="9">
+  <w:abstractNum w:abstractNumId="10">
     <w:nsid w:val="738A5881"/>
     <w:multiLevelType w:val="hybridMultilevel"/>
     <w:tmpl w:val="22764A26"/>
@@ -6735,7 +7347,7 @@
       </w:pPr>
     </w:lvl>
   </w:abstractNum>
-  <w:abstractNum w:abstractNumId="10">
+  <w:abstractNum w:abstractNumId="11">
     <w:nsid w:val="73D636EC"/>
     <w:multiLevelType w:val="hybridMultilevel"/>
     <w:tmpl w:val="00CAB3BC"/>
@@ -6828,28 +7440,28 @@
     <w:abstractNumId w:val="0"/>
   </w:num>
   <w:num w:numId="2">
-    <w:abstractNumId w:val="6"/>
+    <w:abstractNumId w:val="7"/>
   </w:num>
   <w:num w:numId="3">
-    <w:abstractNumId w:val="5"/>
+    <w:abstractNumId w:val="6"/>
   </w:num>
   <w:num w:numId="4">
     <w:abstractNumId w:val="3"/>
   </w:num>
   <w:num w:numId="5">
-    <w:abstractNumId w:val="10"/>
+    <w:abstractNumId w:val="11"/>
   </w:num>
   <w:num w:numId="6">
     <w:abstractNumId w:val="2"/>
   </w:num>
   <w:num w:numId="7">
-    <w:abstractNumId w:val="9"/>
+    <w:abstractNumId w:val="10"/>
   </w:num>
   <w:num w:numId="8">
     <w:abstractNumId w:val="4"/>
   </w:num>
   <w:num w:numId="9">
-    <w:abstractNumId w:val="7"/>
+    <w:abstractNumId w:val="8"/>
   </w:num>
   <w:num w:numId="10">
     <w:abstractNumId w:val="1"/>
@@ -6882,7 +7494,7 @@
     </w:lvlOverride>
   </w:num>
   <w:num w:numId="11">
-    <w:abstractNumId w:val="8"/>
+    <w:abstractNumId w:val="9"/>
     <w:lvlOverride w:ilvl="0">
       <w:startOverride w:val="1"/>
     </w:lvlOverride>
@@ -6912,10 +7524,40 @@
     </w:lvlOverride>
   </w:num>
   <w:num w:numId="12">
-    <w:abstractNumId w:val="8"/>
+    <w:abstractNumId w:val="9"/>
   </w:num>
   <w:num w:numId="13">
     <w:abstractNumId w:val="1"/>
+  </w:num>
+  <w:num w:numId="14">
+    <w:abstractNumId w:val="5"/>
+    <w:lvlOverride w:ilvl="0">
+      <w:startOverride w:val="1"/>
+    </w:lvlOverride>
+    <w:lvlOverride w:ilvl="1">
+      <w:startOverride w:val="1"/>
+    </w:lvlOverride>
+    <w:lvlOverride w:ilvl="2">
+      <w:startOverride w:val="1"/>
+    </w:lvlOverride>
+    <w:lvlOverride w:ilvl="3">
+      <w:startOverride w:val="1"/>
+    </w:lvlOverride>
+    <w:lvlOverride w:ilvl="4">
+      <w:startOverride w:val="1"/>
+    </w:lvlOverride>
+    <w:lvlOverride w:ilvl="5">
+      <w:startOverride w:val="1"/>
+    </w:lvlOverride>
+    <w:lvlOverride w:ilvl="6">
+      <w:startOverride w:val="1"/>
+    </w:lvlOverride>
+    <w:lvlOverride w:ilvl="7">
+      <w:startOverride w:val="1"/>
+    </w:lvlOverride>
+    <w:lvlOverride w:ilvl="8">
+      <w:startOverride w:val="1"/>
+    </w:lvlOverride>
   </w:num>
 </w:numbering>
 </file>

</xml_diff>

<commit_message>
Date: 20 Dec 2025
</commit_message>
<xml_diff>
--- a/Assignments.docx
+++ b/Assignments.docx
@@ -5827,6 +5827,89 @@
           <w:lang w:val="en-US"/>
         </w:rPr>
       </w:pPr>
+      <w:r>
+        <w:rPr>
+          <w:sz w:val="24"/>
+          <w:szCs w:val="24"/>
+          <w:lang w:val="en-US"/>
+        </w:rPr>
+        <w:t xml:space="preserve">Open </w:t>
+      </w:r>
+      <w:bookmarkStart w:id="0" w:name="_GoBack"/>
+      <w:r>
+        <w:fldChar w:fldCharType="begin"/>
+      </w:r>
+      <w:r>
+        <w:instrText xml:space="preserve"> HYPERLINK "https://www.irctc.co.in/nget/profile/user-registration" </w:instrText>
+      </w:r>
+      <w:r>
+        <w:fldChar w:fldCharType="separate"/>
+      </w:r>
+      <w:r>
+        <w:rPr>
+          <w:rStyle w:val="Hyperlink"/>
+          <w:sz w:val="24"/>
+          <w:szCs w:val="24"/>
+          <w:lang w:val="en-US"/>
+        </w:rPr>
+        <w:t>https://www.irctc.co.in/nget/profile/user-registration</w:t>
+      </w:r>
+      <w:r>
+        <w:rPr>
+          <w:rStyle w:val="Hyperlink"/>
+          <w:sz w:val="24"/>
+          <w:szCs w:val="24"/>
+          <w:lang w:val="en-US"/>
+        </w:rPr>
+        <w:fldChar w:fldCharType="end"/>
+      </w:r>
+      <w:bookmarkEnd w:id="0"/>
+    </w:p>
+    <w:p>
+      <w:pPr>
+        <w:pStyle w:val="ListParagraph"/>
+        <w:numPr>
+          <w:ilvl w:val="1"/>
+          <w:numId w:val="9"/>
+        </w:numPr>
+        <w:spacing w:line="256" w:lineRule="auto"/>
+        <w:rPr>
+          <w:sz w:val="24"/>
+          <w:szCs w:val="24"/>
+          <w:lang w:val="en-US"/>
+        </w:rPr>
+      </w:pPr>
+      <w:r>
+        <w:rPr>
+          <w:sz w:val="24"/>
+          <w:szCs w:val="24"/>
+          <w:lang w:val="en-US"/>
+        </w:rPr>
+        <w:t>Complete the registration process.</w:t>
+      </w:r>
+    </w:p>
+    <w:p>
+      <w:pPr>
+        <w:pStyle w:val="ListParagraph"/>
+        <w:numPr>
+          <w:ilvl w:val="1"/>
+          <w:numId w:val="9"/>
+        </w:numPr>
+        <w:spacing w:line="256" w:lineRule="auto"/>
+        <w:rPr>
+          <w:sz w:val="24"/>
+          <w:szCs w:val="24"/>
+          <w:lang w:val="en-US"/>
+        </w:rPr>
+      </w:pPr>
+      <w:r>
+        <w:rPr>
+          <w:sz w:val="24"/>
+          <w:szCs w:val="24"/>
+          <w:lang w:val="en-US"/>
+        </w:rPr>
+        <w:t>Display the messages after clicking on Submit button</w:t>
+      </w:r>
     </w:p>
     <w:p>
       <w:pPr>
@@ -6243,8 +6326,6 @@
         </w:rPr>
         <w:t>Print the title</w:t>
       </w:r>
-      <w:bookmarkStart w:id="0" w:name="_GoBack"/>
-      <w:bookmarkEnd w:id="0"/>
       <w:r>
         <w:rPr>
           <w:sz w:val="24"/>
@@ -6642,6 +6723,95 @@
     </w:lvl>
   </w:abstractNum>
   <w:abstractNum w:abstractNumId="3">
+    <w:nsid w:val="2149316A"/>
+    <w:multiLevelType w:val="hybridMultilevel"/>
+    <w:tmpl w:val="56649A08"/>
+    <w:lvl w:ilvl="0" w:tplc="4009000F">
+      <w:start w:val="1"/>
+      <w:numFmt w:val="decimal"/>
+      <w:lvlText w:val="%1."/>
+      <w:lvlJc w:val="left"/>
+      <w:pPr>
+        <w:ind w:left="720" w:hanging="360"/>
+      </w:pPr>
+      <w:rPr>
+        <w:rFonts w:hint="default"/>
+      </w:rPr>
+    </w:lvl>
+    <w:lvl w:ilvl="1" w:tplc="40090019">
+      <w:start w:val="1"/>
+      <w:numFmt w:val="lowerLetter"/>
+      <w:lvlText w:val="%2."/>
+      <w:lvlJc w:val="left"/>
+      <w:pPr>
+        <w:ind w:left="1440" w:hanging="360"/>
+      </w:pPr>
+    </w:lvl>
+    <w:lvl w:ilvl="2" w:tplc="4009001B" w:tentative="1">
+      <w:start w:val="1"/>
+      <w:numFmt w:val="lowerRoman"/>
+      <w:lvlText w:val="%3."/>
+      <w:lvlJc w:val="right"/>
+      <w:pPr>
+        <w:ind w:left="2160" w:hanging="180"/>
+      </w:pPr>
+    </w:lvl>
+    <w:lvl w:ilvl="3" w:tplc="4009000F" w:tentative="1">
+      <w:start w:val="1"/>
+      <w:numFmt w:val="decimal"/>
+      <w:lvlText w:val="%4."/>
+      <w:lvlJc w:val="left"/>
+      <w:pPr>
+        <w:ind w:left="2880" w:hanging="360"/>
+      </w:pPr>
+    </w:lvl>
+    <w:lvl w:ilvl="4" w:tplc="40090019" w:tentative="1">
+      <w:start w:val="1"/>
+      <w:numFmt w:val="lowerLetter"/>
+      <w:lvlText w:val="%5."/>
+      <w:lvlJc w:val="left"/>
+      <w:pPr>
+        <w:ind w:left="3600" w:hanging="360"/>
+      </w:pPr>
+    </w:lvl>
+    <w:lvl w:ilvl="5" w:tplc="4009001B" w:tentative="1">
+      <w:start w:val="1"/>
+      <w:numFmt w:val="lowerRoman"/>
+      <w:lvlText w:val="%6."/>
+      <w:lvlJc w:val="right"/>
+      <w:pPr>
+        <w:ind w:left="4320" w:hanging="180"/>
+      </w:pPr>
+    </w:lvl>
+    <w:lvl w:ilvl="6" w:tplc="4009000F" w:tentative="1">
+      <w:start w:val="1"/>
+      <w:numFmt w:val="decimal"/>
+      <w:lvlText w:val="%7."/>
+      <w:lvlJc w:val="left"/>
+      <w:pPr>
+        <w:ind w:left="5040" w:hanging="360"/>
+      </w:pPr>
+    </w:lvl>
+    <w:lvl w:ilvl="7" w:tplc="40090019" w:tentative="1">
+      <w:start w:val="1"/>
+      <w:numFmt w:val="lowerLetter"/>
+      <w:lvlText w:val="%8."/>
+      <w:lvlJc w:val="left"/>
+      <w:pPr>
+        <w:ind w:left="5760" w:hanging="360"/>
+      </w:pPr>
+    </w:lvl>
+    <w:lvl w:ilvl="8" w:tplc="4009001B" w:tentative="1">
+      <w:start w:val="1"/>
+      <w:numFmt w:val="lowerRoman"/>
+      <w:lvlText w:val="%9."/>
+      <w:lvlJc w:val="right"/>
+      <w:pPr>
+        <w:ind w:left="6480" w:hanging="180"/>
+      </w:pPr>
+    </w:lvl>
+  </w:abstractNum>
+  <w:abstractNum w:abstractNumId="4">
     <w:nsid w:val="394131C0"/>
     <w:multiLevelType w:val="hybridMultilevel"/>
     <w:tmpl w:val="46D85910"/>
@@ -6730,7 +6900,7 @@
       </w:pPr>
     </w:lvl>
   </w:abstractNum>
-  <w:abstractNum w:abstractNumId="4">
+  <w:abstractNum w:abstractNumId="5">
     <w:nsid w:val="411E5BCD"/>
     <w:multiLevelType w:val="hybridMultilevel"/>
     <w:tmpl w:val="C040EB9C"/>
@@ -6819,7 +6989,7 @@
       </w:pPr>
     </w:lvl>
   </w:abstractNum>
-  <w:abstractNum w:abstractNumId="5">
+  <w:abstractNum w:abstractNumId="6">
     <w:nsid w:val="465166F1"/>
     <w:multiLevelType w:val="hybridMultilevel"/>
     <w:tmpl w:val="B9547906"/>
@@ -6905,7 +7075,7 @@
       </w:pPr>
     </w:lvl>
   </w:abstractNum>
-  <w:abstractNum w:abstractNumId="6">
+  <w:abstractNum w:abstractNumId="7">
     <w:nsid w:val="466B4299"/>
     <w:multiLevelType w:val="hybridMultilevel"/>
     <w:tmpl w:val="1FD23D4A"/>
@@ -6994,7 +7164,7 @@
       </w:pPr>
     </w:lvl>
   </w:abstractNum>
-  <w:abstractNum w:abstractNumId="7">
+  <w:abstractNum w:abstractNumId="8">
     <w:nsid w:val="49835F9F"/>
     <w:multiLevelType w:val="hybridMultilevel"/>
     <w:tmpl w:val="C9B8350E"/>
@@ -7083,7 +7253,7 @@
       </w:pPr>
     </w:lvl>
   </w:abstractNum>
-  <w:abstractNum w:abstractNumId="8">
+  <w:abstractNum w:abstractNumId="9">
     <w:nsid w:val="4A590F86"/>
     <w:multiLevelType w:val="hybridMultilevel"/>
     <w:tmpl w:val="099618B6"/>
@@ -7172,7 +7342,7 @@
       </w:pPr>
     </w:lvl>
   </w:abstractNum>
-  <w:abstractNum w:abstractNumId="9">
+  <w:abstractNum w:abstractNumId="10">
     <w:nsid w:val="4E5B4A02"/>
     <w:multiLevelType w:val="hybridMultilevel"/>
     <w:tmpl w:val="E8BC0844"/>
@@ -7258,7 +7428,7 @@
       </w:pPr>
     </w:lvl>
   </w:abstractNum>
-  <w:abstractNum w:abstractNumId="10">
+  <w:abstractNum w:abstractNumId="11">
     <w:nsid w:val="738A5881"/>
     <w:multiLevelType w:val="hybridMultilevel"/>
     <w:tmpl w:val="22764A26"/>
@@ -7347,7 +7517,7 @@
       </w:pPr>
     </w:lvl>
   </w:abstractNum>
-  <w:abstractNum w:abstractNumId="11">
+  <w:abstractNum w:abstractNumId="12">
     <w:nsid w:val="73D636EC"/>
     <w:multiLevelType w:val="hybridMultilevel"/>
     <w:tmpl w:val="00CAB3BC"/>
@@ -7440,28 +7610,28 @@
     <w:abstractNumId w:val="0"/>
   </w:num>
   <w:num w:numId="2">
+    <w:abstractNumId w:val="8"/>
+  </w:num>
+  <w:num w:numId="3">
     <w:abstractNumId w:val="7"/>
   </w:num>
-  <w:num w:numId="3">
-    <w:abstractNumId w:val="6"/>
-  </w:num>
   <w:num w:numId="4">
-    <w:abstractNumId w:val="3"/>
+    <w:abstractNumId w:val="4"/>
   </w:num>
   <w:num w:numId="5">
-    <w:abstractNumId w:val="11"/>
+    <w:abstractNumId w:val="12"/>
   </w:num>
   <w:num w:numId="6">
     <w:abstractNumId w:val="2"/>
   </w:num>
   <w:num w:numId="7">
-    <w:abstractNumId w:val="10"/>
+    <w:abstractNumId w:val="11"/>
   </w:num>
   <w:num w:numId="8">
-    <w:abstractNumId w:val="4"/>
+    <w:abstractNumId w:val="5"/>
   </w:num>
   <w:num w:numId="9">
-    <w:abstractNumId w:val="8"/>
+    <w:abstractNumId w:val="9"/>
   </w:num>
   <w:num w:numId="10">
     <w:abstractNumId w:val="1"/>
@@ -7494,7 +7664,7 @@
     </w:lvlOverride>
   </w:num>
   <w:num w:numId="11">
-    <w:abstractNumId w:val="9"/>
+    <w:abstractNumId w:val="10"/>
     <w:lvlOverride w:ilvl="0">
       <w:startOverride w:val="1"/>
     </w:lvlOverride>
@@ -7524,13 +7694,13 @@
     </w:lvlOverride>
   </w:num>
   <w:num w:numId="12">
-    <w:abstractNumId w:val="9"/>
+    <w:abstractNumId w:val="10"/>
   </w:num>
   <w:num w:numId="13">
     <w:abstractNumId w:val="1"/>
   </w:num>
   <w:num w:numId="14">
-    <w:abstractNumId w:val="5"/>
+    <w:abstractNumId w:val="6"/>
     <w:lvlOverride w:ilvl="0">
       <w:startOverride w:val="1"/>
     </w:lvlOverride>
@@ -7558,6 +7728,9 @@
     <w:lvlOverride w:ilvl="8">
       <w:startOverride w:val="1"/>
     </w:lvlOverride>
+  </w:num>
+  <w:num w:numId="15">
+    <w:abstractNumId w:val="3"/>
   </w:num>
 </w:numbering>
 </file>

</xml_diff>

<commit_message>
Date: 22 Dec 2025
</commit_message>
<xml_diff>
--- a/Assignments.docx
+++ b/Assignments.docx
@@ -4249,6 +4249,23 @@
     </w:p>
     <w:p>
       <w:pPr>
+        <w:rPr>
+          <w:sz w:val="24"/>
+          <w:szCs w:val="24"/>
+          <w:lang w:val="en-US"/>
+        </w:rPr>
+      </w:pPr>
+      <w:r>
+        <w:rPr>
+          <w:sz w:val="24"/>
+          <w:szCs w:val="24"/>
+          <w:lang w:val="en-US"/>
+        </w:rPr>
+        <w:br w:type="page"/>
+      </w:r>
+    </w:p>
+    <w:p>
+      <w:pPr>
         <w:pStyle w:val="ListParagraph"/>
         <w:numPr>
           <w:ilvl w:val="0"/>
@@ -4267,6 +4284,7 @@
           <w:szCs w:val="24"/>
           <w:lang w:val="en-US"/>
         </w:rPr>
+        <w:lastRenderedPageBreak/>
         <w:t xml:space="preserve">Open </w:t>
       </w:r>
       <w:hyperlink r:id="rId25" w:history="1">
@@ -4418,6 +4436,8 @@
         </w:rPr>
         <w:t>Enter Last Name</w:t>
       </w:r>
+      <w:bookmarkStart w:id="0" w:name="_GoBack"/>
+      <w:bookmarkEnd w:id="0"/>
     </w:p>
     <w:p>
       <w:pPr>
@@ -4531,7 +4551,6 @@
           <w:szCs w:val="24"/>
           <w:lang w:val="en-US"/>
         </w:rPr>
-        <w:lastRenderedPageBreak/>
         <w:t>Click on Save Button</w:t>
       </w:r>
     </w:p>
@@ -5292,6 +5311,7 @@
           <w:szCs w:val="24"/>
           <w:lang w:val="en-US"/>
         </w:rPr>
+        <w:lastRenderedPageBreak/>
         <w:t>Display count of N, W &amp; L</w:t>
       </w:r>
       <w:r>
@@ -5599,7 +5619,6 @@
           <w:szCs w:val="24"/>
           <w:lang w:val="en-US"/>
         </w:rPr>
-        <w:lastRenderedPageBreak/>
         <w:t>Click on Cancel button</w:t>
       </w:r>
     </w:p>
@@ -5835,172 +5854,6 @@
         </w:rPr>
         <w:t xml:space="preserve">Open </w:t>
       </w:r>
-      <w:bookmarkStart w:id="0" w:name="_GoBack"/>
-      <w:r>
-        <w:fldChar w:fldCharType="begin"/>
-      </w:r>
-      <w:r>
-        <w:instrText xml:space="preserve"> HYPERLINK "https://www.irctc.co.in/nget/profile/user-registration" </w:instrText>
-      </w:r>
-      <w:r>
-        <w:fldChar w:fldCharType="separate"/>
-      </w:r>
-      <w:r>
-        <w:rPr>
-          <w:rStyle w:val="Hyperlink"/>
-          <w:sz w:val="24"/>
-          <w:szCs w:val="24"/>
-          <w:lang w:val="en-US"/>
-        </w:rPr>
-        <w:t>https://www.irctc.co.in/nget/profile/user-registration</w:t>
-      </w:r>
-      <w:r>
-        <w:rPr>
-          <w:rStyle w:val="Hyperlink"/>
-          <w:sz w:val="24"/>
-          <w:szCs w:val="24"/>
-          <w:lang w:val="en-US"/>
-        </w:rPr>
-        <w:fldChar w:fldCharType="end"/>
-      </w:r>
-      <w:bookmarkEnd w:id="0"/>
-    </w:p>
-    <w:p>
-      <w:pPr>
-        <w:pStyle w:val="ListParagraph"/>
-        <w:numPr>
-          <w:ilvl w:val="1"/>
-          <w:numId w:val="9"/>
-        </w:numPr>
-        <w:spacing w:line="256" w:lineRule="auto"/>
-        <w:rPr>
-          <w:sz w:val="24"/>
-          <w:szCs w:val="24"/>
-          <w:lang w:val="en-US"/>
-        </w:rPr>
-      </w:pPr>
-      <w:r>
-        <w:rPr>
-          <w:sz w:val="24"/>
-          <w:szCs w:val="24"/>
-          <w:lang w:val="en-US"/>
-        </w:rPr>
-        <w:t>Complete the registration process.</w:t>
-      </w:r>
-    </w:p>
-    <w:p>
-      <w:pPr>
-        <w:pStyle w:val="ListParagraph"/>
-        <w:numPr>
-          <w:ilvl w:val="1"/>
-          <w:numId w:val="9"/>
-        </w:numPr>
-        <w:spacing w:line="256" w:lineRule="auto"/>
-        <w:rPr>
-          <w:sz w:val="24"/>
-          <w:szCs w:val="24"/>
-          <w:lang w:val="en-US"/>
-        </w:rPr>
-      </w:pPr>
-      <w:r>
-        <w:rPr>
-          <w:sz w:val="24"/>
-          <w:szCs w:val="24"/>
-          <w:lang w:val="en-US"/>
-        </w:rPr>
-        <w:t>Display the messages after clicking on Submit button</w:t>
-      </w:r>
-    </w:p>
-    <w:p>
-      <w:pPr>
-        <w:rPr>
-          <w:sz w:val="24"/>
-          <w:szCs w:val="24"/>
-          <w:lang w:val="en-US"/>
-        </w:rPr>
-      </w:pPr>
-      <w:r>
-        <w:rPr>
-          <w:sz w:val="24"/>
-          <w:szCs w:val="24"/>
-          <w:lang w:val="en-US"/>
-        </w:rPr>
-        <w:br w:type="page"/>
-      </w:r>
-    </w:p>
-    <w:p>
-      <w:pPr>
-        <w:rPr>
-          <w:b/>
-          <w:bCs/>
-          <w:sz w:val="26"/>
-          <w:szCs w:val="22"/>
-          <w:lang w:val="en-US"/>
-        </w:rPr>
-      </w:pPr>
-      <w:r>
-        <w:rPr>
-          <w:b/>
-          <w:bCs/>
-          <w:sz w:val="26"/>
-          <w:szCs w:val="22"/>
-          <w:lang w:val="en-US"/>
-        </w:rPr>
-        <w:lastRenderedPageBreak/>
-        <w:t>TestNG Assignments</w:t>
-      </w:r>
-    </w:p>
-    <w:p>
-      <w:pPr>
-        <w:pStyle w:val="ListParagraph"/>
-        <w:numPr>
-          <w:ilvl w:val="3"/>
-          <w:numId w:val="14"/>
-        </w:numPr>
-        <w:spacing w:line="254" w:lineRule="auto"/>
-        <w:ind w:left="1276" w:hanging="709"/>
-        <w:rPr>
-          <w:b/>
-          <w:bCs/>
-          <w:sz w:val="24"/>
-          <w:szCs w:val="24"/>
-          <w:lang w:val="en-US"/>
-        </w:rPr>
-      </w:pPr>
-      <w:r>
-        <w:rPr>
-          <w:b/>
-          <w:bCs/>
-          <w:sz w:val="24"/>
-          <w:szCs w:val="24"/>
-          <w:lang w:val="en-US"/>
-        </w:rPr>
-        <w:t>Flipkart Assignment</w:t>
-      </w:r>
-    </w:p>
-    <w:p>
-      <w:pPr>
-        <w:pStyle w:val="ListParagraph"/>
-        <w:numPr>
-          <w:ilvl w:val="4"/>
-          <w:numId w:val="14"/>
-        </w:numPr>
-        <w:spacing w:line="254" w:lineRule="auto"/>
-        <w:ind w:left="1276"/>
-        <w:rPr>
-          <w:sz w:val="24"/>
-          <w:szCs w:val="24"/>
-          <w:lang w:val="en-US"/>
-        </w:rPr>
-      </w:pPr>
-      <w:r>
-        <w:rPr>
-          <w:sz w:val="24"/>
-          <w:szCs w:val="24"/>
-          <w:lang w:val="en-US"/>
-        </w:rPr>
-        <w:t xml:space="preserve">Launch </w:t>
-      </w:r>
       <w:hyperlink r:id="rId33" w:history="1">
         <w:r>
           <w:rPr>
@@ -6009,7 +5862,7 @@
             <w:szCs w:val="24"/>
             <w:lang w:val="en-US"/>
           </w:rPr>
-          <w:t>https://www.flipkart.com/</w:t>
+          <w:t>https://www.irctc.co.in/nget/profile/user-registration</w:t>
         </w:r>
       </w:hyperlink>
     </w:p>
@@ -6017,40 +5870,72 @@
       <w:pPr>
         <w:pStyle w:val="ListParagraph"/>
         <w:numPr>
-          <w:ilvl w:val="4"/>
-          <w:numId w:val="14"/>
-        </w:numPr>
-        <w:spacing w:line="254" w:lineRule="auto"/>
-        <w:ind w:left="1276"/>
-        <w:rPr>
-          <w:sz w:val="24"/>
-          <w:szCs w:val="24"/>
-          <w:lang w:val="en-US"/>
-        </w:rPr>
-      </w:pPr>
-      <w:r>
-        <w:rPr>
-          <w:sz w:val="24"/>
-          <w:szCs w:val="24"/>
-          <w:lang w:val="en-US"/>
-        </w:rPr>
-        <w:t>Print the title</w:t>
-      </w:r>
-    </w:p>
-    <w:p>
-      <w:pPr>
-        <w:pStyle w:val="ListParagraph"/>
-        <w:numPr>
-          <w:ilvl w:val="4"/>
-          <w:numId w:val="14"/>
-        </w:numPr>
-        <w:spacing w:line="254" w:lineRule="auto"/>
-        <w:ind w:left="1276"/>
+          <w:ilvl w:val="1"/>
+          <w:numId w:val="9"/>
+        </w:numPr>
+        <w:spacing w:line="256" w:lineRule="auto"/>
+        <w:rPr>
+          <w:sz w:val="24"/>
+          <w:szCs w:val="24"/>
+          <w:lang w:val="en-US"/>
+        </w:rPr>
+      </w:pPr>
+      <w:r>
+        <w:rPr>
+          <w:sz w:val="24"/>
+          <w:szCs w:val="24"/>
+          <w:lang w:val="en-US"/>
+        </w:rPr>
+        <w:t>Complete the registration process.</w:t>
+      </w:r>
+    </w:p>
+    <w:p>
+      <w:pPr>
+        <w:pStyle w:val="ListParagraph"/>
+        <w:numPr>
+          <w:ilvl w:val="1"/>
+          <w:numId w:val="9"/>
+        </w:numPr>
+        <w:spacing w:line="256" w:lineRule="auto"/>
+        <w:rPr>
+          <w:sz w:val="24"/>
+          <w:szCs w:val="24"/>
+          <w:lang w:val="en-US"/>
+        </w:rPr>
+      </w:pPr>
+      <w:r>
+        <w:rPr>
+          <w:sz w:val="24"/>
+          <w:szCs w:val="24"/>
+          <w:lang w:val="en-US"/>
+        </w:rPr>
+        <w:t>Display the messages after clicking on Submit button</w:t>
+      </w:r>
+    </w:p>
+    <w:p>
+      <w:pPr>
+        <w:rPr>
+          <w:sz w:val="24"/>
+          <w:szCs w:val="24"/>
+          <w:lang w:val="en-US"/>
+        </w:rPr>
+      </w:pPr>
+      <w:r>
+        <w:rPr>
+          <w:sz w:val="24"/>
+          <w:szCs w:val="24"/>
+          <w:lang w:val="en-US"/>
+        </w:rPr>
+        <w:br w:type="page"/>
+      </w:r>
+    </w:p>
+    <w:p>
+      <w:pPr>
         <w:rPr>
           <w:b/>
           <w:bCs/>
-          <w:sz w:val="24"/>
-          <w:szCs w:val="24"/>
+          <w:sz w:val="26"/>
+          <w:szCs w:val="22"/>
           <w:lang w:val="en-US"/>
         </w:rPr>
       </w:pPr>
@@ -6058,43 +5943,40 @@
         <w:rPr>
           <w:b/>
           <w:bCs/>
-          <w:sz w:val="24"/>
-          <w:szCs w:val="24"/>
-          <w:lang w:val="en-US"/>
-        </w:rPr>
-        <w:t>Click on Mobiles &amp; Tablet</w:t>
-      </w:r>
-    </w:p>
-    <w:p>
-      <w:pPr>
-        <w:pStyle w:val="ListParagraph"/>
-        <w:numPr>
-          <w:ilvl w:val="4"/>
+          <w:sz w:val="26"/>
+          <w:szCs w:val="22"/>
+          <w:lang w:val="en-US"/>
+        </w:rPr>
+        <w:lastRenderedPageBreak/>
+        <w:t>TestNG Assignments</w:t>
+      </w:r>
+    </w:p>
+    <w:p>
+      <w:pPr>
+        <w:pStyle w:val="ListParagraph"/>
+        <w:numPr>
+          <w:ilvl w:val="3"/>
           <w:numId w:val="14"/>
         </w:numPr>
         <w:spacing w:line="254" w:lineRule="auto"/>
-        <w:ind w:left="1276"/>
-        <w:rPr>
-          <w:sz w:val="24"/>
-          <w:szCs w:val="24"/>
-          <w:lang w:val="en-US"/>
-        </w:rPr>
-      </w:pPr>
-      <w:r>
-        <w:rPr>
-          <w:sz w:val="24"/>
-          <w:szCs w:val="24"/>
-          <w:lang w:val="en-US"/>
-        </w:rPr>
-        <w:t>Print the title</w:t>
-      </w:r>
-      <w:r>
-        <w:rPr>
-          <w:sz w:val="24"/>
-          <w:szCs w:val="24"/>
-          <w:lang w:val="en-US"/>
-        </w:rPr>
-        <w:br/>
+        <w:ind w:left="1276" w:hanging="709"/>
+        <w:rPr>
+          <w:b/>
+          <w:bCs/>
+          <w:sz w:val="24"/>
+          <w:szCs w:val="24"/>
+          <w:lang w:val="en-US"/>
+        </w:rPr>
+      </w:pPr>
+      <w:r>
+        <w:rPr>
+          <w:b/>
+          <w:bCs/>
+          <w:sz w:val="24"/>
+          <w:szCs w:val="24"/>
+          <w:lang w:val="en-US"/>
+        </w:rPr>
+        <w:t>Flipkart Assignment</w:t>
       </w:r>
     </w:p>
     <w:p>
@@ -6181,7 +6063,7 @@
           <w:szCs w:val="24"/>
           <w:lang w:val="en-US"/>
         </w:rPr>
-        <w:t>Click on TV &amp; Appliances</w:t>
+        <w:t>Click on Mobiles &amp; Tablet</w:t>
       </w:r>
     </w:p>
     <w:p>
@@ -6300,7 +6182,7 @@
           <w:szCs w:val="24"/>
           <w:lang w:val="en-US"/>
         </w:rPr>
-        <w:t>Click on Flight Booking</w:t>
+        <w:t>Click on TV &amp; Appliances</w:t>
       </w:r>
     </w:p>
     <w:p>
@@ -6359,6 +6241,125 @@
         <w:t xml:space="preserve">Launch </w:t>
       </w:r>
       <w:hyperlink r:id="rId36" w:history="1">
+        <w:r>
+          <w:rPr>
+            <w:rStyle w:val="Hyperlink"/>
+            <w:sz w:val="24"/>
+            <w:szCs w:val="24"/>
+            <w:lang w:val="en-US"/>
+          </w:rPr>
+          <w:t>https://www.flipkart.com/</w:t>
+        </w:r>
+      </w:hyperlink>
+    </w:p>
+    <w:p>
+      <w:pPr>
+        <w:pStyle w:val="ListParagraph"/>
+        <w:numPr>
+          <w:ilvl w:val="4"/>
+          <w:numId w:val="14"/>
+        </w:numPr>
+        <w:spacing w:line="254" w:lineRule="auto"/>
+        <w:ind w:left="1276"/>
+        <w:rPr>
+          <w:sz w:val="24"/>
+          <w:szCs w:val="24"/>
+          <w:lang w:val="en-US"/>
+        </w:rPr>
+      </w:pPr>
+      <w:r>
+        <w:rPr>
+          <w:sz w:val="24"/>
+          <w:szCs w:val="24"/>
+          <w:lang w:val="en-US"/>
+        </w:rPr>
+        <w:t>Print the title</w:t>
+      </w:r>
+    </w:p>
+    <w:p>
+      <w:pPr>
+        <w:pStyle w:val="ListParagraph"/>
+        <w:numPr>
+          <w:ilvl w:val="4"/>
+          <w:numId w:val="14"/>
+        </w:numPr>
+        <w:spacing w:line="254" w:lineRule="auto"/>
+        <w:ind w:left="1276"/>
+        <w:rPr>
+          <w:b/>
+          <w:bCs/>
+          <w:sz w:val="24"/>
+          <w:szCs w:val="24"/>
+          <w:lang w:val="en-US"/>
+        </w:rPr>
+      </w:pPr>
+      <w:r>
+        <w:rPr>
+          <w:b/>
+          <w:bCs/>
+          <w:sz w:val="24"/>
+          <w:szCs w:val="24"/>
+          <w:lang w:val="en-US"/>
+        </w:rPr>
+        <w:t>Click on Flight Booking</w:t>
+      </w:r>
+    </w:p>
+    <w:p>
+      <w:pPr>
+        <w:pStyle w:val="ListParagraph"/>
+        <w:numPr>
+          <w:ilvl w:val="4"/>
+          <w:numId w:val="14"/>
+        </w:numPr>
+        <w:spacing w:line="254" w:lineRule="auto"/>
+        <w:ind w:left="1276"/>
+        <w:rPr>
+          <w:sz w:val="24"/>
+          <w:szCs w:val="24"/>
+          <w:lang w:val="en-US"/>
+        </w:rPr>
+      </w:pPr>
+      <w:r>
+        <w:rPr>
+          <w:sz w:val="24"/>
+          <w:szCs w:val="24"/>
+          <w:lang w:val="en-US"/>
+        </w:rPr>
+        <w:t>Print the title</w:t>
+      </w:r>
+      <w:r>
+        <w:rPr>
+          <w:sz w:val="24"/>
+          <w:szCs w:val="24"/>
+          <w:lang w:val="en-US"/>
+        </w:rPr>
+        <w:br/>
+      </w:r>
+    </w:p>
+    <w:p>
+      <w:pPr>
+        <w:pStyle w:val="ListParagraph"/>
+        <w:numPr>
+          <w:ilvl w:val="4"/>
+          <w:numId w:val="14"/>
+        </w:numPr>
+        <w:spacing w:line="254" w:lineRule="auto"/>
+        <w:ind w:left="1276"/>
+        <w:rPr>
+          <w:sz w:val="24"/>
+          <w:szCs w:val="24"/>
+          <w:lang w:val="en-US"/>
+        </w:rPr>
+      </w:pPr>
+      <w:r>
+        <w:rPr>
+          <w:sz w:val="24"/>
+          <w:szCs w:val="24"/>
+          <w:lang w:val="en-US"/>
+        </w:rPr>
+        <w:t xml:space="preserve">Launch </w:t>
+      </w:r>
+      <w:hyperlink r:id="rId37" w:history="1">
         <w:r>
           <w:rPr>
             <w:rStyle w:val="Hyperlink"/>

</xml_diff>